<commit_message>
fix: backend deploy checklist custom e merge risposte per export
Made-with: Cursor
</commit_message>
<xml_diff>
--- a/app/public/templates/Verbale_di_riunione_QTAFI_VIS001.docx
+++ b/app/public/templates/Verbale_di_riunione_QTAFI_VIS001.docx
@@ -862,6 +862,92 @@
         </w:rPr>
       </w:pPr>
     </w:p>
+    <w:p>
+      <w:pPr>
+        <w:tabs>
+          <w:tab w:val="left" w:pos="428"/>
+        </w:tabs>
+        <w:jc w:val="both"/>
+        <w:rPr>
+          <w:rFonts w:asciiTheme="minorHAnsi" w:hAnsiTheme="minorHAnsi" w:cstheme="minorHAnsi"/>
+          <w:bCs/>
+          <w:sz w:val="20"/>
+          <w:szCs w:val="20"/>
+        </w:rPr>
+      </w:pPr>
+      <w:r>
+        <w:rPr>
+          <w:rFonts w:asciiTheme="minorHAnsi" w:hAnsiTheme="minorHAnsi" w:cstheme="minorHAnsi"/>
+          <w:bCs/>
+          <w:sz w:val="20"/>
+          <w:szCs w:val="20"/>
+        </w:rPr>
+        <w:t>CHECKLIST_MARKER</w:t>
+      </w:r>
+    </w:p>
+    <w:p>
+      <w:pPr>
+        <w:rPr>
+          <w:rFonts w:asciiTheme="minorHAnsi" w:hAnsiTheme="minorHAnsi" w:cstheme="minorHAnsi"/>
+          <w:sz w:val="20"/>
+          <w:szCs w:val="20"/>
+        </w:rPr>
+      </w:pPr>
+    </w:p>
+    <w:p>
+      <w:pPr>
+        <w:rPr>
+          <w:rFonts w:asciiTheme="minorHAnsi" w:hAnsiTheme="minorHAnsi" w:cstheme="minorHAnsi"/>
+          <w:sz w:val="20"/>
+          <w:szCs w:val="20"/>
+        </w:rPr>
+      </w:pPr>
+    </w:p>
+    <w:p>
+      <w:pPr>
+        <w:rPr>
+          <w:rFonts w:asciiTheme="minorHAnsi" w:hAnsiTheme="minorHAnsi" w:cstheme="minorHAnsi"/>
+          <w:sz w:val="20"/>
+          <w:szCs w:val="20"/>
+        </w:rPr>
+      </w:pPr>
+    </w:p>
+    <w:p>
+      <w:pPr>
+        <w:rPr>
+          <w:rFonts w:asciiTheme="minorHAnsi" w:hAnsiTheme="minorHAnsi" w:cstheme="minorHAnsi"/>
+          <w:sz w:val="20"/>
+          <w:szCs w:val="20"/>
+        </w:rPr>
+      </w:pPr>
+    </w:p>
+    <w:p>
+      <w:pPr>
+        <w:rPr>
+          <w:rFonts w:asciiTheme="minorHAnsi" w:hAnsiTheme="minorHAnsi" w:cstheme="minorHAnsi"/>
+          <w:sz w:val="20"/>
+          <w:szCs w:val="20"/>
+        </w:rPr>
+      </w:pPr>
+      <w:r>
+        <w:rPr>
+          <w:rFonts w:asciiTheme="minorHAnsi" w:hAnsiTheme="minorHAnsi" w:cstheme="minorHAnsi"/>
+          <w:bCs/>
+          <w:sz w:val="20"/>
+          <w:szCs w:val="20"/>
+        </w:rPr>
+        <w:t>RILIEVI_MARKER</w:t>
+      </w:r>
+    </w:p>
+    <w:p>
+      <w:pPr>
+        <w:rPr>
+          <w:rFonts w:asciiTheme="minorHAnsi" w:hAnsiTheme="minorHAnsi" w:cstheme="minorHAnsi"/>
+          <w:sz w:val="20"/>
+          <w:szCs w:val="20"/>
+        </w:rPr>
+      </w:pPr>
+    </w:p>
     <w:tbl>
       <w:tblPr>
         <w:tblpPr w:leftFromText="141" w:rightFromText="141" w:vertAnchor="text" w:tblpX="-714" w:tblpY="1"/>
@@ -1179,11 +1265,57 @@
             <w:r>
               <w:rPr>
                 <w:rFonts w:asciiTheme="minorHAnsi" w:hAnsiTheme="minorHAnsi" w:cstheme="minorHAnsi"/>
-                <w:b/>
+                <w:bCs/>
                 <w:sz w:val="20"/>
                 <w:szCs w:val="20"/>
               </w:rPr>
               <w:t>Situazione</w:t>
+            </w:r>
+          </w:p>
+          <w:p>
+            <w:pPr>
+              <w:tabs>
+                <w:tab w:val="left" w:pos="428"/>
+              </w:tabs>
+              <w:jc w:val="both"/>
+              <w:rPr>
+                <w:rFonts w:asciiTheme="minorHAnsi" w:hAnsiTheme="minorHAnsi" w:cstheme="minorHAnsi"/>
+                <w:bCs/>
+                <w:sz w:val="20"/>
+                <w:szCs w:val="20"/>
+              </w:rPr>
+            </w:pPr>
+            <w:r>
+              <w:rPr>
+                <w:rFonts w:asciiTheme="minorHAnsi" w:hAnsiTheme="minorHAnsi" w:cstheme="minorHAnsi"/>
+                <w:bCs/>
+                <w:sz w:val="20"/>
+                <w:szCs w:val="20"/>
+              </w:rPr>
+              <w:t>CHECKLIST_MARKER</w:t>
+            </w:r>
+          </w:p>
+          <w:p>
+            <w:pPr>
+              <w:tabs>
+                <w:tab w:val="left" w:pos="428"/>
+              </w:tabs>
+              <w:jc w:val="both"/>
+              <w:rPr>
+                <w:rFonts w:asciiTheme="minorHAnsi" w:hAnsiTheme="minorHAnsi" w:cstheme="minorHAnsi"/>
+                <w:bCs/>
+                <w:sz w:val="20"/>
+                <w:szCs w:val="20"/>
+              </w:rPr>
+            </w:pPr>
+            <w:r>
+              <w:rPr>
+                <w:rFonts w:asciiTheme="minorHAnsi" w:hAnsiTheme="minorHAnsi" w:cstheme="minorHAnsi"/>
+                <w:bCs/>
+                <w:sz w:val="20"/>
+                <w:szCs w:val="20"/>
+              </w:rPr>
+              <w:t>RILIEVI_MARKER</w:t>
             </w:r>
           </w:p>
         </w:tc>
@@ -3106,6 +3238,155 @@
 <file path=word/numbering.xml><?xml version="1.0" encoding="utf-8"?>
 <w:numbering xmlns:wpc="http://schemas.microsoft.com/office/word/2010/wordprocessingCanvas" xmlns:cx="http://schemas.microsoft.com/office/drawing/2014/chartex" xmlns:cx1="http://schemas.microsoft.com/office/drawing/2015/9/8/chartex" xmlns:cx2="http://schemas.microsoft.com/office/drawing/2015/10/21/chartex" xmlns:cx3="http://schemas.microsoft.com/office/drawing/2016/5/9/chartex" xmlns:cx4="http://schemas.microsoft.com/office/drawing/2016/5/10/chartex" xmlns:cx5="http://schemas.microsoft.com/office/drawing/2016/5/11/chartex" xmlns:cx6="http://schemas.microsoft.com/office/drawing/2016/5/12/chartex" xmlns:cx7="http://schemas.microsoft.com/office/drawing/2016/5/13/chartex" xmlns:cx8="http://schemas.microsoft.com/office/drawing/2016/5/14/chartex" xmlns:mc="http://schemas.openxmlformats.org/markup-compatibility/2006" xmlns:aink="http://schemas.microsoft.com/office/drawing/2016/ink" xmlns:am3d="http://schemas.microsoft.com/office/drawing/2017/model3d" xmlns:o="urn:schemas-microsoft-com:office:office" xmlns:oel="http://schemas.microsoft.com/office/2019/extlst" xmlns:r="http://schemas.openxmlformats.org/officeDocument/2006/relationships" xmlns:m="http://schemas.openxmlformats.org/officeDocument/2006/math" xmlns:v="urn:schemas-microsoft-com:vml" xmlns:wp14="http://schemas.microsoft.com/office/word/2010/wordprocessingDrawing" xmlns:wp="http://schemas.openxmlformats.org/drawingml/2006/wordprocessingDrawing" xmlns:w10="urn:schemas-microsoft-com:office:word" xmlns:w="http://schemas.openxmlformats.org/wordprocessingml/2006/main" xmlns:w14="http://schemas.microsoft.com/office/word/2010/wordml" xmlns:w15="http://schemas.microsoft.com/office/word/2012/wordml" xmlns:w16cex="http://schemas.microsoft.com/office/word/2018/wordml/cex" xmlns:w16cid="http://schemas.microsoft.com/office/word/2016/wordml/cid" xmlns:w16="http://schemas.microsoft.com/office/word/2018/wordml" xmlns:w16du="http://schemas.microsoft.com/office/word/2023/wordml/word16du" xmlns:w16sdtdh="http://schemas.microsoft.com/office/word/2020/wordml/sdtdatahash" xmlns:w16sdtfl="http://schemas.microsoft.com/office/word/2024/wordml/sdtformatlock" xmlns:w16se="http://schemas.microsoft.com/office/word/2015/wordml/symex" xmlns:wpg="http://schemas.microsoft.com/office/word/2010/wordprocessingGroup" xmlns:wpi="http://schemas.microsoft.com/office/word/2010/wordprocessingInk" xmlns:wne="http://schemas.microsoft.com/office/word/2006/wordml" xmlns:wps="http://schemas.microsoft.com/office/word/2010/wordprocessingShape" mc:Ignorable="w14 w15 w16se w16cid w16 w16cex w16sdtdh w16sdtfl w16du wp14">
   <w:abstractNum w:abstractNumId="0" w15:restartNumberingAfterBreak="0">
+    <w:nsid w:val="0C4562B8"/>
+    <w:multiLevelType w:val="multilevel"/>
+    <w:tmpl w:val="FCC0E8B0"/>
+    <w:lvl w:ilvl="0">
+      <w:start w:val="1"/>
+      <w:numFmt w:val="bullet"/>
+      <w:lvlText w:val=""/>
+      <w:lvlJc w:val="left"/>
+      <w:pPr>
+        <w:tabs>
+          <w:tab w:val="num" w:pos="720"/>
+        </w:tabs>
+        <w:ind w:left="720" w:hanging="360"/>
+      </w:pPr>
+      <w:rPr>
+        <w:rFonts w:ascii="Symbol" w:hAnsi="Symbol" w:hint="default"/>
+        <w:sz w:val="20"/>
+      </w:rPr>
+    </w:lvl>
+    <w:lvl w:ilvl="1" w:tentative="1">
+      <w:start w:val="1"/>
+      <w:numFmt w:val="bullet"/>
+      <w:lvlText w:val=""/>
+      <w:lvlJc w:val="left"/>
+      <w:pPr>
+        <w:tabs>
+          <w:tab w:val="num" w:pos="1440"/>
+        </w:tabs>
+        <w:ind w:left="1440" w:hanging="360"/>
+      </w:pPr>
+      <w:rPr>
+        <w:rFonts w:ascii="Symbol" w:hAnsi="Symbol" w:hint="default"/>
+        <w:sz w:val="20"/>
+      </w:rPr>
+    </w:lvl>
+    <w:lvl w:ilvl="2" w:tentative="1">
+      <w:start w:val="1"/>
+      <w:numFmt w:val="bullet"/>
+      <w:lvlText w:val=""/>
+      <w:lvlJc w:val="left"/>
+      <w:pPr>
+        <w:tabs>
+          <w:tab w:val="num" w:pos="2160"/>
+        </w:tabs>
+        <w:ind w:left="2160" w:hanging="360"/>
+      </w:pPr>
+      <w:rPr>
+        <w:rFonts w:ascii="Symbol" w:hAnsi="Symbol" w:hint="default"/>
+        <w:sz w:val="20"/>
+      </w:rPr>
+    </w:lvl>
+    <w:lvl w:ilvl="3" w:tentative="1">
+      <w:start w:val="1"/>
+      <w:numFmt w:val="bullet"/>
+      <w:lvlText w:val=""/>
+      <w:lvlJc w:val="left"/>
+      <w:pPr>
+        <w:tabs>
+          <w:tab w:val="num" w:pos="2880"/>
+        </w:tabs>
+        <w:ind w:left="2880" w:hanging="360"/>
+      </w:pPr>
+      <w:rPr>
+        <w:rFonts w:ascii="Symbol" w:hAnsi="Symbol" w:hint="default"/>
+        <w:sz w:val="20"/>
+      </w:rPr>
+    </w:lvl>
+    <w:lvl w:ilvl="4" w:tentative="1">
+      <w:start w:val="1"/>
+      <w:numFmt w:val="bullet"/>
+      <w:lvlText w:val=""/>
+      <w:lvlJc w:val="left"/>
+      <w:pPr>
+        <w:tabs>
+          <w:tab w:val="num" w:pos="3600"/>
+        </w:tabs>
+        <w:ind w:left="3600" w:hanging="360"/>
+      </w:pPr>
+      <w:rPr>
+        <w:rFonts w:ascii="Symbol" w:hAnsi="Symbol" w:hint="default"/>
+        <w:sz w:val="20"/>
+      </w:rPr>
+    </w:lvl>
+    <w:lvl w:ilvl="5" w:tentative="1">
+      <w:start w:val="1"/>
+      <w:numFmt w:val="bullet"/>
+      <w:lvlText w:val=""/>
+      <w:lvlJc w:val="left"/>
+      <w:pPr>
+        <w:tabs>
+          <w:tab w:val="num" w:pos="4320"/>
+        </w:tabs>
+        <w:ind w:left="4320" w:hanging="360"/>
+      </w:pPr>
+      <w:rPr>
+        <w:rFonts w:ascii="Symbol" w:hAnsi="Symbol" w:hint="default"/>
+        <w:sz w:val="20"/>
+      </w:rPr>
+    </w:lvl>
+    <w:lvl w:ilvl="6" w:tentative="1">
+      <w:start w:val="1"/>
+      <w:numFmt w:val="bullet"/>
+      <w:lvlText w:val=""/>
+      <w:lvlJc w:val="left"/>
+      <w:pPr>
+        <w:tabs>
+          <w:tab w:val="num" w:pos="5040"/>
+        </w:tabs>
+        <w:ind w:left="5040" w:hanging="360"/>
+      </w:pPr>
+      <w:rPr>
+        <w:rFonts w:ascii="Symbol" w:hAnsi="Symbol" w:hint="default"/>
+        <w:sz w:val="20"/>
+      </w:rPr>
+    </w:lvl>
+    <w:lvl w:ilvl="7" w:tentative="1">
+      <w:start w:val="1"/>
+      <w:numFmt w:val="bullet"/>
+      <w:lvlText w:val=""/>
+      <w:lvlJc w:val="left"/>
+      <w:pPr>
+        <w:tabs>
+          <w:tab w:val="num" w:pos="5760"/>
+        </w:tabs>
+        <w:ind w:left="5760" w:hanging="360"/>
+      </w:pPr>
+      <w:rPr>
+        <w:rFonts w:ascii="Symbol" w:hAnsi="Symbol" w:hint="default"/>
+        <w:sz w:val="20"/>
+      </w:rPr>
+    </w:lvl>
+    <w:lvl w:ilvl="8" w:tentative="1">
+      <w:start w:val="1"/>
+      <w:numFmt w:val="bullet"/>
+      <w:lvlText w:val=""/>
+      <w:lvlJc w:val="left"/>
+      <w:pPr>
+        <w:tabs>
+          <w:tab w:val="num" w:pos="6480"/>
+        </w:tabs>
+        <w:ind w:left="6480" w:hanging="360"/>
+      </w:pPr>
+      <w:rPr>
+        <w:rFonts w:ascii="Symbol" w:hAnsi="Symbol" w:hint="default"/>
+        <w:sz w:val="20"/>
+      </w:rPr>
+    </w:lvl>
+  </w:abstractNum>
+  <w:abstractNum w:abstractNumId="1" w15:restartNumberingAfterBreak="0">
     <w:nsid w:val="241168A8"/>
     <w:multiLevelType w:val="hybridMultilevel"/>
     <w:tmpl w:val="AB160D6E"/>
@@ -3218,7 +3499,7 @@
       </w:rPr>
     </w:lvl>
   </w:abstractNum>
-  <w:abstractNum w:abstractNumId="1" w15:restartNumberingAfterBreak="0">
+  <w:abstractNum w:abstractNumId="2" w15:restartNumberingAfterBreak="0">
     <w:nsid w:val="265704B1"/>
     <w:multiLevelType w:val="hybridMultilevel"/>
     <w:tmpl w:val="479EF4D8"/>
@@ -3331,7 +3612,7 @@
       </w:rPr>
     </w:lvl>
   </w:abstractNum>
-  <w:abstractNum w:abstractNumId="2" w15:restartNumberingAfterBreak="0">
+  <w:abstractNum w:abstractNumId="3" w15:restartNumberingAfterBreak="0">
     <w:nsid w:val="40A94CE8"/>
     <w:multiLevelType w:val="hybridMultilevel"/>
     <w:tmpl w:val="C5F85F1A"/>
@@ -3444,7 +3725,7 @@
       </w:rPr>
     </w:lvl>
   </w:abstractNum>
-  <w:abstractNum w:abstractNumId="3" w15:restartNumberingAfterBreak="0">
+  <w:abstractNum w:abstractNumId="4" w15:restartNumberingAfterBreak="0">
     <w:nsid w:val="4A210A50"/>
     <w:multiLevelType w:val="hybridMultilevel"/>
     <w:tmpl w:val="C23047EE"/>
@@ -3557,7 +3838,7 @@
       </w:rPr>
     </w:lvl>
   </w:abstractNum>
-  <w:abstractNum w:abstractNumId="4" w15:restartNumberingAfterBreak="0">
+  <w:abstractNum w:abstractNumId="5" w15:restartNumberingAfterBreak="0">
     <w:nsid w:val="53DB3D73"/>
     <w:multiLevelType w:val="hybridMultilevel"/>
     <w:tmpl w:val="030E834A"/>
@@ -3669,7 +3950,7 @@
       </w:rPr>
     </w:lvl>
   </w:abstractNum>
-  <w:abstractNum w:abstractNumId="5" w15:restartNumberingAfterBreak="0">
+  <w:abstractNum w:abstractNumId="6" w15:restartNumberingAfterBreak="0">
     <w:nsid w:val="612803EF"/>
     <w:multiLevelType w:val="hybridMultilevel"/>
     <w:tmpl w:val="E2A215C8"/>
@@ -3782,23 +4063,178 @@
       </w:rPr>
     </w:lvl>
   </w:abstractNum>
+  <w:abstractNum w:abstractNumId="7" w15:restartNumberingAfterBreak="0">
+    <w:nsid w:val="6AC42051"/>
+    <w:multiLevelType w:val="multilevel"/>
+    <w:tmpl w:val="13FAB1FE"/>
+    <w:lvl w:ilvl="0">
+      <w:start w:val="1"/>
+      <w:numFmt w:val="bullet"/>
+      <w:lvlText w:val=""/>
+      <w:lvlJc w:val="left"/>
+      <w:pPr>
+        <w:tabs>
+          <w:tab w:val="num" w:pos="720"/>
+        </w:tabs>
+        <w:ind w:left="720" w:hanging="360"/>
+      </w:pPr>
+      <w:rPr>
+        <w:rFonts w:ascii="Symbol" w:hAnsi="Symbol" w:hint="default"/>
+        <w:sz w:val="20"/>
+      </w:rPr>
+    </w:lvl>
+    <w:lvl w:ilvl="1" w:tentative="1">
+      <w:start w:val="1"/>
+      <w:numFmt w:val="bullet"/>
+      <w:lvlText w:val=""/>
+      <w:lvlJc w:val="left"/>
+      <w:pPr>
+        <w:tabs>
+          <w:tab w:val="num" w:pos="1440"/>
+        </w:tabs>
+        <w:ind w:left="1440" w:hanging="360"/>
+      </w:pPr>
+      <w:rPr>
+        <w:rFonts w:ascii="Symbol" w:hAnsi="Symbol" w:hint="default"/>
+        <w:sz w:val="20"/>
+      </w:rPr>
+    </w:lvl>
+    <w:lvl w:ilvl="2" w:tentative="1">
+      <w:start w:val="1"/>
+      <w:numFmt w:val="bullet"/>
+      <w:lvlText w:val=""/>
+      <w:lvlJc w:val="left"/>
+      <w:pPr>
+        <w:tabs>
+          <w:tab w:val="num" w:pos="2160"/>
+        </w:tabs>
+        <w:ind w:left="2160" w:hanging="360"/>
+      </w:pPr>
+      <w:rPr>
+        <w:rFonts w:ascii="Symbol" w:hAnsi="Symbol" w:hint="default"/>
+        <w:sz w:val="20"/>
+      </w:rPr>
+    </w:lvl>
+    <w:lvl w:ilvl="3" w:tentative="1">
+      <w:start w:val="1"/>
+      <w:numFmt w:val="bullet"/>
+      <w:lvlText w:val=""/>
+      <w:lvlJc w:val="left"/>
+      <w:pPr>
+        <w:tabs>
+          <w:tab w:val="num" w:pos="2880"/>
+        </w:tabs>
+        <w:ind w:left="2880" w:hanging="360"/>
+      </w:pPr>
+      <w:rPr>
+        <w:rFonts w:ascii="Symbol" w:hAnsi="Symbol" w:hint="default"/>
+        <w:sz w:val="20"/>
+      </w:rPr>
+    </w:lvl>
+    <w:lvl w:ilvl="4" w:tentative="1">
+      <w:start w:val="1"/>
+      <w:numFmt w:val="bullet"/>
+      <w:lvlText w:val=""/>
+      <w:lvlJc w:val="left"/>
+      <w:pPr>
+        <w:tabs>
+          <w:tab w:val="num" w:pos="3600"/>
+        </w:tabs>
+        <w:ind w:left="3600" w:hanging="360"/>
+      </w:pPr>
+      <w:rPr>
+        <w:rFonts w:ascii="Symbol" w:hAnsi="Symbol" w:hint="default"/>
+        <w:sz w:val="20"/>
+      </w:rPr>
+    </w:lvl>
+    <w:lvl w:ilvl="5" w:tentative="1">
+      <w:start w:val="1"/>
+      <w:numFmt w:val="bullet"/>
+      <w:lvlText w:val=""/>
+      <w:lvlJc w:val="left"/>
+      <w:pPr>
+        <w:tabs>
+          <w:tab w:val="num" w:pos="4320"/>
+        </w:tabs>
+        <w:ind w:left="4320" w:hanging="360"/>
+      </w:pPr>
+      <w:rPr>
+        <w:rFonts w:ascii="Symbol" w:hAnsi="Symbol" w:hint="default"/>
+        <w:sz w:val="20"/>
+      </w:rPr>
+    </w:lvl>
+    <w:lvl w:ilvl="6" w:tentative="1">
+      <w:start w:val="1"/>
+      <w:numFmt w:val="bullet"/>
+      <w:lvlText w:val=""/>
+      <w:lvlJc w:val="left"/>
+      <w:pPr>
+        <w:tabs>
+          <w:tab w:val="num" w:pos="5040"/>
+        </w:tabs>
+        <w:ind w:left="5040" w:hanging="360"/>
+      </w:pPr>
+      <w:rPr>
+        <w:rFonts w:ascii="Symbol" w:hAnsi="Symbol" w:hint="default"/>
+        <w:sz w:val="20"/>
+      </w:rPr>
+    </w:lvl>
+    <w:lvl w:ilvl="7" w:tentative="1">
+      <w:start w:val="1"/>
+      <w:numFmt w:val="bullet"/>
+      <w:lvlText w:val=""/>
+      <w:lvlJc w:val="left"/>
+      <w:pPr>
+        <w:tabs>
+          <w:tab w:val="num" w:pos="5760"/>
+        </w:tabs>
+        <w:ind w:left="5760" w:hanging="360"/>
+      </w:pPr>
+      <w:rPr>
+        <w:rFonts w:ascii="Symbol" w:hAnsi="Symbol" w:hint="default"/>
+        <w:sz w:val="20"/>
+      </w:rPr>
+    </w:lvl>
+    <w:lvl w:ilvl="8" w:tentative="1">
+      <w:start w:val="1"/>
+      <w:numFmt w:val="bullet"/>
+      <w:lvlText w:val=""/>
+      <w:lvlJc w:val="left"/>
+      <w:pPr>
+        <w:tabs>
+          <w:tab w:val="num" w:pos="6480"/>
+        </w:tabs>
+        <w:ind w:left="6480" w:hanging="360"/>
+      </w:pPr>
+      <w:rPr>
+        <w:rFonts w:ascii="Symbol" w:hAnsi="Symbol" w:hint="default"/>
+        <w:sz w:val="20"/>
+      </w:rPr>
+    </w:lvl>
+  </w:abstractNum>
   <w:num w:numId="1" w16cid:durableId="223294125">
+    <w:abstractNumId w:val="3"/>
+  </w:num>
+  <w:num w:numId="2" w16cid:durableId="723216495">
     <w:abstractNumId w:val="2"/>
   </w:num>
-  <w:num w:numId="2" w16cid:durableId="723216495">
+  <w:num w:numId="3" w16cid:durableId="343553689">
+    <w:abstractNumId w:val="4"/>
+  </w:num>
+  <w:num w:numId="4" w16cid:durableId="1772965794">
+    <w:abstractNumId w:val="6"/>
+  </w:num>
+  <w:num w:numId="5" w16cid:durableId="215707219">
     <w:abstractNumId w:val="1"/>
   </w:num>
-  <w:num w:numId="3" w16cid:durableId="343553689">
-    <w:abstractNumId w:val="3"/>
-  </w:num>
-  <w:num w:numId="4" w16cid:durableId="1772965794">
+  <w:num w:numId="6" w16cid:durableId="341321532">
     <w:abstractNumId w:val="5"/>
   </w:num>
-  <w:num w:numId="5" w16cid:durableId="215707219">
+  <w:num w:numId="7" w16cid:durableId="1927760482">
+    <w:abstractNumId w:val="7"/>
+  </w:num>
+  <w:num w:numId="8" w16cid:durableId="746537253">
     <w:abstractNumId w:val="0"/>
-  </w:num>
-  <w:num w:numId="6" w16cid:durableId="341321532">
-    <w:abstractNumId w:val="4"/>
   </w:num>
   <w:numIdMacAtCleanup w:val="3"/>
 </w:numbering>
@@ -3833,6 +4269,7 @@
     <w:lsdException w:name="Strong" w:qFormat="1"/>
     <w:lsdException w:name="Emphasis" w:qFormat="1"/>
     <w:lsdException w:name="Plain Text" w:uiPriority="99"/>
+    <w:lsdException w:name="HTML Code" w:uiPriority="99"/>
     <w:lsdException w:name="HTML Keyboard" w:semiHidden="1" w:unhideWhenUsed="1"/>
     <w:lsdException w:name="Normal Table" w:semiHidden="1" w:unhideWhenUsed="1"/>
     <w:lsdException w:name="annotation subject" w:semiHidden="1" w:unhideWhenUsed="1"/>
@@ -4377,6 +4814,26 @@
       <w:bCs/>
     </w:rPr>
   </w:style>
+  <w:style w:type="paragraph" w:customStyle="1" w:styleId="py-1">
+    <w:name w:val="py-1"/>
+    <w:basedOn w:val="Normale"/>
+    <w:rsid w:val="007518FE"/>
+    <w:pPr>
+      <w:spacing w:before="100" w:beforeAutospacing="1" w:after="100" w:afterAutospacing="1"/>
+    </w:pPr>
+  </w:style>
+  <w:style w:type="character" w:styleId="CodiceHTML">
+    <w:name w:val="HTML Code"/>
+    <w:basedOn w:val="Carpredefinitoparagrafo"/>
+    <w:uiPriority w:val="99"/>
+    <w:unhideWhenUsed/>
+    <w:rsid w:val="007518FE"/>
+    <w:rPr>
+      <w:rFonts w:ascii="Courier New" w:eastAsia="Times New Roman" w:hAnsi="Courier New" w:cs="Courier New"/>
+      <w:sz w:val="20"/>
+      <w:szCs w:val="20"/>
+    </w:rPr>
+  </w:style>
 </w:styles>
 </file>
 
@@ -4676,25 +5133,6 @@
 </file>
 
 <file path=customXml/item1.xml><?xml version="1.0" encoding="utf-8"?>
-<?mso-contentType ?>
-<FormTemplates xmlns="http://schemas.microsoft.com/sharepoint/v3/contenttype/forms">
-  <Display>DocumentLibraryForm</Display>
-  <Edit>DocumentLibraryForm</Edit>
-  <New>DocumentLibraryForm</New>
-</FormTemplates>
-</file>
-
-<file path=customXml/item2.xml><?xml version="1.0" encoding="utf-8"?>
-<p:properties xmlns:p="http://schemas.microsoft.com/office/2006/metadata/properties" xmlns:xsi="http://www.w3.org/2001/XMLSchema-instance" xmlns:pc="http://schemas.microsoft.com/office/infopath/2007/PartnerControls">
-  <documentManagement/>
-</p:properties>
-</file>
-
-<file path=customXml/item3.xml><?xml version="1.0" encoding="utf-8"?>
-<b:Sources xmlns:b="http://schemas.openxmlformats.org/officeDocument/2006/bibliography" xmlns="http://schemas.openxmlformats.org/officeDocument/2006/bibliography" SelectedStyle="\APA.XSL" StyleName="APA"/>
-</file>
-
-<file path=customXml/item4.xml><?xml version="1.0" encoding="utf-8"?>
 <ct:contentTypeSchema xmlns:ct="http://schemas.microsoft.com/office/2006/metadata/contentType" xmlns:ma="http://schemas.microsoft.com/office/2006/metadata/properties/metaAttributes" ct:_="" ma:_="" ma:contentTypeName="Documento" ma:contentTypeID="0x010100BFE0AAAC2CC54C418DA47A7CB8166FA0" ma:contentTypeVersion="5" ma:contentTypeDescription="Creare un nuovo documento." ma:contentTypeScope="" ma:versionID="dd683600873b7a4e9fe4afb051b7e58c">
   <xsd:schema xmlns:xsd="http://www.w3.org/2001/XMLSchema" xmlns:xs="http://www.w3.org/2001/XMLSchema" xmlns:p="http://schemas.microsoft.com/office/2006/metadata/properties" xmlns:ns2="01e3470a-ce0e-48e1-80d6-507c9bb9300e" xmlns:ns3="84b43175-280a-42aa-ab86-d0e59bd5e42a" targetNamespace="http://schemas.microsoft.com/office/2006/metadata/properties" ma:root="true" ma:fieldsID="c72fdcb9647e512f47a1a1595b21fa17" ns2:_="" ns3:_="">
     <xsd:import namespace="01e3470a-ce0e-48e1-80d6-507c9bb9300e"/>
@@ -4865,32 +5303,26 @@
 </ct:contentTypeSchema>
 </file>
 
-<file path=customXml/itemProps1.xml><?xml version="1.0" encoding="utf-8"?>
-<ds:datastoreItem xmlns:ds="http://schemas.openxmlformats.org/officeDocument/2006/customXml" ds:itemID="{9ACE9208-4E52-4171-A59C-877DD5D3072B}">
-  <ds:schemaRefs>
-    <ds:schemaRef ds:uri="http://schemas.microsoft.com/sharepoint/v3/contenttype/forms"/>
-  </ds:schemaRefs>
-</ds:datastoreItem>
+<file path=customXml/item2.xml><?xml version="1.0" encoding="utf-8"?>
+<b:Sources xmlns:b="http://schemas.openxmlformats.org/officeDocument/2006/bibliography" xmlns="http://schemas.openxmlformats.org/officeDocument/2006/bibliography" SelectedStyle="\APA.XSL" StyleName="APA"/>
 </file>
 
-<file path=customXml/itemProps2.xml><?xml version="1.0" encoding="utf-8"?>
-<ds:datastoreItem xmlns:ds="http://schemas.openxmlformats.org/officeDocument/2006/customXml" ds:itemID="{C3F1FF63-CE75-403A-84F3-CF3DF9FE2F1D}">
-  <ds:schemaRefs>
-    <ds:schemaRef ds:uri="http://schemas.microsoft.com/office/2006/metadata/properties"/>
-    <ds:schemaRef ds:uri="http://schemas.microsoft.com/office/infopath/2007/PartnerControls"/>
-  </ds:schemaRefs>
-</ds:datastoreItem>
+<file path=customXml/item3.xml><?xml version="1.0" encoding="utf-8"?>
+<p:properties xmlns:p="http://schemas.microsoft.com/office/2006/metadata/properties" xmlns:xsi="http://www.w3.org/2001/XMLSchema-instance" xmlns:pc="http://schemas.microsoft.com/office/infopath/2007/PartnerControls">
+  <documentManagement/>
+</p:properties>
 </file>
 
-<file path=customXml/itemProps3.xml><?xml version="1.0" encoding="utf-8"?>
-<ds:datastoreItem xmlns:ds="http://schemas.openxmlformats.org/officeDocument/2006/customXml" ds:itemID="{6E6D49CC-00C6-4EC9-ADE2-9DBAAAC7789C}">
-  <ds:schemaRefs>
-    <ds:schemaRef ds:uri="http://schemas.openxmlformats.org/officeDocument/2006/bibliography"/>
-  </ds:schemaRefs>
-</ds:datastoreItem>
+<file path=customXml/item4.xml><?xml version="1.0" encoding="utf-8"?>
+<?mso-contentType ?>
+<FormTemplates xmlns="http://schemas.microsoft.com/sharepoint/v3/contenttype/forms">
+  <Display>DocumentLibraryForm</Display>
+  <Edit>DocumentLibraryForm</Edit>
+  <New>DocumentLibraryForm</New>
+</FormTemplates>
 </file>
 
-<file path=customXml/itemProps4.xml><?xml version="1.0" encoding="utf-8"?>
+<file path=customXml/itemProps1.xml><?xml version="1.0" encoding="utf-8"?>
 <ds:datastoreItem xmlns:ds="http://schemas.openxmlformats.org/officeDocument/2006/customXml" ds:itemID="{95175EBC-B26E-4CB7-9641-88497C61A96A}">
   <ds:schemaRefs>
     <ds:schemaRef ds:uri="http://schemas.microsoft.com/office/2006/metadata/contentType"/>
@@ -4907,4 +5339,29 @@
     <ds:schemaRef ds:uri="http://schemas.microsoft.com/internal/obd"/>
   </ds:schemaRefs>
 </ds:datastoreItem>
+</file>
+
+<file path=customXml/itemProps2.xml><?xml version="1.0" encoding="utf-8"?>
+<ds:datastoreItem xmlns:ds="http://schemas.openxmlformats.org/officeDocument/2006/customXml" ds:itemID="{6E6D49CC-00C6-4EC9-ADE2-9DBAAAC7789C}">
+  <ds:schemaRefs>
+    <ds:schemaRef ds:uri="http://schemas.openxmlformats.org/officeDocument/2006/bibliography"/>
+  </ds:schemaRefs>
+</ds:datastoreItem>
+</file>
+
+<file path=customXml/itemProps3.xml><?xml version="1.0" encoding="utf-8"?>
+<ds:datastoreItem xmlns:ds="http://schemas.openxmlformats.org/officeDocument/2006/customXml" ds:itemID="{C3F1FF63-CE75-403A-84F3-CF3DF9FE2F1D}">
+  <ds:schemaRefs>
+    <ds:schemaRef ds:uri="http://schemas.microsoft.com/office/2006/metadata/properties"/>
+    <ds:schemaRef ds:uri="http://schemas.microsoft.com/office/infopath/2007/PartnerControls"/>
+  </ds:schemaRefs>
+</ds:datastoreItem>
+</file>
+
+<file path=customXml/itemProps4.xml><?xml version="1.0" encoding="utf-8"?>
+<ds:datastoreItem xmlns:ds="http://schemas.openxmlformats.org/officeDocument/2006/customXml" ds:itemID="{9ACE9208-4E52-4171-A59C-877DD5D3072B}">
+  <ds:schemaRefs>
+    <ds:schemaRef ds:uri="http://schemas.microsoft.com/sharepoint/v3/contenttype/forms"/>
+  </ds:schemaRefs>
+</ds:datastoreItem>
 </file>
</xml_diff>

<commit_message>
fix(export): ripara template Verbale XML e normalizza document.xml in export
Il DOCX Verbale conteneva w:p annidati illegali e attributi senza virgolette, che rendevano document.xml non ben formato e Word mostrava contenuto illeggibile. Corretto il file template in repo, aggiunta normalizzazione a runtime, script di riparazione/verifica e repro export da DB.

Made-with: Cursor
</commit_message>
<xml_diff>
--- a/app/public/templates/Verbale_di_riunione_QTAFI_VIS001.docx
+++ b/app/public/templates/Verbale_di_riunione_QTAFI_VIS001.docx
@@ -1,6 +1,2705 @@
 
-<file path=word/document.xml><?xml version="1.0" encoding="UTF-8" standalone="yes"?>
-<w:document xmlns:wpc="http://schemas.microsoft.com/office/word/2010/wordprocessingCanvas" xmlns:cx="http://schemas.microsoft.com/office/drawing/2014/chartex" xmlns:cx1="http://schemas.microsoft.com/office/drawing/2015/9/8/chartex" xmlns:cx2="http://schemas.microsoft.com/office/drawing/2015/10/21/chartex" xmlns:cx3="http://schemas.microsoft.com/office/drawing/2016/5/9/chartex" xmlns:cx4="http://schemas.microsoft.com/office/drawing/2016/5/10/chartex" xmlns:cx5="http://schemas.microsoft.com/office/drawing/2016/5/11/chartex" xmlns:cx6="http://schemas.microsoft.com/office/drawing/2016/5/12/chartex" xmlns:cx7="http://schemas.microsoft.com/office/drawing/2016/5/13/chartex" xmlns:cx8="http://schemas.microsoft.com/office/drawing/2016/5/14/chartex" xmlns:mc="http://schemas.openxmlformats.org/markup-compatibility/2006" xmlns:aink="http://schemas.microsoft.com/office/drawing/2016/ink" xmlns:am3d="http://schemas.microsoft.com/office/drawing/2017/model3d" xmlns:o="urn:schemas-microsoft-com:office:office" xmlns:oel="http://schemas.microsoft.com/office/2019/extlst" xmlns:r="http://schemas.openxmlformats.org/officeDocument/2006/relationships" xmlns:m="http://schemas.openxmlformats.org/officeDocument/2006/math" xmlns:v="urn:schemas-microsoft-com:vml" xmlns:wp14="http://schemas.microsoft.com/office/word/2010/wordprocessingDrawing" xmlns:wp="http://schemas.openxmlformats.org/drawingml/2006/wordprocessingDrawing" xmlns:w10="urn:schemas-microsoft-com:office:word" xmlns:w="http://schemas.openxmlformats.org/wordprocessingml/2006/main" xmlns:w14="http://schemas.microsoft.com/office/word/2010/wordml" xmlns:w15="http://schemas.microsoft.com/office/word/2012/wordml" xmlns:w16cex="http://schemas.microsoft.com/office/word/2018/wordml/cex" xmlns:w16cid="http://schemas.microsoft.com/office/word/2016/wordml/cid" xmlns:w16="http://schemas.microsoft.com/office/word/2018/wordml" xmlns:w16du="http://schemas.microsoft.com/office/word/2023/wordml/word16du" xmlns:w16sdtdh="http://schemas.microsoft.com/office/word/2020/wordml/sdtdatahash" xmlns:w16sdtfl="http://schemas.microsoft.com/office/word/2024/wordml/sdtformatlock" xmlns:w16se="http://schemas.microsoft.com/office/word/2015/wordml/symex" xmlns:wpg="http://schemas.microsoft.com/office/word/2010/wordprocessingGroup" xmlns:wpi="http://schemas.microsoft.com/office/word/2010/wordprocessingInk" xmlns:wne="http://schemas.microsoft.com/office/word/2006/wordml" xmlns:wps="http://schemas.microsoft.com/office/word/2010/wordprocessingShape" mc:Ignorable="w14 w15 w16se w16cid w16 w16cex w16sdtdh w16sdtfl w16du wp14"><w:body><w:tbl><w:tblPr><w:tblW w:w="11057" w:type="dxa"/><w:tblInd w:w="-714" w:type="dxa"/><w:tblBorders><w:top w:val="single" w:sz="4" w:space="0" w:color="auto"/><w:left w:val="single" w:sz="4" w:space="0" w:color="auto"/><w:bottom w:val="single" w:sz="4" w:space="0" w:color="auto"/><w:right w:val="single" w:sz="4" w:space="0" w:color="auto"/><w:insideH w:val="single" w:sz="4" w:space="0" w:color="auto"/><w:insideV w:val="single" w:sz="4" w:space="0" w:color="auto"/></w:tblBorders><w:tblLook w:val="01E0" w:firstRow="1" w:lastRow="1" w:firstColumn="1" w:lastColumn="1" w:noHBand="0" w:noVBand="0"/></w:tblPr><w:tblGrid><w:gridCol w:w="2378"/><w:gridCol w:w="1765"/><w:gridCol w:w="1764"/><w:gridCol w:w="1765"/><w:gridCol w:w="1826"/><w:gridCol w:w="1559"/></w:tblGrid><w:tr><w:trPr><w:trHeight w:val="336"/><w:tblHeader/></w:trPr><w:tc><w:tcPr><w:tcW w:w="11057" w:type="dxa"/><w:gridSpan w:val="6"/><w:shd w:val="clear" w:color="auto" w:fill="D9D9D9" w:themeFill="background1" w:themeFillShade="D9"/><w:vAlign w:val="center"/></w:tcPr><w:p><w:pPr><w:spacing w:line="240" w:lineRule="exact"/><w:jc w:val="center"/><w:rPr><w:rFonts w:asciiTheme="minorHAnsi" w:hAnsiTheme="minorHAnsi" w:cstheme="minorHAnsi"/><w:b/><w:bCs/><w:sz w:val="20"/><w:szCs w:val="20"/></w:rPr></w:pPr><w:proofErr w:type="gramStart"/><w:r><w:rPr><w:rFonts w:asciiTheme="minorHAnsi" w:hAnsiTheme="minorHAnsi" w:cstheme="minorHAnsi"/><w:b/><w:bCs/><w:sz w:val="20"/><w:szCs w:val="20"/></w:rPr><w:t>MEETING</w:t></w:r><w:proofErr w:type="gramEnd"/><w:r><w:rPr><w:rFonts w:asciiTheme="minorHAnsi" w:hAnsiTheme="minorHAnsi" w:cstheme="minorHAnsi"/><w:b/><w:bCs/><w:sz w:val="20"/><w:szCs w:val="20"/></w:rPr><w:t xml:space="preserve"> PRESENCE</w:t></w:r></w:p></w:tc></w:tr><w:tr><w:trPr><w:trHeight w:val="336"/><w:tblHeader/></w:trPr><w:tc><w:tcPr><w:tcW w:w="2378" w:type="dxa"/><w:shd w:val="clear" w:color="auto" w:fill="D9D9D9" w:themeFill="background1" w:themeFillShade="D9"/><w:vAlign w:val="center"/></w:tcPr><w:p><w:pPr><w:spacing w:line="240" w:lineRule="exact"/><w:jc w:val="right"/><w:rPr><w:rFonts w:asciiTheme="minorHAnsi" w:hAnsiTheme="minorHAnsi" w:cstheme="minorHAnsi"/><w:b/><w:bCs/><w:sz w:val="20"/><w:szCs w:val="20"/></w:rPr></w:pPr><w:r><w:rPr><w:rFonts w:asciiTheme="minorHAnsi" w:hAnsiTheme="minorHAnsi" w:cstheme="minorHAnsi"/><w:b/><w:bCs/><w:sz w:val="20"/><w:szCs w:val="20"/></w:rPr><w:t>PLACE:</w:t></w:r></w:p></w:tc><w:tc><w:tcPr><w:tcW w:w="3529" w:type="dxa"/><w:gridSpan w:val="2"/><w:shd w:val="clear" w:color="auto" w:fill="D9D9D9" w:themeFill="background1" w:themeFillShade="D9"/><w:vAlign w:val="center"/></w:tcPr><w:p><w:pPr><w:spacing w:line="240" w:lineRule="exact"/><w:rPr><w:rFonts w:asciiTheme="minorHAnsi" w:hAnsiTheme="minorHAnsi" w:cstheme="minorHAnsi"/><w:b/><w:bCs/><w:sz w:val="20"/><w:szCs w:val="20"/></w:rPr></w:pPr><w:r><w:rPr><w:rFonts w:asciiTheme="minorHAnsi" w:hAnsiTheme="minorHAnsi" w:cstheme="minorHAnsi"/><w:sz w:val="20"/><w:szCs w:val="20"/></w:rPr><w:t xml:space="preserve">STABILIMENTO </w:t></w:r><w:r><w:rPr><w:rFonts w:asciiTheme="minorHAnsi" w:hAnsiTheme="minorHAnsi" w:cstheme="minorHAnsi"/><w:sz w:val="20"/><w:szCs w:val="20"/></w:rPr><w:t>OFF.MA</w:t></w:r></w:p></w:tc><w:tc><w:tcPr><w:tcW w:w="1765" w:type="dxa"/><w:shd w:val="clear" w:color="auto" w:fill="D9D9D9" w:themeFill="background1" w:themeFillShade="D9"/><w:vAlign w:val="center"/></w:tcPr><w:p><w:pPr><w:spacing w:line="240" w:lineRule="exact"/><w:jc w:val="right"/><w:rPr><w:rFonts w:asciiTheme="minorHAnsi" w:hAnsiTheme="minorHAnsi" w:cstheme="minorHAnsi"/><w:sz w:val="20"/><w:szCs w:val="20"/></w:rPr></w:pPr><w:r><w:rPr><w:rFonts w:asciiTheme="minorHAnsi" w:hAnsiTheme="minorHAnsi" w:cstheme="minorHAnsi"/><w:b/><w:bCs/><w:sz w:val="20"/><w:szCs w:val="20"/></w:rPr><w:t>DATE:</w:t></w:r></w:p></w:tc><w:tc><w:tcPr><w:tcW w:w="3385" w:type="dxa"/><w:gridSpan w:val="2"/><w:shd w:val="clear" w:color="auto" w:fill="D9D9D9" w:themeFill="background1" w:themeFillShade="D9"/><w:vAlign w:val="center"/></w:tcPr><w:p><w:pPr><w:spacing w:line="240" w:lineRule="exact"/><w:rPr><w:rFonts w:asciiTheme="minorHAnsi" w:hAnsiTheme="minorHAnsi" w:cstheme="minorHAnsi"/><w:sz w:val="20"/><w:szCs w:val="20"/></w:rPr></w:pPr><w:r><w:rPr><w:rFonts w:asciiTheme="minorHAnsi" w:hAnsiTheme="minorHAnsi" w:cstheme="minorHAnsi"/><w:sz w:val="20"/><w:szCs w:val="20"/></w:rPr><w:t>25</w:t></w:r><w:r><w:rPr><w:rFonts w:asciiTheme="minorHAnsi" w:hAnsiTheme="minorHAnsi" w:cstheme="minorHAnsi"/><w:sz w:val="20"/><w:szCs w:val="20"/></w:rPr><w:t>/</w:t></w:r><w:r><w:rPr><w:rFonts w:asciiTheme="minorHAnsi" w:hAnsiTheme="minorHAnsi" w:cstheme="minorHAnsi"/><w:sz w:val="20"/><w:szCs w:val="20"/></w:rPr><w:t>0</w:t></w:r><w:r><w:rPr><w:rFonts w:asciiTheme="minorHAnsi" w:hAnsiTheme="minorHAnsi" w:cstheme="minorHAnsi"/><w:sz w:val="20"/><w:szCs w:val="20"/></w:rPr><w:t>2</w:t></w:r><w:r><w:rPr><w:rFonts w:asciiTheme="minorHAnsi" w:hAnsiTheme="minorHAnsi" w:cstheme="minorHAnsi"/><w:sz w:val="20"/><w:szCs w:val="20"/></w:rPr><w:t>/202</w:t></w:r><w:r><w:rPr><w:rFonts w:asciiTheme="minorHAnsi" w:hAnsiTheme="minorHAnsi" w:cstheme="minorHAnsi"/><w:sz w:val="20"/><w:szCs w:val="20"/></w:rPr><w:t>6</w:t></w:r></w:p></w:tc></w:tr><w:tr><w:trPr><w:trHeight w:val="569"/></w:trPr><w:tc><w:tcPr><w:tcW w:w="2378" w:type="dxa"/><w:vAlign w:val="center"/></w:tcPr><w:p><w:pPr><w:jc w:val="right"/><w:rPr><w:rFonts w:asciiTheme="minorHAnsi" w:hAnsiTheme="minorHAnsi" w:cstheme="minorHAnsi"/><w:bCs/><w:sz w:val="20"/><w:szCs w:val="20"/></w:rPr></w:pPr><w:r><w:rPr><w:rFonts w:asciiTheme="minorHAnsi" w:hAnsiTheme="minorHAnsi" w:cstheme="minorHAnsi"/><w:b/><w:bCs/><w:sz w:val="20"/><w:szCs w:val="20"/></w:rPr><w:t>F</w:t></w:r><w:r><w:rPr><w:rFonts w:asciiTheme="minorHAnsi" w:hAnsiTheme="minorHAnsi" w:cstheme="minorHAnsi"/><w:b/><w:bCs/><w:sz w:val="20"/><w:szCs w:val="20"/></w:rPr><w:t>incantieri Infrastructure</w:t></w:r></w:p></w:tc><w:tc><w:tcPr><w:tcW w:w="1765" w:type="dxa"/><w:vAlign w:val="center"/></w:tcPr><w:p><w:pPr><w:rPr><w:rFonts w:asciiTheme="minorHAnsi" w:hAnsiTheme="minorHAnsi" w:cstheme="minorHAnsi"/><w:bCs/><w:sz w:val="20"/><w:szCs w:val="20"/></w:rPr></w:pPr><w:sdt><w:sdtPr><w:rPr><w:rFonts w:asciiTheme="minorHAnsi" w:hAnsiTheme="minorHAnsi" w:cstheme="minorHAnsi"/><w:bCs/><w:sz w:val="18"/><w:szCs w:val="18"/></w:rPr><w:id w:val="4723411"/><w14:checkbox><w14:checked w14:val="0"/><w14:checkedState w14:val="2612" w14:font="MS Gothic"/><w14:uncheckedState w14:val="2610" w14:font="MS Gothic"/></w14:checkbox></w:sdtPr><w:sdtEndPr/><w:sdtContent><w:r><w:rPr><w:rFonts w:ascii="MS Gothic" w:eastAsia="MS Gothic" w:hAnsi="MS Gothic" w:cstheme="minorHAnsi" w:hint="eastAsia"/><w:bCs/><w:sz w:val="18"/><w:szCs w:val="18"/></w:rPr><w:t>☐</w:t></w:r></w:sdtContent></w:sdt><w:r><w:rPr><w:rFonts w:asciiTheme="minorHAnsi" w:hAnsiTheme="minorHAnsi" w:cstheme="minorHAnsi"/><w:bCs/><w:sz w:val="18"/><w:szCs w:val="18"/></w:rPr><w:t xml:space="preserve">   </w:t></w:r><w:r><w:rPr><w:rFonts w:asciiTheme="minorHAnsi" w:hAnsiTheme="minorHAnsi" w:cstheme="minorHAnsi"/><w:bCs/><w:sz w:val="18"/><w:szCs w:val="18"/></w:rPr><w:t>A. Mason</w:t></w:r></w:p></w:tc><w:tc><w:tcPr><w:tcW w:w="1764" w:type="dxa"/><w:vAlign w:val="center"/></w:tcPr><w:p><w:pPr><w:rPr><w:rFonts w:asciiTheme="minorHAnsi" w:hAnsiTheme="minorHAnsi" w:cstheme="minorHAnsi"/><w:bCs/><w:sz w:val="20"/><w:szCs w:val="20"/></w:rPr></w:pPr><w:sdt><w:sdtPr><w:rPr><w:rFonts w:asciiTheme="minorHAnsi" w:hAnsiTheme="minorHAnsi" w:cstheme="minorHAnsi"/><w:bCs/><w:sz w:val="18"/><w:szCs w:val="18"/></w:rPr><w:id w:val="1703285428"/><w14:checkbox><w14:checked w14:val="1"/><w14:checkedState w14:val="2612" w14:font="MS Gothic"/><w14:uncheckedState w14:val="2610" w14:font="MS Gothic"/></w14:checkbox></w:sdtPr><w:sdtEndPr/><w:sdtContent><w:r><w:rPr><w:rFonts w:ascii="MS Gothic" w:eastAsia="MS Gothic" w:hAnsi="MS Gothic" w:cstheme="minorHAnsi" w:hint="eastAsia"/><w:bCs/><w:sz w:val="18"/><w:szCs w:val="18"/></w:rPr><w:t>☒</w:t></w:r></w:sdtContent></w:sdt><w:r><w:rPr><w:rFonts w:asciiTheme="minorHAnsi" w:hAnsiTheme="minorHAnsi" w:cstheme="minorHAnsi"/><w:bCs/><w:sz w:val="18"/><w:szCs w:val="18"/></w:rPr><w:t xml:space="preserve">   </w:t></w:r><w:r><w:rPr><w:rFonts w:asciiTheme="minorHAnsi" w:eastAsia="MS Gothic" w:hAnsiTheme="minorHAnsi" w:cstheme="minorHAnsi"/><w:bCs/><w:sz w:val="18"/><w:szCs w:val="18"/></w:rPr><w:t>M. Melotto</w:t></w:r></w:p></w:tc><w:tc><w:tcPr><w:tcW w:w="1765" w:type="dxa"/><w:vAlign w:val="center"/></w:tcPr><w:p><w:pPr><w:rPr><w:rFonts w:asciiTheme="minorHAnsi" w:hAnsiTheme="minorHAnsi" w:cstheme="minorHAnsi"/><w:bCs/><w:sz w:val="20"/><w:szCs w:val="20"/></w:rPr></w:pPr><w:sdt><w:sdtPr><w:rPr><w:rFonts w:asciiTheme="minorHAnsi" w:hAnsiTheme="minorHAnsi" w:cstheme="minorHAnsi"/><w:bCs/><w:sz w:val="18"/><w:szCs w:val="18"/></w:rPr><w:id w:val="-1009988275"/><w14:checkbox><w14:checked w14:val="0"/><w14:checkedState w14:val="2612" w14:font="MS Gothic"/><w14:uncheckedState w14:val="2610" w14:font="MS Gothic"/></w14:checkbox></w:sdtPr><w:sdtEndPr/><w:sdtContent><w:r><w:rPr><w:rFonts w:ascii="MS Gothic" w:eastAsia="MS Gothic" w:hAnsi="MS Gothic" w:cstheme="minorHAnsi" w:hint="eastAsia"/><w:bCs/><w:sz w:val="18"/><w:szCs w:val="18"/></w:rPr><w:t>☐</w:t></w:r></w:sdtContent></w:sdt><w:r><w:rPr><w:rFonts w:asciiTheme="minorHAnsi" w:hAnsiTheme="minorHAnsi" w:cstheme="minorHAnsi"/><w:bCs/><w:sz w:val="18"/><w:szCs w:val="18"/></w:rPr><w:t xml:space="preserve">   </w:t></w:r></w:p></w:tc><w:tc><w:tcPr><w:tcW w:w="1826" w:type="dxa"/><w:vAlign w:val="center"/></w:tcPr><w:p><w:pPr><w:rPr><w:rFonts w:asciiTheme="minorHAnsi" w:hAnsiTheme="minorHAnsi" w:cstheme="minorHAnsi"/><w:bCs/><w:sz w:val="20"/><w:szCs w:val="20"/></w:rPr></w:pPr><w:sdt><w:sdtPr><w:rPr><w:rFonts w:asciiTheme="minorHAnsi" w:hAnsiTheme="minorHAnsi" w:cstheme="minorHAnsi"/><w:bCs/><w:sz w:val="18"/><w:szCs w:val="18"/></w:rPr><w:id w:val="-640884296"/><w14:checkbox><w14:checked w14:val="0"/><w14:checkedState w14:val="2612" w14:font="MS Gothic"/><w14:uncheckedState w14:val="2610" w14:font="MS Gothic"/></w14:checkbox></w:sdtPr><w:sdtEndPr/><w:sdtContent><w:r><w:rPr><w:rFonts w:ascii="MS Gothic" w:eastAsia="MS Gothic" w:hAnsi="MS Gothic" w:cstheme="minorHAnsi" w:hint="eastAsia"/><w:bCs/><w:sz w:val="18"/><w:szCs w:val="18"/></w:rPr><w:t>☐</w:t></w:r></w:sdtContent></w:sdt><w:r><w:rPr><w:rFonts w:asciiTheme="minorHAnsi" w:hAnsiTheme="minorHAnsi" w:cstheme="minorHAnsi"/><w:bCs/><w:sz w:val="18"/><w:szCs w:val="18"/></w:rPr><w:t xml:space="preserve">   </w:t></w:r></w:p></w:tc><w:tc><w:tcPr><w:tcW w:w="1559" w:type="dxa"/><w:vAlign w:val="center"/></w:tcPr><w:p><w:pPr><w:rPr><w:rFonts w:asciiTheme="minorHAnsi" w:hAnsiTheme="minorHAnsi" w:cstheme="minorHAnsi"/><w:bCs/><w:sz w:val="20"/><w:szCs w:val="20"/></w:rPr></w:pPr><w:sdt><w:sdtPr><w:rPr><w:rFonts w:asciiTheme="minorHAnsi" w:eastAsia="MS Gothic" w:hAnsiTheme="minorHAnsi" w:cstheme="minorHAnsi"/><w:bCs/><w:sz w:val="18"/><w:szCs w:val="18"/></w:rPr><w:id w:val="-1037889580"/><w14:checkbox><w14:checked w14:val="0"/><w14:checkedState w14:val="2612" w14:font="MS Gothic"/><w14:uncheckedState w14:val="2610" w14:font="MS Gothic"/></w14:checkbox></w:sdtPr><w:sdtEndPr/><w:sdtContent><w:r><w:rPr><w:rFonts w:ascii="MS Gothic" w:eastAsia="MS Gothic" w:hAnsi="MS Gothic" w:cstheme="minorHAnsi" w:hint="eastAsia"/><w:bCs/><w:sz w:val="18"/><w:szCs w:val="18"/></w:rPr><w:t>☐</w:t></w:r></w:sdtContent></w:sdt></w:p></w:tc></w:tr><w:tr><w:trPr><w:trHeight w:val="565"/></w:trPr><w:tc><w:tcPr><w:tcW w:w="2378" w:type="dxa"/><w:vAlign w:val="center"/></w:tcPr><w:p><w:pPr><w:jc w:val="right"/><w:rPr><w:rFonts w:asciiTheme="minorHAnsi" w:hAnsiTheme="minorHAnsi" w:cstheme="minorHAnsi"/><w:bCs/><w:sz w:val="20"/><w:szCs w:val="20"/></w:rPr></w:pPr><w:r><w:rPr><w:rFonts w:asciiTheme="minorHAnsi" w:hAnsiTheme="minorHAnsi" w:cstheme="minorHAnsi"/><w:b/><w:bCs/><w:sz w:val="20"/><w:szCs w:val="20"/></w:rPr><w:t>Off.ma S.p.A.</w:t></w:r></w:p></w:tc><w:tc><w:tcPr><w:tcW w:w="1765" w:type="dxa"/><w:vAlign w:val="center"/></w:tcPr><w:p><w:pPr><w:rPr><w:rFonts w:asciiTheme="minorHAnsi" w:hAnsiTheme="minorHAnsi" w:cstheme="minorHAnsi"/><w:bCs/><w:sz w:val="20"/><w:szCs w:val="20"/></w:rPr></w:pPr><w:sdt><w:sdtPr><w:rPr><w:rFonts w:asciiTheme="minorHAnsi" w:hAnsiTheme="minorHAnsi" w:cstheme="minorHAnsi"/><w:bCs/><w:sz w:val="18"/><w:szCs w:val="18"/></w:rPr><w:id w:val="1629122076"/><w14:checkbox><w14:checked w14:val="1"/><w14:checkedState w14:val="2612" w14:font="MS Gothic"/><w14:uncheckedState w14:val="2610" w14:font="MS Gothic"/></w14:checkbox></w:sdtPr><w:sdtEndPr/><w:sdtContent><w:r><w:rPr><w:rFonts w:ascii="MS Gothic" w:eastAsia="MS Gothic" w:hAnsi="MS Gothic" w:cstheme="minorHAnsi" w:hint="eastAsia"/><w:bCs/><w:sz w:val="18"/><w:szCs w:val="18"/></w:rPr><w:t>☒</w:t></w:r></w:sdtContent></w:sdt><w:r><w:rPr><w:rFonts w:asciiTheme="minorHAnsi" w:hAnsiTheme="minorHAnsi" w:cstheme="minorHAnsi"/><w:bCs/><w:sz w:val="18"/><w:szCs w:val="18"/></w:rPr><w:t xml:space="preserve">   </w:t></w:r><w:r><w:rPr><w:rFonts w:asciiTheme="minorHAnsi" w:hAnsiTheme="minorHAnsi" w:cstheme="minorHAnsi"/><w:bCs/><w:sz w:val="18"/><w:szCs w:val="18"/></w:rPr><w:t>S. Zadro</w:t></w:r></w:p></w:tc><w:tc><w:tcPr><w:tcW w:w="1764" w:type="dxa"/><w:vAlign w:val="center"/></w:tcPr><w:p><w:pPr><w:rPr><w:rFonts w:asciiTheme="minorHAnsi" w:hAnsiTheme="minorHAnsi" w:cstheme="minorHAnsi"/><w:bCs/><w:sz w:val="20"/><w:szCs w:val="20"/></w:rPr></w:pPr><w:sdt><w:sdtPr><w:rPr><w:rFonts w:asciiTheme="minorHAnsi" w:hAnsiTheme="minorHAnsi" w:cstheme="minorHAnsi"/><w:bCs/><w:sz w:val="18"/><w:szCs w:val="18"/></w:rPr><w:id w:val="881442262"/><w14:checkbox><w14:checked w14:val="1"/><w14:checkedState w14:val="2612" w14:font="MS Gothic"/><w14:uncheckedState w14:val="2610" w14:font="MS Gothic"/></w14:checkbox></w:sdtPr><w:sdtEndPr/><w:sdtContent><w:r><w:rPr><w:rFonts w:ascii="MS Gothic" w:eastAsia="MS Gothic" w:hAnsi="MS Gothic" w:cstheme="minorHAnsi" w:hint="eastAsia"/><w:bCs/><w:sz w:val="18"/><w:szCs w:val="18"/></w:rPr><w:t>☒</w:t></w:r></w:sdtContent></w:sdt><w:r><w:rPr><w:rFonts w:asciiTheme="minorHAnsi" w:hAnsiTheme="minorHAnsi" w:cstheme="minorHAnsi"/><w:bCs/><w:sz w:val="18"/><w:szCs w:val="18"/></w:rPr><w:t xml:space="preserve">   </w:t></w:r><w:r><w:rPr><w:rFonts w:asciiTheme="minorHAnsi" w:hAnsiTheme="minorHAnsi" w:cstheme="minorHAnsi"/><w:bCs/><w:sz w:val="18"/><w:szCs w:val="18"/></w:rPr><w:t>E. Boccalon</w:t></w:r></w:p></w:tc><w:tc><w:tcPr><w:tcW w:w="1765" w:type="dxa"/><w:vAlign w:val="center"/></w:tcPr><w:p><w:pPr><w:rPr><w:rFonts w:asciiTheme="minorHAnsi" w:hAnsiTheme="minorHAnsi" w:cstheme="minorHAnsi"/><w:bCs/><w:sz w:val="20"/><w:szCs w:val="20"/></w:rPr></w:pPr><w:sdt><w:sdtPr><w:rPr><w:rFonts w:asciiTheme="minorHAnsi" w:hAnsiTheme="minorHAnsi" w:cstheme="minorHAnsi"/><w:bCs/><w:sz w:val="18"/><w:szCs w:val="18"/></w:rPr><w:id w:val="-950699189"/><w14:checkbox><w14:checked w14:val="0"/><w14:checkedState w14:val="2612" w14:font="MS Gothic"/><w14:uncheckedState w14:val="2610" w14:font="MS Gothic"/></w14:checkbox></w:sdtPr><w:sdtEndPr/><w:sdtContent><w:r><w:rPr><w:rFonts w:ascii="MS Gothic" w:eastAsia="MS Gothic" w:hAnsi="MS Gothic" w:cstheme="minorHAnsi" w:hint="eastAsia"/><w:bCs/><w:sz w:val="18"/><w:szCs w:val="18"/></w:rPr><w:t>☐</w:t></w:r></w:sdtContent></w:sdt><w:r><w:rPr><w:rFonts w:asciiTheme="minorHAnsi" w:hAnsiTheme="minorHAnsi" w:cstheme="minorHAnsi"/><w:bCs/><w:sz w:val="18"/><w:szCs w:val="18"/></w:rPr><w:t xml:space="preserve">  </w:t></w:r></w:p></w:tc><w:tc><w:tcPr><w:tcW w:w="1826" w:type="dxa"/><w:vAlign w:val="center"/></w:tcPr><w:p><w:pPr><w:rPr><w:rFonts w:asciiTheme="minorHAnsi" w:hAnsiTheme="minorHAnsi" w:cstheme="minorHAnsi"/><w:bCs/><w:sz w:val="20"/><w:szCs w:val="20"/></w:rPr></w:pPr><w:sdt><w:sdtPr><w:rPr><w:rFonts w:asciiTheme="minorHAnsi" w:hAnsiTheme="minorHAnsi" w:cstheme="minorHAnsi"/><w:bCs/><w:sz w:val="18"/><w:szCs w:val="18"/></w:rPr><w:id w:val="-769309896"/><w14:checkbox><w14:checked w14:val="0"/><w14:checkedState w14:val="2612" w14:font="MS Gothic"/><w14:uncheckedState w14:val="2610" w14:font="MS Gothic"/></w14:checkbox></w:sdtPr><w:sdtEndPr/><w:sdtContent><w:r><w:rPr><w:rFonts w:ascii="MS Gothic" w:eastAsia="MS Gothic" w:hAnsi="MS Gothic" w:cstheme="minorHAnsi" w:hint="eastAsia"/><w:bCs/><w:sz w:val="18"/><w:szCs w:val="18"/></w:rPr><w:t>☐</w:t></w:r></w:sdtContent></w:sdt></w:p></w:tc><w:tc><w:tcPr><w:tcW w:w="1559" w:type="dxa"/><w:vAlign w:val="center"/></w:tcPr><w:p><w:pPr><w:rPr><w:rFonts w:asciiTheme="minorHAnsi" w:hAnsiTheme="minorHAnsi" w:cstheme="minorHAnsi"/><w:bCs/><w:sz w:val="20"/><w:szCs w:val="20"/></w:rPr></w:pPr><w:sdt><w:sdtPr><w:rPr><w:rFonts w:asciiTheme="minorHAnsi" w:hAnsiTheme="minorHAnsi" w:cstheme="minorHAnsi"/><w:bCs/><w:sz w:val="18"/><w:szCs w:val="18"/></w:rPr><w:id w:val="1533384303"/><w14:checkbox><w14:checked w14:val="0"/><w14:checkedState w14:val="2612" w14:font="MS Gothic"/><w14:uncheckedState w14:val="2610" w14:font="MS Gothic"/></w14:checkbox></w:sdtPr><w:sdtEndPr/><w:sdtContent><w:r><w:rPr><w:rFonts w:ascii="MS Gothic" w:eastAsia="MS Gothic" w:hAnsi="MS Gothic" w:cstheme="minorHAnsi" w:hint="eastAsia"/><w:bCs/><w:sz w:val="18"/><w:szCs w:val="18"/></w:rPr><w:t>☐</w:t></w:r></w:sdtContent></w:sdt></w:p></w:tc></w:tr></w:tbl><w:p><w:pPr><w:rPr><w:rFonts w:asciiTheme="minorHAnsi" w:hAnsiTheme="minorHAnsi" w:cstheme="minorHAnsi"/><w:sz w:val="20"/><w:szCs w:val="20"/></w:rPr></w:pPr></w:p><w:p><w:p><w:pPr><w:spacing w:before=0 w:after=300/></w:pPr><w:r><w:rPr><w:b/><w:color w:val=AAAAAA/><w:sz w:val=20/><w:szCs w:val=20/></w:rPr><w:t xml:space=preserve>CHECKLIST_MARKER</w:t></w:r></w:p><w:p><w:pPr><w:rPr><w:rFonts w:asciiTheme="minorHAnsi" w:hAnsiTheme="minorHAnsi" w:cstheme="minorHAnsi"/><w:sz w:val="20"/><w:szCs w:val="20"/></w:rPr></w:pPr></w:p><w:p><w:pPr><w:rPr><w:rFonts w:asciiTheme="minorHAnsi" w:hAnsiTheme="minorHAnsi" w:cstheme="minorHAnsi"/><w:sz w:val="20"/><w:szCs w:val="20"/></w:rPr></w:pPr></w:p><w:p><w:pPr><w:rPr><w:rFonts w:asciiTheme="minorHAnsi" w:hAnsiTheme="minorHAnsi" w:cstheme="minorHAnsi"/><w:sz w:val="20"/><w:szCs w:val="20"/></w:rPr></w:pPr></w:p><w:p><w:pPr><w:rPr><w:rFonts w:asciiTheme="minorHAnsi" w:hAnsiTheme="minorHAnsi" w:cstheme="minorHAnsi"/><w:sz w:val="20"/><w:szCs w:val="20"/></w:rPr></w:pPr></w:p><w:p><w:p><w:pPr><w:spacing w:before=0 w:after=300/></w:pPr><w:r><w:rPr><w:b/><w:color w:val=AAAAAA/><w:sz w:val=20/><w:szCs w:val=20/></w:rPr><w:t xml:space=preserve>RILIEVI_MARKER</w:t></w:r></w:p><w:p><w:pPr><w:rPr><w:rFonts w:asciiTheme="minorHAnsi" w:hAnsiTheme="minorHAnsi" w:cstheme="minorHAnsi"/><w:sz w:val="20"/><w:szCs w:val="20"/></w:rPr></w:pPr></w:p><w:tbl><w:tblPr><w:tblpPr w:leftFromText="141" w:rightFromText="141" w:vertAnchor="text" w:tblpX="-714" w:tblpY="1"/><w:tblOverlap w:val="never"/><w:tblW w:w="11057" w:type="dxa"/><w:tblBorders><w:top w:val="single" w:sz="4" w:space="0" w:color="auto"/><w:left w:val="single" w:sz="4" w:space="0" w:color="auto"/><w:bottom w:val="single" w:sz="4" w:space="0" w:color="auto"/><w:right w:val="single" w:sz="4" w:space="0" w:color="auto"/><w:insideH w:val="single" w:sz="4" w:space="0" w:color="auto"/><w:insideV w:val="single" w:sz="4" w:space="0" w:color="auto"/></w:tblBorders><w:tblLayout w:type="fixed"/><w:tblLook w:val="01E0" w:firstRow="1" w:lastRow="1" w:firstColumn="1" w:lastColumn="1" w:noHBand="0" w:noVBand="0"/></w:tblPr><w:tblGrid><w:gridCol w:w="574"/><w:gridCol w:w="5514"/><w:gridCol w:w="3547"/><w:gridCol w:w="1422"/></w:tblGrid><w:tr><w:trPr><w:trHeight w:val="106"/><w:tblHeader/></w:trPr><w:tc><w:tcPr><w:tcW w:w="574" w:type="dxa"/><w:shd w:val="clear" w:color="auto" w:fill="FFFFFF" w:themeFill="background1"/><w:vAlign w:val="center"/></w:tcPr><w:p><w:pPr><w:tabs><w:tab w:val="left" w:pos="428"/></w:tabs><w:jc w:val="center"/><w:rPr><w:rFonts w:asciiTheme="minorHAnsi" w:hAnsiTheme="minorHAnsi" w:cstheme="minorHAnsi"/><w:b/><w:bCs/><w:sz w:val="20"/><w:szCs w:val="20"/></w:rPr></w:pPr><w:r><w:rPr><w:rFonts w:asciiTheme="minorHAnsi" w:hAnsiTheme="minorHAnsi" w:cstheme="minorHAnsi"/><w:b/><w:bCs/><w:sz w:val="20"/><w:szCs w:val="20"/></w:rPr><w:t>No.</w:t></w:r></w:p></w:tc><w:tc><w:tcPr><w:tcW w:w="5514" w:type="dxa"/><w:shd w:val="clear" w:color="auto" w:fill="FFFFFF" w:themeFill="background1"/><w:vAlign w:val="center"/></w:tcPr><w:p><w:pPr><w:jc w:val="center"/><w:rPr><w:rFonts w:asciiTheme="minorHAnsi" w:hAnsiTheme="minorHAnsi" w:cstheme="minorHAnsi"/><w:b/><w:bCs/><w:sz w:val="20"/><w:szCs w:val="20"/></w:rPr></w:pPr><w:r><w:rPr><w:rFonts w:asciiTheme="minorHAnsi" w:hAnsiTheme="minorHAnsi" w:cstheme="minorHAnsi"/><w:b/><w:bCs/><w:sz w:val="20"/><w:szCs w:val="20"/></w:rPr><w:t>DESCRIPTION</w:t></w:r></w:p></w:tc><w:tc><w:tcPr><w:tcW w:w="3547" w:type="dxa"/><w:shd w:val="clear" w:color="auto" w:fill="FFFFFF" w:themeFill="background1"/><w:vAlign w:val="center"/></w:tcPr><w:p><w:pPr><w:jc w:val="center"/><w:rPr><w:rFonts w:asciiTheme="minorHAnsi" w:hAnsiTheme="minorHAnsi" w:cstheme="minorHAnsi"/><w:b/><w:bCs/><w:sz w:val="20"/><w:szCs w:val="20"/></w:rPr></w:pPr><w:r><w:rPr><w:rFonts w:asciiTheme="minorHAnsi" w:hAnsiTheme="minorHAnsi" w:cstheme="minorHAnsi"/><w:b/><w:bCs/><w:sz w:val="20"/><w:szCs w:val="20"/></w:rPr><w:t>ACTION</w:t></w:r></w:p></w:tc><w:tc><w:tcPr><w:tcW w:w="1422" w:type="dxa"/><w:shd w:val="clear" w:color="auto" w:fill="FFFFFF" w:themeFill="background1"/><w:vAlign w:val="center"/></w:tcPr><w:p><w:pPr><w:jc w:val="center"/><w:rPr><w:rFonts w:asciiTheme="minorHAnsi" w:hAnsiTheme="minorHAnsi" w:cstheme="minorHAnsi"/><w:b/><w:bCs/><w:sz w:val="20"/><w:szCs w:val="20"/></w:rPr></w:pPr><w:r><w:rPr><w:rFonts w:asciiTheme="minorHAnsi" w:hAnsiTheme="minorHAnsi" w:cstheme="minorHAnsi"/><w:b/><w:bCs/><w:sz w:val="20"/><w:szCs w:val="20"/></w:rPr><w:t>CLOSURE</w:t></w:r></w:p><w:p><w:pPr><w:jc w:val="center"/><w:rPr><w:rFonts w:asciiTheme="minorHAnsi" w:hAnsiTheme="minorHAnsi" w:cstheme="minorHAnsi"/><w:b/><w:bCs/><w:sz w:val="20"/><w:szCs w:val="20"/></w:rPr></w:pPr><w:r><w:rPr><w:rFonts w:asciiTheme="minorHAnsi" w:hAnsiTheme="minorHAnsi" w:cstheme="minorHAnsi"/><w:b/><w:bCs/><w:sz w:val="20"/><w:szCs w:val="20"/></w:rPr><w:t>DAT</w:t></w:r><w:r><w:rPr><w:rFonts w:asciiTheme="minorHAnsi" w:hAnsiTheme="minorHAnsi" w:cstheme="minorHAnsi"/><w:b/><w:bCs/><w:sz w:val="20"/><w:szCs w:val="20"/></w:rPr><w:t>E</w:t></w:r></w:p></w:tc></w:tr><w:tr><w:trPr><w:trHeight w:val="567"/></w:trPr><w:tc><w:tcPr><w:tcW w:w="574" w:type="dxa"/><w:tcBorders><w:bottom w:val="single" w:sz="4" w:space="0" w:color="auto"/></w:tcBorders><w:shd w:val="clear" w:color="auto" w:fill="D9D9D9" w:themeFill="background1" w:themeFillShade="D9"/><w:vAlign w:val="center"/></w:tcPr><w:p><w:pPr><w:tabs><w:tab w:val="left" w:pos="428"/></w:tabs><w:jc w:val="center"/><w:rPr><w:rFonts w:asciiTheme="minorHAnsi" w:hAnsiTheme="minorHAnsi" w:cstheme="minorHAnsi"/><w:b/><w:bCs/><w:sz w:val="20"/><w:szCs w:val="20"/></w:rPr></w:pPr><w:r><w:rPr><w:rFonts w:asciiTheme="minorHAnsi" w:hAnsiTheme="minorHAnsi" w:cstheme="minorHAnsi"/><w:b/><w:bCs/><w:sz w:val="20"/><w:szCs w:val="20"/></w:rPr><w:t>1</w:t></w:r><w:r><w:rPr><w:rFonts w:asciiTheme="minorHAnsi" w:hAnsiTheme="minorHAnsi" w:cstheme="minorHAnsi"/><w:b/><w:bCs/><w:sz w:val="20"/><w:szCs w:val="20"/></w:rPr><w:t>.0</w:t></w:r></w:p></w:tc><w:tc><w:tcPr><w:tcW w:w="10483" w:type="dxa"/><w:gridSpan w:val="3"/><w:tcBorders><w:bottom w:val="single" w:sz="4" w:space="0" w:color="auto"/></w:tcBorders><w:shd w:val="clear" w:color="auto" w:fill="D9D9D9" w:themeFill="background1" w:themeFillShade="D9"/><w:vAlign w:val="center"/></w:tcPr><w:p><w:pPr><w:rPr><w:rFonts w:asciiTheme="minorHAnsi" w:hAnsiTheme="minorHAnsi" w:cstheme="minorHAnsi"/><w:b/><w:bCs/><w:sz w:val="20"/><w:szCs w:val="20"/></w:rPr></w:pPr><w:r><w:rPr><w:rFonts w:asciiTheme="minorHAnsi" w:hAnsiTheme="minorHAnsi" w:cstheme="minorHAnsi"/><w:b/><w:bCs/><w:sz w:val="20"/><w:szCs w:val="20"/></w:rPr><w:t>GENERALE</w:t></w:r></w:p></w:tc></w:tr><w:tr><w:trPr><w:trHeight w:val="567"/></w:trPr><w:tc><w:tcPr><w:tcW w:w="574" w:type="dxa"/><w:shd w:val="clear" w:color="auto" w:fill="FFFFFF" w:themeFill="background1"/><w:vAlign w:val="center"/></w:tcPr><w:p><w:pPr><w:tabs><w:tab w:val="left" w:pos="428"/></w:tabs><w:spacing w:before="120" w:after="120"/><w:jc w:val="center"/><w:rPr><w:rFonts w:asciiTheme="minorHAnsi" w:hAnsiTheme="minorHAnsi" w:cstheme="minorHAnsi"/><w:bCs/><w:sz w:val="20"/><w:szCs w:val="20"/></w:rPr></w:pPr><w:r><w:rPr><w:rFonts w:asciiTheme="minorHAnsi" w:hAnsiTheme="minorHAnsi" w:cstheme="minorHAnsi"/><w:bCs/><w:sz w:val="20"/><w:szCs w:val="20"/></w:rPr><w:t>1.1</w:t></w:r></w:p></w:tc><w:tc><w:tcPr><w:tcW w:w="5514" w:type="dxa"/><w:shd w:val="clear" w:color="auto" w:fill="FFFFFF" w:themeFill="background1"/></w:tcPr><w:p><w:pPr><w:tabs><w:tab w:val="left" w:pos="428"/></w:tabs><w:jc w:val="both"/><w:rPr><w:rFonts w:asciiTheme="minorHAnsi" w:hAnsiTheme="minorHAnsi" w:cstheme="minorHAnsi"/><w:bCs/><w:sz w:val="20"/><w:szCs w:val="20"/></w:rPr></w:pPr><w:r><w:rPr><w:rFonts w:asciiTheme="minorHAnsi" w:hAnsiTheme="minorHAnsi" w:cstheme="minorHAnsi"/><w:bCs/><w:sz w:val="20"/><w:szCs w:val="20"/></w:rPr><w:t>Situazione</w:t></w:r></w:p><w:p><w:pPr><w:tabs><w:tab w:val="left" w:pos="428"/></w:tabs><w:jc w:val="both"/><w:rPr><w:rFonts w:asciiTheme="minorHAnsi" w:hAnsiTheme="minorHAnsi" w:cstheme="minorHAnsi"/><w:bCs/><w:sz w:val="20"/><w:szCs w:val="20"/></w:rPr></w:pPr><w:r><w:rPr><w:rFonts w:asciiTheme="minorHAnsi" w:hAnsiTheme="minorHAnsi" w:cstheme="minorHAnsi"/><w:bCs/><w:sz w:val="20"/><w:szCs w:val="20"/></w:rPr><w:t>CHECKLIST_MARKER</w:t></w:r></w:p><w:p><w:pPr><w:tabs><w:tab w:val="left" w:pos="428"/></w:tabs><w:jc w:val="both"/><w:rPr><w:rFonts w:asciiTheme="minorHAnsi" w:hAnsiTheme="minorHAnsi" w:cstheme="minorHAnsi"/><w:bCs/><w:sz w:val="20"/><w:szCs w:val="20"/></w:rPr></w:pPr><w:r><w:rPr><w:rFonts w:asciiTheme="minorHAnsi" w:hAnsiTheme="minorHAnsi" w:cstheme="minorHAnsi"/><w:bCs/><w:sz w:val="20"/><w:szCs w:val="20"/></w:rPr><w:t>RILIEVI_MARKER</w:t></w:r></w:p></w:tc><w:tc><w:tcPr><w:tcW w:w="3547" w:type="dxa"/><w:shd w:val="clear" w:color="auto" w:fill="FFFFFF" w:themeFill="background1"/></w:tcPr><w:p><w:pPr><w:tabs><w:tab w:val="left" w:pos="428"/></w:tabs><w:rPr><w:rFonts w:asciiTheme="minorHAnsi" w:hAnsiTheme="minorHAnsi" w:cstheme="minorHAnsi"/><w:bCs/><w:sz w:val="20"/><w:szCs w:val="20"/></w:rPr></w:pPr></w:p></w:tc><w:tc><w:tcPr><w:tcW w:w="1422" w:type="dxa"/><w:shd w:val="clear" w:color="auto" w:fill="FFFFFF" w:themeFill="background1"/></w:tcPr><w:p><w:pPr><w:tabs><w:tab w:val="left" w:pos="428"/></w:tabs><w:rPr><w:rFonts w:asciiTheme="minorHAnsi" w:hAnsiTheme="minorHAnsi" w:cstheme="minorHAnsi"/><w:bCs/><w:sz w:val="20"/><w:szCs w:val="20"/></w:rPr></w:pPr></w:p></w:tc></w:tr><w:tr><w:trPr><w:trHeight w:val="567"/></w:trPr><w:tc><w:tcPr><w:tcW w:w="574" w:type="dxa"/><w:tcBorders><w:bottom w:val="single" w:sz="4" w:space="0" w:color="auto"/></w:tcBorders><w:shd w:val="clear" w:color="auto" w:fill="D9D9D9" w:themeFill="background1" w:themeFillShade="D9"/><w:vAlign w:val="center"/></w:tcPr><w:p><w:pPr><w:tabs><w:tab w:val="left" w:pos="428"/></w:tabs><w:jc w:val="center"/><w:rPr><w:rFonts w:asciiTheme="minorHAnsi" w:hAnsiTheme="minorHAnsi" w:cstheme="minorHAnsi"/><w:b/><w:bCs/><w:sz w:val="20"/><w:szCs w:val="20"/></w:rPr></w:pPr><w:r><w:rPr><w:rFonts w:asciiTheme="minorHAnsi" w:hAnsiTheme="minorHAnsi" w:cstheme="minorHAnsi"/><w:b/><w:bCs/><w:sz w:val="20"/><w:szCs w:val="20"/></w:rPr><w:t>2.0</w:t></w:r></w:p></w:tc><w:tc><w:tcPr><w:tcW w:w="10483" w:type="dxa"/><w:gridSpan w:val="3"/><w:tcBorders><w:bottom w:val="single" w:sz="4" w:space="0" w:color="auto"/></w:tcBorders><w:shd w:val="clear" w:color="auto" w:fill="D9D9D9" w:themeFill="background1" w:themeFillShade="D9"/><w:vAlign w:val="center"/></w:tcPr><w:p><w:pPr><w:jc w:val="both"/><w:rPr><w:rFonts w:asciiTheme="minorHAnsi" w:hAnsiTheme="minorHAnsi" w:cstheme="minorHAnsi"/><w:b/><w:bCs/><w:sz w:val="20"/><w:szCs w:val="20"/></w:rPr></w:pPr><w:r><w:rPr><w:rFonts w:asciiTheme="minorHAnsi" w:hAnsiTheme="minorHAnsi" w:cstheme="minorHAnsi"/><w:b/><w:bCs/><w:sz w:val="20"/><w:szCs w:val="20"/></w:rPr><w:t>MONTE E ALLUNGHI TAGLI / GESTIONE PRE-SALDATURA</w:t></w:r></w:p></w:tc></w:tr><w:tr><w:trPr><w:trHeight w:val="567"/></w:trPr><w:tc><w:tcPr><w:tcW w:w="574" w:type="dxa"/><w:shd w:val="clear" w:color="auto" w:fill="FFFFFF" w:themeFill="background1"/><w:vAlign w:val="center"/></w:tcPr><w:p><w:pPr><w:tabs><w:tab w:val="left" w:pos="428"/></w:tabs><w:jc w:val="center"/><w:rPr><w:rFonts w:asciiTheme="minorHAnsi" w:hAnsiTheme="minorHAnsi" w:cstheme="minorHAnsi"/><w:bCs/><w:sz w:val="20"/><w:szCs w:val="20"/></w:rPr></w:pPr><w:r><w:rPr><w:rFonts w:asciiTheme="minorHAnsi" w:hAnsiTheme="minorHAnsi" w:cstheme="minorHAnsi"/><w:bCs/><w:sz w:val="20"/><w:szCs w:val="20"/></w:rPr><w:t>2.1</w:t></w:r></w:p></w:tc><w:tc><w:tcPr><w:tcW w:w="5514" w:type="dxa"/><w:shd w:val="clear" w:color="auto" w:fill="FFFFFF" w:themeFill="background1"/></w:tcPr><w:p><w:pPr><w:jc w:val="both"/><w:rPr><w:rFonts w:asciiTheme="minorHAnsi" w:eastAsiaTheme="minorHAnsi" w:hAnsiTheme="minorHAnsi" w:cstheme="minorHAnsi"/><w:i/><w:iCs/><w:sz w:val="18"/><w:szCs w:val="18"/><w:lang w:eastAsia="en-US"/></w:rPr></w:pPr><w:r><w:rPr><w:rFonts w:asciiTheme="minorHAnsi" w:eastAsiaTheme="minorHAnsi" w:hAnsiTheme="minorHAnsi" w:cstheme="minorHAnsi"/><w:b/><w:bCs/><w:sz w:val="20"/><w:szCs w:val="20"/><w:lang w:eastAsia="en-US"/></w:rPr><w:t>Materiale preassemblato</w:t></w:r></w:p></w:tc><w:tc><w:tcPr><w:tcW w:w="3547" w:type="dxa"/><w:shd w:val="clear" w:color="auto" w:fill="FFFFFF" w:themeFill="background1"/></w:tcPr><w:p><w:pPr><w:tabs><w:tab w:val="left" w:pos="428"/></w:tabs><w:rPr><w:rFonts w:asciiTheme="minorHAnsi" w:hAnsiTheme="minorHAnsi" w:cstheme="minorHAnsi"/><w:bCs/><w:sz w:val="20"/><w:szCs w:val="20"/></w:rPr></w:pPr></w:p></w:tc><w:tc><w:tcPr><w:tcW w:w="1422" w:type="dxa"/><w:shd w:val="clear" w:color="auto" w:fill="FFFFFF" w:themeFill="background1"/></w:tcPr><w:p><w:pPr><w:tabs><w:tab w:val="left" w:pos="428"/></w:tabs><w:rPr><w:rFonts w:asciiTheme="minorHAnsi" w:hAnsiTheme="minorHAnsi" w:cstheme="minorHAnsi"/><w:bCs/><w:sz w:val="20"/><w:szCs w:val="20"/></w:rPr></w:pPr></w:p></w:tc></w:tr><w:tr><w:trPr><w:trHeight w:val="567"/></w:trPr><w:tc><w:tcPr><w:tcW w:w="574" w:type="dxa"/><w:tcBorders><w:bottom w:val="single" w:sz="4" w:space="0" w:color="auto"/></w:tcBorders><w:shd w:val="clear" w:color="auto" w:fill="D9D9D9" w:themeFill="background1" w:themeFillShade="D9"/><w:vAlign w:val="center"/></w:tcPr><w:p><w:pPr><w:tabs><w:tab w:val="left" w:pos="428"/></w:tabs><w:jc w:val="center"/><w:rPr><w:rFonts w:asciiTheme="minorHAnsi" w:hAnsiTheme="minorHAnsi" w:cstheme="minorHAnsi"/><w:b/><w:bCs/><w:sz w:val="20"/><w:szCs w:val="20"/></w:rPr></w:pPr><w:bookmarkStart w:id="0" w:name="_Hlk166185970"/><w:bookmarkStart w:id="1" w:name="_Hlk89160537"/><w:r><w:rPr><w:rFonts w:asciiTheme="minorHAnsi" w:hAnsiTheme="minorHAnsi" w:cstheme="minorHAnsi"/><w:b/><w:bCs/><w:sz w:val="20"/><w:szCs w:val="20"/></w:rPr><w:t>3</w:t></w:r><w:r><w:rPr><w:rFonts w:asciiTheme="minorHAnsi" w:hAnsiTheme="minorHAnsi" w:cstheme="minorHAnsi"/><w:b/><w:bCs/><w:sz w:val="20"/><w:szCs w:val="20"/></w:rPr><w:t>.0</w:t></w:r></w:p></w:tc><w:tc><w:tcPr><w:tcW w:w="10483" w:type="dxa"/><w:gridSpan w:val="3"/><w:tcBorders><w:bottom w:val="single" w:sz="4" w:space="0" w:color="auto"/></w:tcBorders><w:shd w:val="clear" w:color="auto" w:fill="D9D9D9" w:themeFill="background1" w:themeFillShade="D9"/><w:vAlign w:val="center"/></w:tcPr><w:p><w:pPr><w:jc w:val="both"/><w:rPr><w:rFonts w:asciiTheme="minorHAnsi" w:hAnsiTheme="minorHAnsi" w:cstheme="minorBidi"/><w:b/><w:sz w:val="20"/><w:szCs w:val="20"/></w:rPr></w:pPr><w:r><w:rPr><w:rFonts w:asciiTheme="minorHAnsi" w:hAnsiTheme="minorHAnsi" w:cstheme="minorBidi"/><w:b/><w:bCs/><w:sz w:val="20"/><w:szCs w:val="20"/></w:rPr><w:t>GESTIONE DEL MAGAZZINO E TAGLIO</w:t></w:r></w:p></w:tc></w:tr><w:bookmarkEnd w:id="0"/><w:tr><w:trPr><w:trHeight w:val="567"/></w:trPr><w:tc><w:tcPr><w:tcW w:w="574" w:type="dxa"/><w:shd w:val="clear" w:color="auto" w:fill="FFFFFF" w:themeFill="background1"/><w:vAlign w:val="center"/></w:tcPr><w:p><w:pPr><w:tabs><w:tab w:val="left" w:pos="428"/></w:tabs><w:spacing w:before="120" w:after="120"/><w:jc w:val="center"/><w:rPr><w:rFonts w:asciiTheme="minorHAnsi" w:hAnsiTheme="minorHAnsi" w:cstheme="minorHAnsi"/><w:sz w:val="20"/><w:szCs w:val="20"/></w:rPr></w:pPr><w:r><w:rPr><w:rFonts w:asciiTheme="minorHAnsi" w:hAnsiTheme="minorHAnsi" w:cstheme="minorHAnsi"/><w:sz w:val="20"/><w:szCs w:val="20"/></w:rPr><w:t>3.1</w:t></w:r></w:p></w:tc><w:tc><w:tcPr><w:tcW w:w="5514" w:type="dxa"/><w:shd w:val="clear" w:color="auto" w:fill="FFFFFF" w:themeFill="background1"/></w:tcPr><w:p><w:pPr><w:tabs><w:tab w:val="left" w:pos="4527"/></w:tabs><w:jc w:val="both"/><w:rPr><w:rFonts w:asciiTheme="minorHAnsi" w:hAnsiTheme="minorHAnsi" w:cstheme="minorHAnsi"/><w:b/><w:bCs/><w:sz w:val="20"/><w:szCs w:val="20"/></w:rPr></w:pPr><w:r><w:rPr><w:rFonts w:asciiTheme="minorHAnsi" w:hAnsiTheme="minorHAnsi" w:cstheme="minorHAnsi"/><w:b/><w:bCs/><w:sz w:val="20"/><w:szCs w:val="20"/></w:rPr><w:t xml:space="preserve">Materiale base per </w:t></w:r><w:r><w:rPr><w:rFonts w:asciiTheme="minorHAnsi" w:hAnsiTheme="minorHAnsi" w:cstheme="minorHAnsi"/><w:b/><w:bCs/><w:sz w:val="20"/><w:szCs w:val="20"/></w:rPr><w:t>ciclo LG, LH, LI, LJ e LK:</w:t></w:r></w:p></w:tc><w:tc><w:tcPr><w:tcW w:w="3547" w:type="dxa"/><w:shd w:val="clear" w:color="auto" w:fill="FFFFFF" w:themeFill="background1"/></w:tcPr><w:p><w:pPr><w:tabs><w:tab w:val="left" w:pos="428"/></w:tabs><w:rPr><w:rFonts w:asciiTheme="minorHAnsi" w:hAnsiTheme="minorHAnsi" w:cstheme="minorHAnsi"/><w:bCs/><w:color w:val="FF0000"/><w:sz w:val="20"/><w:szCs w:val="20"/></w:rPr></w:pPr></w:p></w:tc><w:tc><w:tcPr><w:tcW w:w="1422" w:type="dxa"/><w:shd w:val="clear" w:color="auto" w:fill="FFFFFF" w:themeFill="background1"/></w:tcPr><w:p><w:pPr><w:rPr><w:rFonts w:asciiTheme="minorHAnsi" w:hAnsiTheme="minorHAnsi" w:cstheme="minorBidi"/><w:color w:val="FF0000"/><w:sz w:val="20"/><w:szCs w:val="20"/></w:rPr></w:pPr></w:p></w:tc></w:tr><w:tr><w:trPr><w:trHeight w:val="624"/></w:trPr><w:tc><w:tcPr><w:tcW w:w="574" w:type="dxa"/><w:shd w:val="clear" w:color="auto" w:fill="FFFFFF" w:themeFill="background1"/><w:vAlign w:val="center"/></w:tcPr><w:p><w:pPr><w:tabs><w:tab w:val="left" w:pos="428"/></w:tabs><w:spacing w:before="120" w:after="120"/><w:jc w:val="center"/><w:rPr><w:rFonts w:asciiTheme="minorHAnsi" w:hAnsiTheme="minorHAnsi" w:cstheme="minorHAnsi"/><w:sz w:val="20"/><w:szCs w:val="20"/></w:rPr></w:pPr><w:r><w:rPr><w:rFonts w:asciiTheme="minorHAnsi" w:hAnsiTheme="minorHAnsi" w:cstheme="minorHAnsi"/><w:sz w:val="20"/><w:szCs w:val="20"/></w:rPr><w:t>3.2</w:t></w:r></w:p></w:tc><w:tc><w:tcPr><w:tcW w:w="5514" w:type="dxa"/><w:shd w:val="clear" w:color="auto" w:fill="FFFFFF" w:themeFill="background1"/></w:tcPr><w:p><w:pPr><w:tabs><w:tab w:val="left" w:pos="4527"/></w:tabs><w:jc w:val="both"/><w:rPr><w:rFonts w:asciiTheme="minorHAnsi" w:hAnsiTheme="minorHAnsi" w:cstheme="minorHAnsi"/><w:b/><w:bCs/><w:sz w:val="20"/><w:szCs w:val="20"/></w:rPr></w:pPr><w:r><w:rPr><w:rFonts w:asciiTheme="minorHAnsi" w:hAnsiTheme="minorHAnsi" w:cstheme="minorHAnsi"/><w:b/><w:bCs/><w:sz w:val="20"/><w:szCs w:val="20"/></w:rPr><w:t>STEEL PREPARATION</w:t></w:r></w:p></w:tc><w:tc><w:tcPr><w:tcW w:w="3547" w:type="dxa"/><w:shd w:val="clear" w:color="auto" w:fill="FFFFFF" w:themeFill="background1"/></w:tcPr><w:p><w:pPr><w:rPr><w:rFonts w:asciiTheme="minorHAnsi" w:hAnsiTheme="minorHAnsi" w:cstheme="minorHAnsi"/><w:sz w:val="20"/><w:szCs w:val="20"/></w:rPr></w:pPr></w:p></w:tc><w:tc><w:tcPr><w:tcW w:w="1422" w:type="dxa"/><w:shd w:val="clear" w:color="auto" w:fill="FFFFFF" w:themeFill="background1"/></w:tcPr><w:p><w:pPr><w:rPr><w:rFonts w:asciiTheme="minorHAnsi" w:hAnsiTheme="minorHAnsi" w:cstheme="minorBidi"/><w:sz w:val="20"/><w:szCs w:val="20"/></w:rPr></w:pPr></w:p></w:tc></w:tr><w:tr><w:trPr><w:trHeight w:val="548"/></w:trPr><w:tc><w:tcPr><w:tcW w:w="574" w:type="dxa"/><w:tcBorders><w:bottom w:val="single" w:sz="4" w:space="0" w:color="auto"/></w:tcBorders><w:shd w:val="clear" w:color="auto" w:fill="D9D9D9" w:themeFill="background1" w:themeFillShade="D9"/><w:vAlign w:val="center"/></w:tcPr><w:p><w:pPr><w:tabs><w:tab w:val="left" w:pos="428"/></w:tabs><w:jc w:val="center"/><w:rPr><w:rFonts w:asciiTheme="minorHAnsi" w:hAnsiTheme="minorHAnsi" w:cstheme="minorHAnsi"/><w:b/><w:bCs/><w:sz w:val="20"/><w:szCs w:val="20"/></w:rPr></w:pPr><w:r><w:rPr><w:rFonts w:asciiTheme="minorHAnsi" w:hAnsiTheme="minorHAnsi" w:cstheme="minorHAnsi"/><w:b/><w:bCs/><w:sz w:val="20"/><w:szCs w:val="20"/></w:rPr><w:t>4</w:t></w:r><w:r><w:rPr><w:rFonts w:asciiTheme="minorHAnsi" w:hAnsiTheme="minorHAnsi" w:cstheme="minorHAnsi"/><w:b/><w:bCs/><w:sz w:val="20"/><w:szCs w:val="20"/></w:rPr><w:t>.0</w:t></w:r></w:p></w:tc><w:tc><w:tcPr><w:tcW w:w="10483" w:type="dxa"/><w:gridSpan w:val="3"/><w:tcBorders><w:bottom w:val="single" w:sz="4" w:space="0" w:color="auto"/></w:tcBorders><w:shd w:val="clear" w:color="auto" w:fill="D9D9D9" w:themeFill="background1" w:themeFillShade="D9"/><w:vAlign w:val="center"/></w:tcPr><w:p><w:pPr><w:jc w:val="both"/><w:rPr><w:rFonts w:asciiTheme="minorHAnsi" w:hAnsiTheme="minorHAnsi" w:cstheme="minorBidi"/><w:b/><w:sz w:val="20"/><w:szCs w:val="20"/></w:rPr></w:pPr><w:r><w:rPr><w:rFonts w:asciiTheme="minorHAnsi" w:hAnsiTheme="minorHAnsi" w:cstheme="minorBidi"/><w:b/><w:bCs/><w:sz w:val="20"/><w:szCs w:val="20"/></w:rPr><w:t>ASSEMBLAGGIO, SALDATURA, SABBIATURA E VERNICIATURA</w:t></w:r></w:p></w:tc></w:tr><w:tr><w:trPr><w:trHeight w:val="567"/></w:trPr><w:tc><w:tcPr><w:tcW w:w="574" w:type="dxa"/><w:shd w:val="clear" w:color="auto" w:fill="FFFFFF" w:themeFill="background1"/><w:vAlign w:val="center"/></w:tcPr><w:p><w:pPr><w:tabs><w:tab w:val="left" w:pos="428"/></w:tabs><w:spacing w:before="120" w:after="120"/><w:jc w:val="center"/><w:rPr><w:rFonts w:asciiTheme="minorHAnsi" w:hAnsiTheme="minorHAnsi" w:cstheme="minorHAnsi"/><w:bCs/><w:sz w:val="20"/><w:szCs w:val="20"/></w:rPr></w:pPr><w:r><w:rPr><w:rFonts w:asciiTheme="minorHAnsi" w:hAnsiTheme="minorHAnsi" w:cstheme="minorHAnsi"/><w:sz w:val="20"/><w:szCs w:val="20"/></w:rPr><w:t>4</w:t></w:r><w:r><w:rPr><w:rFonts w:asciiTheme="minorHAnsi" w:hAnsiTheme="minorHAnsi" w:cstheme="minorHAnsi"/><w:sz w:val="20"/><w:szCs w:val="20"/></w:rPr><w:t>.</w:t></w:r><w:r><w:rPr><w:rFonts w:asciiTheme="minorHAnsi" w:hAnsiTheme="minorHAnsi" w:cstheme="minorHAnsi"/><w:sz w:val="20"/><w:szCs w:val="20"/></w:rPr><w:t>1</w:t></w:r></w:p></w:tc><w:tc><w:tcPr><w:tcW w:w="5514" w:type="dxa"/><w:shd w:val="clear" w:color="auto" w:fill="FFFFFF" w:themeFill="background1"/></w:tcPr><w:p><w:pPr><w:jc w:val="both"/><w:rPr><w:rFonts w:asciiTheme="minorHAnsi" w:hAnsiTheme="minorHAnsi" w:cstheme="minorHAnsi"/><w:bCs/><w:noProof/><w:sz w:val="20"/><w:szCs w:val="20"/></w:rPr></w:pPr><w:r><w:rPr><w:rFonts w:asciiTheme="minorHAnsi" w:hAnsiTheme="minorHAnsi" w:cstheme="minorHAnsi"/><w:b/><w:noProof/><w:sz w:val="20"/><w:szCs w:val="20"/></w:rPr><w:t>ASSEMBLAGGIO E SALDATURA:</w:t></w:r></w:p></w:tc><w:tc><w:tcPr><w:tcW w:w="3547" w:type="dxa"/><w:shd w:val="clear" w:color="auto" w:fill="FFFFFF" w:themeFill="background1"/></w:tcPr><w:p><w:pPr><w:rPr><w:rFonts w:asciiTheme="minorHAnsi" w:hAnsiTheme="minorHAnsi" w:cstheme="minorHAnsi"/><w:sz w:val="20"/><w:szCs w:val="20"/></w:rPr></w:pPr></w:p></w:tc><w:tc><w:tcPr><w:tcW w:w="1422" w:type="dxa"/><w:shd w:val="clear" w:color="auto" w:fill="FFFFFF" w:themeFill="background1"/></w:tcPr><w:p><w:pPr><w:rPr><w:rFonts w:asciiTheme="minorHAnsi" w:hAnsiTheme="minorHAnsi" w:cstheme="minorBidi"/><w:sz w:val="20"/><w:szCs w:val="20"/></w:rPr></w:pPr></w:p></w:tc></w:tr><w:tr><w:trPr><w:trHeight w:val="60"/></w:trPr><w:tc><w:tcPr><w:tcW w:w="574" w:type="dxa"/><w:shd w:val="clear" w:color="auto" w:fill="FFFFFF" w:themeFill="background1"/><w:vAlign w:val="center"/></w:tcPr><w:p><w:pPr><w:tabs><w:tab w:val="left" w:pos="428"/></w:tabs><w:spacing w:before="120" w:after="120"/><w:jc w:val="center"/><w:rPr><w:rFonts w:asciiTheme="minorHAnsi" w:hAnsiTheme="minorHAnsi" w:cstheme="minorHAnsi"/><w:bCs/><w:sz w:val="20"/><w:szCs w:val="20"/></w:rPr></w:pPr><w:r><w:rPr><w:rFonts w:asciiTheme="minorHAnsi" w:hAnsiTheme="minorHAnsi" w:cstheme="minorHAnsi"/><w:bCs/><w:sz w:val="20"/><w:szCs w:val="20"/></w:rPr><w:t>4.2</w:t></w:r></w:p></w:tc><w:tc><w:tcPr><w:tcW w:w="5514" w:type="dxa"/><w:shd w:val="clear" w:color="auto" w:fill="FFFFFF" w:themeFill="background1"/></w:tcPr><w:p><w:pPr><w:jc w:val="both"/><w:rPr><w:rFonts w:asciiTheme="minorHAnsi" w:hAnsiTheme="minorHAnsi" w:cstheme="minorHAnsi"/><w:b/><w:sz w:val="20"/><w:szCs w:val="20"/></w:rPr></w:pPr><w:r><w:rPr><w:rFonts w:asciiTheme="minorHAnsi" w:hAnsiTheme="minorHAnsi" w:cstheme="minorHAnsi"/><w:b/><w:sz w:val="20"/><w:szCs w:val="20"/></w:rPr><w:t>SABBIATURA:</w:t></w:r></w:p></w:tc><w:tc><w:tcPr><w:tcW w:w="3547" w:type="dxa"/><w:shd w:val="clear" w:color="auto" w:fill="FFFFFF" w:themeFill="background1"/></w:tcPr><w:p><w:pPr><w:rPr><w:rFonts w:asciiTheme="minorHAnsi" w:hAnsiTheme="minorHAnsi" w:cstheme="minorHAnsi"/><w:bCs/><w:sz w:val="20"/><w:szCs w:val="20"/><w:lang w:val="en-GB"/></w:rPr></w:pPr></w:p></w:tc><w:tc><w:tcPr><w:tcW w:w="1422" w:type="dxa"/><w:shd w:val="clear" w:color="auto" w:fill="FFFFFF" w:themeFill="background1"/></w:tcPr><w:p><w:pPr><w:tabs><w:tab w:val="left" w:pos="428"/></w:tabs><w:rPr><w:rFonts w:asciiTheme="minorHAnsi" w:hAnsiTheme="minorHAnsi" w:cstheme="minorHAnsi"/><w:bCs/><w:sz w:val="20"/><w:szCs w:val="20"/><w:lang w:val="en-GB"/></w:rPr></w:pPr></w:p></w:tc></w:tr><w:tr><w:trPr><w:trHeight w:val="567"/></w:trPr><w:tc><w:tcPr><w:tcW w:w="574" w:type="dxa"/><w:shd w:val="clear" w:color="auto" w:fill="FFFFFF" w:themeFill="background1"/><w:vAlign w:val="center"/></w:tcPr><w:p><w:pPr><w:tabs><w:tab w:val="left" w:pos="428"/></w:tabs><w:spacing w:before="120" w:after="120"/><w:jc w:val="center"/><w:rPr><w:rFonts w:asciiTheme="minorHAnsi" w:hAnsiTheme="minorHAnsi" w:cstheme="minorHAnsi"/><w:bCs/><w:sz w:val="20"/><w:szCs w:val="20"/></w:rPr></w:pPr><w:r><w:rPr><w:rFonts w:asciiTheme="minorHAnsi" w:hAnsiTheme="minorHAnsi" w:cstheme="minorHAnsi"/><w:bCs/><w:sz w:val="20"/><w:szCs w:val="20"/></w:rPr><w:t>4.3</w:t></w:r></w:p></w:tc><w:tc><w:tcPr><w:tcW w:w="5514" w:type="dxa"/><w:shd w:val="clear" w:color="auto" w:fill="FFFFFF" w:themeFill="background1"/></w:tcPr><w:p><w:pPr><w:jc w:val="both"/><w:rPr><w:rFonts w:asciiTheme="minorHAnsi" w:hAnsiTheme="minorHAnsi" w:cstheme="minorHAnsi"/><w:b/><w:sz w:val="20"/><w:szCs w:val="20"/></w:rPr></w:pPr><w:r><w:rPr><w:rFonts w:asciiTheme="minorHAnsi" w:hAnsiTheme="minorHAnsi" w:cstheme="minorHAnsi"/><w:b/><w:sz w:val="20"/><w:szCs w:val="20"/></w:rPr><w:t>VERNICIATURA:</w:t></w:r></w:p></w:tc><w:tc><w:tcPr><w:tcW w:w="3547" w:type="dxa"/><w:shd w:val="clear" w:color="auto" w:fill="FFFFFF" w:themeFill="background1"/></w:tcPr><w:p><w:pPr><w:rPr><w:rFonts w:asciiTheme="minorHAnsi" w:hAnsiTheme="minorHAnsi" w:cstheme="minorHAnsi"/><w:bCs/><w:sz w:val="20"/><w:szCs w:val="20"/></w:rPr></w:pPr></w:p></w:tc><w:tc><w:tcPr><w:tcW w:w="1422" w:type="dxa"/><w:shd w:val="clear" w:color="auto" w:fill="FFFFFF" w:themeFill="background1"/></w:tcPr><w:p><w:pPr><w:tabs><w:tab w:val="left" w:pos="428"/></w:tabs><w:rPr><w:rFonts w:asciiTheme="minorHAnsi" w:hAnsiTheme="minorHAnsi" w:cstheme="minorHAnsi"/><w:bCs/><w:sz w:val="20"/><w:szCs w:val="20"/></w:rPr></w:pPr></w:p></w:tc></w:tr><w:tr><w:trPr><w:trHeight w:val="60"/></w:trPr><w:tc><w:tcPr><w:tcW w:w="574" w:type="dxa"/><w:shd w:val="clear" w:color="auto" w:fill="FFFFFF" w:themeFill="background1"/><w:vAlign w:val="center"/></w:tcPr><w:p><w:pPr><w:tabs><w:tab w:val="left" w:pos="428"/></w:tabs><w:spacing w:before="120" w:after="120"/><w:jc w:val="center"/><w:rPr><w:rFonts w:asciiTheme="minorHAnsi" w:hAnsiTheme="minorHAnsi" w:cstheme="minorHAnsi"/><w:bCs/><w:sz w:val="20"/><w:szCs w:val="20"/></w:rPr></w:pPr><w:r><w:rPr><w:rFonts w:asciiTheme="minorHAnsi" w:hAnsiTheme="minorHAnsi" w:cstheme="minorHAnsi"/><w:bCs/><w:sz w:val="20"/><w:szCs w:val="20"/></w:rPr><w:t>4.4</w:t></w:r></w:p></w:tc><w:tc><w:tcPr><w:tcW w:w="5514" w:type="dxa"/><w:shd w:val="clear" w:color="auto" w:fill="FFFFFF" w:themeFill="background1"/></w:tcPr><w:p><w:pPr><w:jc w:val="both"/><w:rPr><w:rFonts w:asciiTheme="minorHAnsi" w:hAnsiTheme="minorHAnsi" w:cstheme="minorHAnsi"/><w:b/><w:sz w:val="20"/><w:szCs w:val="20"/></w:rPr></w:pPr><w:r><w:rPr><w:rFonts w:asciiTheme="minorHAnsi" w:hAnsiTheme="minorHAnsi" w:cstheme="minorHAnsi"/><w:b/><w:sz w:val="20"/><w:szCs w:val="20"/></w:rPr><w:t>CONTROLLO DIMENSIONALE:</w:t></w:r></w:p></w:tc><w:tc><w:tcPr><w:tcW w:w="3547" w:type="dxa"/><w:shd w:val="clear" w:color="auto" w:fill="FFFFFF" w:themeFill="background1"/></w:tcPr><w:p><w:pPr><w:rPr><w:rFonts w:asciiTheme="minorHAnsi" w:hAnsiTheme="minorHAnsi" w:cstheme="minorHAnsi"/><w:sz w:val="20"/><w:szCs w:val="20"/></w:rPr></w:pPr></w:p></w:tc><w:tc><w:tcPr><w:tcW w:w="1422" w:type="dxa"/><w:shd w:val="clear" w:color="auto" w:fill="FFFFFF" w:themeFill="background1"/></w:tcPr><w:p><w:pPr><w:tabs><w:tab w:val="left" w:pos="428"/></w:tabs><w:rPr><w:rFonts w:asciiTheme="minorHAnsi" w:hAnsiTheme="minorHAnsi" w:cstheme="minorHAnsi"/><w:bCs/><w:sz w:val="20"/><w:szCs w:val="20"/></w:rPr></w:pPr></w:p></w:tc></w:tr><w:tr><w:trPr><w:trHeight w:val="567"/></w:trPr><w:tc><w:tcPr><w:tcW w:w="574" w:type="dxa"/><w:shd w:val="clear" w:color="auto" w:fill="FFFFFF" w:themeFill="background1"/><w:vAlign w:val="center"/></w:tcPr><w:p><w:pPr><w:tabs><w:tab w:val="left" w:pos="428"/></w:tabs><w:spacing w:before="120" w:after="120"/><w:jc w:val="center"/><w:rPr><w:rFonts w:asciiTheme="minorHAnsi" w:hAnsiTheme="minorHAnsi" w:cstheme="minorHAnsi"/><w:bCs/><w:sz w:val="20"/><w:szCs w:val="20"/></w:rPr></w:pPr><w:r><w:rPr><w:rFonts w:asciiTheme="minorHAnsi" w:hAnsiTheme="minorHAnsi" w:cstheme="minorHAnsi"/><w:bCs/><w:sz w:val="20"/><w:szCs w:val="20"/></w:rPr><w:t>4.5</w:t></w:r></w:p></w:tc><w:tc><w:tcPr><w:tcW w:w="5514" w:type="dxa"/><w:shd w:val="clear" w:color="auto" w:fill="FFFFFF" w:themeFill="background1"/></w:tcPr><w:p><w:pPr><w:pStyle w:val="Default"/><w:rPr><w:rFonts w:asciiTheme="minorHAnsi" w:hAnsiTheme="minorHAnsi" w:cstheme="minorHAnsi"/><w:b/><w:color w:val="auto"/><w:sz w:val="20"/><w:szCs w:val="20"/></w:rPr></w:pPr><w:r><w:rPr><w:rFonts w:asciiTheme="minorHAnsi" w:hAnsiTheme="minorHAnsi" w:cstheme="minorHAnsi"/><w:b/><w:color w:val="auto"/><w:sz w:val="20"/><w:szCs w:val="20"/></w:rPr><w:t>MARCATURA:</w:t></w:r></w:p></w:tc><w:tc><w:tcPr><w:tcW w:w="3547" w:type="dxa"/><w:shd w:val="clear" w:color="auto" w:fill="FFFFFF" w:themeFill="background1"/></w:tcPr><w:p><w:pPr><w:rPr><w:rFonts w:asciiTheme="minorHAnsi" w:hAnsiTheme="minorHAnsi" w:cstheme="minorHAnsi"/><w:sz w:val="20"/><w:szCs w:val="20"/></w:rPr></w:pPr></w:p></w:tc><w:tc><w:tcPr><w:tcW w:w="1422" w:type="dxa"/><w:shd w:val="clear" w:color="auto" w:fill="FFFFFF" w:themeFill="background1"/></w:tcPr><w:p><w:pPr><w:tabs><w:tab w:val="left" w:pos="428"/></w:tabs><w:rPr><w:rFonts w:asciiTheme="minorHAnsi" w:hAnsiTheme="minorHAnsi" w:cstheme="minorHAnsi"/><w:bCs/><w:sz w:val="20"/><w:szCs w:val="20"/></w:rPr></w:pPr></w:p></w:tc></w:tr><w:tr><w:trPr><w:trHeight w:val="567"/></w:trPr><w:tc><w:tcPr><w:tcW w:w="574" w:type="dxa"/><w:shd w:val="clear" w:color="auto" w:fill="FFFFFF" w:themeFill="background1"/><w:vAlign w:val="center"/></w:tcPr><w:p><w:pPr><w:tabs><w:tab w:val="left" w:pos="428"/></w:tabs><w:spacing w:before="120" w:after="120"/><w:jc w:val="center"/><w:rPr><w:rFonts w:asciiTheme="minorHAnsi" w:hAnsiTheme="minorHAnsi" w:cstheme="minorHAnsi"/><w:bCs/><w:sz w:val="20"/><w:szCs w:val="20"/></w:rPr></w:pPr><w:r><w:rPr><w:rFonts w:asciiTheme="minorHAnsi" w:hAnsiTheme="minorHAnsi" w:cstheme="minorHAnsi"/><w:bCs/><w:sz w:val="20"/><w:szCs w:val="20"/></w:rPr><w:t>4.6</w:t></w:r></w:p></w:tc><w:tc><w:tcPr><w:tcW w:w="5514" w:type="dxa"/><w:shd w:val="clear" w:color="auto" w:fill="FFFFFF" w:themeFill="background1"/></w:tcPr><w:p><w:pPr><w:rPr><w:rFonts w:asciiTheme="minorHAnsi" w:hAnsiTheme="minorHAnsi" w:cstheme="minorHAnsi"/><w:b/><w:sz w:val="20"/><w:szCs w:val="20"/></w:rPr></w:pPr><w:r><w:rPr><w:rFonts w:asciiTheme="minorHAnsi" w:hAnsiTheme="minorHAnsi" w:cstheme="minorHAnsi"/><w:b/><w:sz w:val="20"/><w:szCs w:val="20"/></w:rPr><w:t>MATERIALE D’APPORTO:</w:t></w:r></w:p></w:tc><w:tc><w:tcPr><w:tcW w:w="3547" w:type="dxa"/><w:shd w:val="clear" w:color="auto" w:fill="FFFFFF" w:themeFill="background1"/></w:tcPr><w:p><w:pPr><w:rPr><w:rFonts w:asciiTheme="minorHAnsi" w:hAnsiTheme="minorHAnsi" w:cstheme="minorHAnsi"/><w:bCs/><w:sz w:val="20"/><w:szCs w:val="20"/></w:rPr></w:pPr></w:p></w:tc><w:tc><w:tcPr><w:tcW w:w="1422" w:type="dxa"/><w:shd w:val="clear" w:color="auto" w:fill="FFFFFF" w:themeFill="background1"/></w:tcPr><w:p><w:pPr><w:tabs><w:tab w:val="left" w:pos="428"/></w:tabs><w:rPr><w:rFonts w:asciiTheme="minorHAnsi" w:hAnsiTheme="minorHAnsi" w:cstheme="minorHAnsi"/><w:bCs/><w:sz w:val="20"/><w:szCs w:val="20"/></w:rPr></w:pPr></w:p></w:tc></w:tr><w:tr><w:trPr><w:trHeight w:val="567"/></w:trPr><w:tc><w:tcPr><w:tcW w:w="574" w:type="dxa"/><w:tcBorders><w:bottom w:val="single" w:sz="4" w:space="0" w:color="auto"/></w:tcBorders><w:shd w:val="clear" w:color="auto" w:fill="D9D9D9" w:themeFill="background1" w:themeFillShade="D9"/><w:vAlign w:val="center"/></w:tcPr><w:p><w:pPr><w:tabs><w:tab w:val="left" w:pos="428"/></w:tabs><w:jc w:val="center"/><w:rPr><w:rFonts w:asciiTheme="minorHAnsi" w:hAnsiTheme="minorHAnsi" w:cstheme="minorHAnsi"/><w:b/><w:bCs/><w:sz w:val="20"/><w:szCs w:val="20"/></w:rPr></w:pPr><w:r><w:rPr><w:rFonts w:asciiTheme="minorHAnsi" w:hAnsiTheme="minorHAnsi" w:cstheme="minorHAnsi"/><w:b/><w:bCs/><w:sz w:val="20"/><w:szCs w:val="20"/></w:rPr><w:t>5</w:t></w:r><w:r><w:rPr><w:rFonts w:asciiTheme="minorHAnsi" w:hAnsiTheme="minorHAnsi" w:cstheme="minorHAnsi"/><w:b/><w:bCs/><w:sz w:val="20"/><w:szCs w:val="20"/></w:rPr><w:t>.0</w:t></w:r></w:p></w:tc><w:tc><w:tcPr><w:tcW w:w="10483" w:type="dxa"/><w:gridSpan w:val="3"/><w:tcBorders><w:bottom w:val="single" w:sz="4" w:space="0" w:color="auto"/></w:tcBorders><w:shd w:val="clear" w:color="auto" w:fill="D9D9D9" w:themeFill="background1" w:themeFillShade="D9"/><w:vAlign w:val="center"/></w:tcPr><w:p><w:pPr><w:jc w:val="both"/><w:rPr><w:rFonts w:asciiTheme="minorHAnsi" w:hAnsiTheme="minorHAnsi" w:cstheme="minorBidi"/><w:b/><w:sz w:val="20"/><w:szCs w:val="20"/></w:rPr></w:pPr><w:r><w:rPr><w:rFonts w:asciiTheme="minorHAnsi" w:hAnsiTheme="minorHAnsi" w:cstheme="minorBidi"/><w:b/><w:bCs/><w:sz w:val="20"/><w:szCs w:val="20"/></w:rPr><w:t>STOCCAGGIO ELEMENTI STRUTTURALI PRONTI PER LA SPEDIZIONE</w:t></w:r></w:p></w:tc></w:tr><w:tr><w:trPr><w:trHeight w:val="567"/></w:trPr><w:tc><w:tcPr><w:tcW w:w="574" w:type="dxa"/><w:shd w:val="clear" w:color="auto" w:fill="FFFFFF" w:themeFill="background1"/><w:vAlign w:val="center"/></w:tcPr><w:p><w:pPr><w:tabs><w:tab w:val="left" w:pos="428"/></w:tabs><w:spacing w:before="120" w:after="120"/><w:jc w:val="center"/><w:rPr><w:rFonts w:asciiTheme="minorHAnsi" w:hAnsiTheme="minorHAnsi" w:cstheme="minorHAnsi"/><w:bCs/><w:sz w:val="20"/><w:szCs w:val="20"/></w:rPr></w:pPr><w:r><w:rPr><w:rFonts w:asciiTheme="minorHAnsi" w:hAnsiTheme="minorHAnsi" w:cstheme="minorHAnsi"/><w:sz w:val="20"/><w:szCs w:val="20"/></w:rPr><w:t>5</w:t></w:r><w:r><w:rPr><w:rFonts w:asciiTheme="minorHAnsi" w:hAnsiTheme="minorHAnsi" w:cstheme="minorHAnsi"/><w:sz w:val="20"/><w:szCs w:val="20"/></w:rPr><w:t>.1</w:t></w:r></w:p></w:tc><w:tc><w:tcPr><w:tcW w:w="5514" w:type="dxa"/><w:shd w:val="clear" w:color="auto" w:fill="FFFFFF" w:themeFill="background1"/></w:tcPr><w:p><w:pPr><w:rPr><w:rFonts w:asciiTheme="minorHAnsi" w:hAnsiTheme="minorHAnsi" w:cstheme="minorHAnsi"/><w:b/><w:sz w:val="20"/><w:szCs w:val="20"/></w:rPr></w:pPr></w:p></w:tc><w:tc><w:tcPr><w:tcW w:w="3547" w:type="dxa"/><w:shd w:val="clear" w:color="auto" w:fill="FFFFFF" w:themeFill="background1"/></w:tcPr><w:p><w:pPr><w:tabs><w:tab w:val="left" w:pos="428"/></w:tabs><w:jc w:val="both"/><w:rPr><w:rFonts w:asciiTheme="minorHAnsi" w:hAnsiTheme="minorHAnsi" w:cstheme="minorHAnsi"/><w:b/><w:color w:val="FF0000"/><w:sz w:val="20"/><w:szCs w:val="20"/></w:rPr></w:pPr></w:p></w:tc><w:tc><w:tcPr><w:tcW w:w="1422" w:type="dxa"/><w:shd w:val="clear" w:color="auto" w:fill="FFFFFF" w:themeFill="background1"/></w:tcPr><w:p><w:pPr><w:tabs><w:tab w:val="left" w:pos="428"/></w:tabs><w:jc w:val="both"/><w:rPr><w:rFonts w:asciiTheme="minorHAnsi" w:hAnsiTheme="minorHAnsi" w:cstheme="minorBidi"/><w:b/><w:color w:val="FF0000"/><w:sz w:val="20"/><w:szCs w:val="20"/></w:rPr></w:pPr></w:p></w:tc></w:tr><w:bookmarkEnd w:id="1"/></w:tbl><w:p><w:pPr><w:tabs><w:tab w:val="left" w:pos="7440"/></w:tabs><w:rPr><w:rFonts w:asciiTheme="minorHAnsi" w:hAnsiTheme="minorHAnsi" w:cstheme="minorHAnsi"/><w:sz w:val="20"/><w:szCs w:val="20"/></w:rPr></w:pPr></w:p><w:sectPr><w:headerReference w:type="even" r:id="rId11"/><w:headerReference w:type="default" r:id="rId12"/><w:footerReference w:type="even" r:id="rId13"/><w:footerReference w:type="default" r:id="rId14"/><w:headerReference w:type="first" r:id="rId15"/><w:footerReference w:type="first" r:id="rId16"/><w:pgSz w:w="11906" w:h="16838" w:code="9"/><w:pgMar w:top="284" w:right="284" w:bottom="567" w:left="1134" w:header="567" w:footer="113" w:gutter="0"/><w:cols w:space="708"/><w:docGrid w:linePitch="360"/></w:sectPr></w:body></w:document>
+<file path=word/document.xml><?xml version="1.0" encoding="utf-8"?>
+<w:document xmlns:wpc="http://schemas.microsoft.com/office/word/2010/wordprocessingCanvas" xmlns:cx="http://schemas.microsoft.com/office/drawing/2014/chartex" xmlns:cx1="http://schemas.microsoft.com/office/drawing/2015/9/8/chartex" xmlns:cx2="http://schemas.microsoft.com/office/drawing/2015/10/21/chartex" xmlns:cx3="http://schemas.microsoft.com/office/drawing/2016/5/9/chartex" xmlns:cx4="http://schemas.microsoft.com/office/drawing/2016/5/10/chartex" xmlns:cx5="http://schemas.microsoft.com/office/drawing/2016/5/11/chartex" xmlns:cx6="http://schemas.microsoft.com/office/drawing/2016/5/12/chartex" xmlns:cx7="http://schemas.microsoft.com/office/drawing/2016/5/13/chartex" xmlns:cx8="http://schemas.microsoft.com/office/drawing/2016/5/14/chartex" xmlns:mc="http://schemas.openxmlformats.org/markup-compatibility/2006" xmlns:aink="http://schemas.microsoft.com/office/drawing/2016/ink" xmlns:am3d="http://schemas.microsoft.com/office/drawing/2017/model3d" xmlns:o="urn:schemas-microsoft-com:office:office" xmlns:oel="http://schemas.microsoft.com/office/2019/extlst" xmlns:r="http://schemas.openxmlformats.org/officeDocument/2006/relationships" xmlns:m="http://schemas.openxmlformats.org/officeDocument/2006/math" xmlns:v="urn:schemas-microsoft-com:vml" xmlns:wp14="http://schemas.microsoft.com/office/word/2010/wordprocessingDrawing" xmlns:wp="http://schemas.openxmlformats.org/drawingml/2006/wordprocessingDrawing" xmlns:w10="urn:schemas-microsoft-com:office:word" xmlns:w="http://schemas.openxmlformats.org/wordprocessingml/2006/main" xmlns:w14="http://schemas.microsoft.com/office/word/2010/wordml" xmlns:w15="http://schemas.microsoft.com/office/word/2012/wordml" xmlns:w16cex="http://schemas.microsoft.com/office/word/2018/wordml/cex" xmlns:w16cid="http://schemas.microsoft.com/office/word/2016/wordml/cid" xmlns:w16="http://schemas.microsoft.com/office/word/2018/wordml" xmlns:w16du="http://schemas.microsoft.com/office/word/2023/wordml/word16du" xmlns:w16sdtdh="http://schemas.microsoft.com/office/word/2020/wordml/sdtdatahash" xmlns:w16sdtfl="http://schemas.microsoft.com/office/word/2024/wordml/sdtformatlock" xmlns:w16se="http://schemas.microsoft.com/office/word/2015/wordml/symex" xmlns:wpg="http://schemas.microsoft.com/office/word/2010/wordprocessingGroup" xmlns:wpi="http://schemas.microsoft.com/office/word/2010/wordprocessingInk" xmlns:wne="http://schemas.microsoft.com/office/word/2006/wordml" xmlns:wps="http://schemas.microsoft.com/office/word/2010/wordprocessingShape" mc:Ignorable="w14 w15 w16se w16cid w16 w16cex w16sdtdh w16sdtfl w16du wp14">
+  <w:body>
+    <w:tbl>
+      <w:tblPr>
+        <w:tblW w:w="11057" w:type="dxa"/>
+        <w:tblInd w:w="-714" w:type="dxa"/>
+        <w:tblBorders>
+          <w:top w:val="single" w:sz="4" w:space="0" w:color="auto"/>
+          <w:left w:val="single" w:sz="4" w:space="0" w:color="auto"/>
+          <w:bottom w:val="single" w:sz="4" w:space="0" w:color="auto"/>
+          <w:right w:val="single" w:sz="4" w:space="0" w:color="auto"/>
+          <w:insideH w:val="single" w:sz="4" w:space="0" w:color="auto"/>
+          <w:insideV w:val="single" w:sz="4" w:space="0" w:color="auto"/>
+        </w:tblBorders>
+        <w:tblLook w:val="01E0" w:firstRow="1" w:lastRow="1" w:firstColumn="1" w:lastColumn="1" w:noHBand="0" w:noVBand="0"/>
+      </w:tblPr>
+      <w:tblGrid>
+        <w:gridCol w:w="2378"/>
+        <w:gridCol w:w="1765"/>
+        <w:gridCol w:w="1764"/>
+        <w:gridCol w:w="1765"/>
+        <w:gridCol w:w="1826"/>
+        <w:gridCol w:w="1559"/>
+      </w:tblGrid>
+      <w:tr>
+        <w:trPr>
+          <w:trHeight w:val="336"/>
+          <w:tblHeader/>
+        </w:trPr>
+        <w:tc>
+          <w:tcPr>
+            <w:tcW w:w="11057" w:type="dxa"/>
+            <w:gridSpan w:val="6"/>
+            <w:shd w:val="clear" w:color="auto" w:fill="D9D9D9" w:themeFill="background1" w:themeFillShade="D9"/>
+            <w:vAlign w:val="center"/>
+          </w:tcPr>
+          <w:p>
+            <w:pPr>
+              <w:spacing w:line="240" w:lineRule="exact"/>
+              <w:jc w:val="center"/>
+              <w:rPr>
+                <w:rFonts w:asciiTheme="minorHAnsi" w:hAnsiTheme="minorHAnsi" w:cstheme="minorHAnsi"/>
+                <w:b/>
+                <w:bCs/>
+                <w:sz w:val="20"/>
+                <w:szCs w:val="20"/>
+              </w:rPr>
+            </w:pPr>
+            <w:proofErr w:type="gramStart"/>
+            <w:r>
+              <w:rPr>
+                <w:rFonts w:asciiTheme="minorHAnsi" w:hAnsiTheme="minorHAnsi" w:cstheme="minorHAnsi"/>
+                <w:b/>
+                <w:bCs/>
+                <w:sz w:val="20"/>
+                <w:szCs w:val="20"/>
+              </w:rPr>
+              <w:t>MEETING</w:t>
+            </w:r>
+            <w:proofErr w:type="gramEnd"/>
+            <w:r>
+              <w:rPr>
+                <w:rFonts w:asciiTheme="minorHAnsi" w:hAnsiTheme="minorHAnsi" w:cstheme="minorHAnsi"/>
+                <w:b/>
+                <w:bCs/>
+                <w:sz w:val="20"/>
+                <w:szCs w:val="20"/>
+              </w:rPr>
+              <w:t xml:space="preserve"> PRESENCE</w:t>
+            </w:r>
+          </w:p>
+        </w:tc>
+      </w:tr>
+      <w:tr>
+        <w:trPr>
+          <w:trHeight w:val="336"/>
+          <w:tblHeader/>
+        </w:trPr>
+        <w:tc>
+          <w:tcPr>
+            <w:tcW w:w="2378" w:type="dxa"/>
+            <w:shd w:val="clear" w:color="auto" w:fill="D9D9D9" w:themeFill="background1" w:themeFillShade="D9"/>
+            <w:vAlign w:val="center"/>
+          </w:tcPr>
+          <w:p>
+            <w:pPr>
+              <w:spacing w:line="240" w:lineRule="exact"/>
+              <w:jc w:val="right"/>
+              <w:rPr>
+                <w:rFonts w:asciiTheme="minorHAnsi" w:hAnsiTheme="minorHAnsi" w:cstheme="minorHAnsi"/>
+                <w:b/>
+                <w:bCs/>
+                <w:sz w:val="20"/>
+                <w:szCs w:val="20"/>
+              </w:rPr>
+            </w:pPr>
+            <w:r>
+              <w:rPr>
+                <w:rFonts w:asciiTheme="minorHAnsi" w:hAnsiTheme="minorHAnsi" w:cstheme="minorHAnsi"/>
+                <w:b/>
+                <w:bCs/>
+                <w:sz w:val="20"/>
+                <w:szCs w:val="20"/>
+              </w:rPr>
+              <w:t>PLACE:</w:t>
+            </w:r>
+          </w:p>
+        </w:tc>
+        <w:tc>
+          <w:tcPr>
+            <w:tcW w:w="3529" w:type="dxa"/>
+            <w:gridSpan w:val="2"/>
+            <w:shd w:val="clear" w:color="auto" w:fill="D9D9D9" w:themeFill="background1" w:themeFillShade="D9"/>
+            <w:vAlign w:val="center"/>
+          </w:tcPr>
+          <w:p>
+            <w:pPr>
+              <w:spacing w:line="240" w:lineRule="exact"/>
+              <w:rPr>
+                <w:rFonts w:asciiTheme="minorHAnsi" w:hAnsiTheme="minorHAnsi" w:cstheme="minorHAnsi"/>
+                <w:b/>
+                <w:bCs/>
+                <w:sz w:val="20"/>
+                <w:szCs w:val="20"/>
+              </w:rPr>
+            </w:pPr>
+            <w:r>
+              <w:rPr>
+                <w:rFonts w:asciiTheme="minorHAnsi" w:hAnsiTheme="minorHAnsi" w:cstheme="minorHAnsi"/>
+                <w:sz w:val="20"/>
+                <w:szCs w:val="20"/>
+              </w:rPr>
+              <w:t xml:space="preserve">STABILIMENTO </w:t>
+            </w:r>
+            <w:r>
+              <w:rPr>
+                <w:rFonts w:asciiTheme="minorHAnsi" w:hAnsiTheme="minorHAnsi" w:cstheme="minorHAnsi"/>
+                <w:sz w:val="20"/>
+                <w:szCs w:val="20"/>
+              </w:rPr>
+              <w:t>OFF.MA</w:t>
+            </w:r>
+          </w:p>
+        </w:tc>
+        <w:tc>
+          <w:tcPr>
+            <w:tcW w:w="1765" w:type="dxa"/>
+            <w:shd w:val="clear" w:color="auto" w:fill="D9D9D9" w:themeFill="background1" w:themeFillShade="D9"/>
+            <w:vAlign w:val="center"/>
+          </w:tcPr>
+          <w:p>
+            <w:pPr>
+              <w:spacing w:line="240" w:lineRule="exact"/>
+              <w:jc w:val="right"/>
+              <w:rPr>
+                <w:rFonts w:asciiTheme="minorHAnsi" w:hAnsiTheme="minorHAnsi" w:cstheme="minorHAnsi"/>
+                <w:sz w:val="20"/>
+                <w:szCs w:val="20"/>
+              </w:rPr>
+            </w:pPr>
+            <w:r>
+              <w:rPr>
+                <w:rFonts w:asciiTheme="minorHAnsi" w:hAnsiTheme="minorHAnsi" w:cstheme="minorHAnsi"/>
+                <w:b/>
+                <w:bCs/>
+                <w:sz w:val="20"/>
+                <w:szCs w:val="20"/>
+              </w:rPr>
+              <w:t>DATE:</w:t>
+            </w:r>
+          </w:p>
+        </w:tc>
+        <w:tc>
+          <w:tcPr>
+            <w:tcW w:w="3385" w:type="dxa"/>
+            <w:gridSpan w:val="2"/>
+            <w:shd w:val="clear" w:color="auto" w:fill="D9D9D9" w:themeFill="background1" w:themeFillShade="D9"/>
+            <w:vAlign w:val="center"/>
+          </w:tcPr>
+          <w:p>
+            <w:pPr>
+              <w:spacing w:line="240" w:lineRule="exact"/>
+              <w:rPr>
+                <w:rFonts w:asciiTheme="minorHAnsi" w:hAnsiTheme="minorHAnsi" w:cstheme="minorHAnsi"/>
+                <w:sz w:val="20"/>
+                <w:szCs w:val="20"/>
+              </w:rPr>
+            </w:pPr>
+            <w:r>
+              <w:rPr>
+                <w:rFonts w:asciiTheme="minorHAnsi" w:hAnsiTheme="minorHAnsi" w:cstheme="minorHAnsi"/>
+                <w:sz w:val="20"/>
+                <w:szCs w:val="20"/>
+              </w:rPr>
+              <w:t>25</w:t>
+            </w:r>
+            <w:r>
+              <w:rPr>
+                <w:rFonts w:asciiTheme="minorHAnsi" w:hAnsiTheme="minorHAnsi" w:cstheme="minorHAnsi"/>
+                <w:sz w:val="20"/>
+                <w:szCs w:val="20"/>
+              </w:rPr>
+              <w:t>/</w:t>
+            </w:r>
+            <w:r>
+              <w:rPr>
+                <w:rFonts w:asciiTheme="minorHAnsi" w:hAnsiTheme="minorHAnsi" w:cstheme="minorHAnsi"/>
+                <w:sz w:val="20"/>
+                <w:szCs w:val="20"/>
+              </w:rPr>
+              <w:t>0</w:t>
+            </w:r>
+            <w:r>
+              <w:rPr>
+                <w:rFonts w:asciiTheme="minorHAnsi" w:hAnsiTheme="minorHAnsi" w:cstheme="minorHAnsi"/>
+                <w:sz w:val="20"/>
+                <w:szCs w:val="20"/>
+              </w:rPr>
+              <w:t>2</w:t>
+            </w:r>
+            <w:r>
+              <w:rPr>
+                <w:rFonts w:asciiTheme="minorHAnsi" w:hAnsiTheme="minorHAnsi" w:cstheme="minorHAnsi"/>
+                <w:sz w:val="20"/>
+                <w:szCs w:val="20"/>
+              </w:rPr>
+              <w:t>/202</w:t>
+            </w:r>
+            <w:r>
+              <w:rPr>
+                <w:rFonts w:asciiTheme="minorHAnsi" w:hAnsiTheme="minorHAnsi" w:cstheme="minorHAnsi"/>
+                <w:sz w:val="20"/>
+                <w:szCs w:val="20"/>
+              </w:rPr>
+              <w:t>6</w:t>
+            </w:r>
+          </w:p>
+        </w:tc>
+      </w:tr>
+      <w:tr>
+        <w:trPr>
+          <w:trHeight w:val="569"/>
+        </w:trPr>
+        <w:tc>
+          <w:tcPr>
+            <w:tcW w:w="2378" w:type="dxa"/>
+            <w:vAlign w:val="center"/>
+          </w:tcPr>
+          <w:p>
+            <w:pPr>
+              <w:jc w:val="right"/>
+              <w:rPr>
+                <w:rFonts w:asciiTheme="minorHAnsi" w:hAnsiTheme="minorHAnsi" w:cstheme="minorHAnsi"/>
+                <w:bCs/>
+                <w:sz w:val="20"/>
+                <w:szCs w:val="20"/>
+              </w:rPr>
+            </w:pPr>
+            <w:r>
+              <w:rPr>
+                <w:rFonts w:asciiTheme="minorHAnsi" w:hAnsiTheme="minorHAnsi" w:cstheme="minorHAnsi"/>
+                <w:b/>
+                <w:bCs/>
+                <w:sz w:val="20"/>
+                <w:szCs w:val="20"/>
+              </w:rPr>
+              <w:t>F</w:t>
+            </w:r>
+            <w:r>
+              <w:rPr>
+                <w:rFonts w:asciiTheme="minorHAnsi" w:hAnsiTheme="minorHAnsi" w:cstheme="minorHAnsi"/>
+                <w:b/>
+                <w:bCs/>
+                <w:sz w:val="20"/>
+                <w:szCs w:val="20"/>
+              </w:rPr>
+              <w:t>incantieri Infrastructure</w:t>
+            </w:r>
+          </w:p>
+        </w:tc>
+        <w:tc>
+          <w:tcPr>
+            <w:tcW w:w="1765" w:type="dxa"/>
+            <w:vAlign w:val="center"/>
+          </w:tcPr>
+          <w:p>
+            <w:pPr>
+              <w:rPr>
+                <w:rFonts w:asciiTheme="minorHAnsi" w:hAnsiTheme="minorHAnsi" w:cstheme="minorHAnsi"/>
+                <w:bCs/>
+                <w:sz w:val="20"/>
+                <w:szCs w:val="20"/>
+              </w:rPr>
+            </w:pPr>
+            <w:sdt>
+              <w:sdtPr>
+                <w:rPr>
+                  <w:rFonts w:asciiTheme="minorHAnsi" w:hAnsiTheme="minorHAnsi" w:cstheme="minorHAnsi"/>
+                  <w:bCs/>
+                  <w:sz w:val="18"/>
+                  <w:szCs w:val="18"/>
+                </w:rPr>
+                <w:id w:val="4723411"/>
+                <w14:checkbox>
+                  <w14:checked w14:val="0"/>
+                  <w14:checkedState w14:val="2612" w14:font="MS Gothic"/>
+                  <w14:uncheckedState w14:val="2610" w14:font="MS Gothic"/>
+                </w14:checkbox>
+              </w:sdtPr>
+              <w:sdtEndPr/>
+              <w:sdtContent>
+                <w:r>
+                  <w:rPr>
+                    <w:rFonts w:ascii="MS Gothic" w:eastAsia="MS Gothic" w:hAnsi="MS Gothic" w:cstheme="minorHAnsi" w:hint="eastAsia"/>
+                    <w:bCs/>
+                    <w:sz w:val="18"/>
+                    <w:szCs w:val="18"/>
+                  </w:rPr>
+                  <w:t>☐</w:t>
+                </w:r>
+              </w:sdtContent>
+            </w:sdt>
+            <w:r>
+              <w:rPr>
+                <w:rFonts w:asciiTheme="minorHAnsi" w:hAnsiTheme="minorHAnsi" w:cstheme="minorHAnsi"/>
+                <w:bCs/>
+                <w:sz w:val="18"/>
+                <w:szCs w:val="18"/>
+              </w:rPr>
+              <w:t xml:space="preserve">   </w:t>
+            </w:r>
+            <w:r>
+              <w:rPr>
+                <w:rFonts w:asciiTheme="minorHAnsi" w:hAnsiTheme="minorHAnsi" w:cstheme="minorHAnsi"/>
+                <w:bCs/>
+                <w:sz w:val="18"/>
+                <w:szCs w:val="18"/>
+              </w:rPr>
+              <w:t>A. Mason</w:t>
+            </w:r>
+          </w:p>
+        </w:tc>
+        <w:tc>
+          <w:tcPr>
+            <w:tcW w:w="1764" w:type="dxa"/>
+            <w:vAlign w:val="center"/>
+          </w:tcPr>
+          <w:p>
+            <w:pPr>
+              <w:rPr>
+                <w:rFonts w:asciiTheme="minorHAnsi" w:hAnsiTheme="minorHAnsi" w:cstheme="minorHAnsi"/>
+                <w:bCs/>
+                <w:sz w:val="20"/>
+                <w:szCs w:val="20"/>
+              </w:rPr>
+            </w:pPr>
+            <w:sdt>
+              <w:sdtPr>
+                <w:rPr>
+                  <w:rFonts w:asciiTheme="minorHAnsi" w:hAnsiTheme="minorHAnsi" w:cstheme="minorHAnsi"/>
+                  <w:bCs/>
+                  <w:sz w:val="18"/>
+                  <w:szCs w:val="18"/>
+                </w:rPr>
+                <w:id w:val="1703285428"/>
+                <w14:checkbox>
+                  <w14:checked w14:val="1"/>
+                  <w14:checkedState w14:val="2612" w14:font="MS Gothic"/>
+                  <w14:uncheckedState w14:val="2610" w14:font="MS Gothic"/>
+                </w14:checkbox>
+              </w:sdtPr>
+              <w:sdtEndPr/>
+              <w:sdtContent>
+                <w:r>
+                  <w:rPr>
+                    <w:rFonts w:ascii="MS Gothic" w:eastAsia="MS Gothic" w:hAnsi="MS Gothic" w:cstheme="minorHAnsi" w:hint="eastAsia"/>
+                    <w:bCs/>
+                    <w:sz w:val="18"/>
+                    <w:szCs w:val="18"/>
+                  </w:rPr>
+                  <w:t>☒</w:t>
+                </w:r>
+              </w:sdtContent>
+            </w:sdt>
+            <w:r>
+              <w:rPr>
+                <w:rFonts w:asciiTheme="minorHAnsi" w:hAnsiTheme="minorHAnsi" w:cstheme="minorHAnsi"/>
+                <w:bCs/>
+                <w:sz w:val="18"/>
+                <w:szCs w:val="18"/>
+              </w:rPr>
+              <w:t xml:space="preserve">   </w:t>
+            </w:r>
+            <w:r>
+              <w:rPr>
+                <w:rFonts w:asciiTheme="minorHAnsi" w:eastAsia="MS Gothic" w:hAnsiTheme="minorHAnsi" w:cstheme="minorHAnsi"/>
+                <w:bCs/>
+                <w:sz w:val="18"/>
+                <w:szCs w:val="18"/>
+              </w:rPr>
+              <w:t>M. Melotto</w:t>
+            </w:r>
+          </w:p>
+        </w:tc>
+        <w:tc>
+          <w:tcPr>
+            <w:tcW w:w="1765" w:type="dxa"/>
+            <w:vAlign w:val="center"/>
+          </w:tcPr>
+          <w:p>
+            <w:pPr>
+              <w:rPr>
+                <w:rFonts w:asciiTheme="minorHAnsi" w:hAnsiTheme="minorHAnsi" w:cstheme="minorHAnsi"/>
+                <w:bCs/>
+                <w:sz w:val="20"/>
+                <w:szCs w:val="20"/>
+              </w:rPr>
+            </w:pPr>
+            <w:sdt>
+              <w:sdtPr>
+                <w:rPr>
+                  <w:rFonts w:asciiTheme="minorHAnsi" w:hAnsiTheme="minorHAnsi" w:cstheme="minorHAnsi"/>
+                  <w:bCs/>
+                  <w:sz w:val="18"/>
+                  <w:szCs w:val="18"/>
+                </w:rPr>
+                <w:id w:val="-1009988275"/>
+                <w14:checkbox>
+                  <w14:checked w14:val="0"/>
+                  <w14:checkedState w14:val="2612" w14:font="MS Gothic"/>
+                  <w14:uncheckedState w14:val="2610" w14:font="MS Gothic"/>
+                </w14:checkbox>
+              </w:sdtPr>
+              <w:sdtEndPr/>
+              <w:sdtContent>
+                <w:r>
+                  <w:rPr>
+                    <w:rFonts w:ascii="MS Gothic" w:eastAsia="MS Gothic" w:hAnsi="MS Gothic" w:cstheme="minorHAnsi" w:hint="eastAsia"/>
+                    <w:bCs/>
+                    <w:sz w:val="18"/>
+                    <w:szCs w:val="18"/>
+                  </w:rPr>
+                  <w:t>☐</w:t>
+                </w:r>
+              </w:sdtContent>
+            </w:sdt>
+            <w:r>
+              <w:rPr>
+                <w:rFonts w:asciiTheme="minorHAnsi" w:hAnsiTheme="minorHAnsi" w:cstheme="minorHAnsi"/>
+                <w:bCs/>
+                <w:sz w:val="18"/>
+                <w:szCs w:val="18"/>
+              </w:rPr>
+              <w:t xml:space="preserve">   </w:t>
+            </w:r>
+          </w:p>
+        </w:tc>
+        <w:tc>
+          <w:tcPr>
+            <w:tcW w:w="1826" w:type="dxa"/>
+            <w:vAlign w:val="center"/>
+          </w:tcPr>
+          <w:p>
+            <w:pPr>
+              <w:rPr>
+                <w:rFonts w:asciiTheme="minorHAnsi" w:hAnsiTheme="minorHAnsi" w:cstheme="minorHAnsi"/>
+                <w:bCs/>
+                <w:sz w:val="20"/>
+                <w:szCs w:val="20"/>
+              </w:rPr>
+            </w:pPr>
+            <w:sdt>
+              <w:sdtPr>
+                <w:rPr>
+                  <w:rFonts w:asciiTheme="minorHAnsi" w:hAnsiTheme="minorHAnsi" w:cstheme="minorHAnsi"/>
+                  <w:bCs/>
+                  <w:sz w:val="18"/>
+                  <w:szCs w:val="18"/>
+                </w:rPr>
+                <w:id w:val="-640884296"/>
+                <w14:checkbox>
+                  <w14:checked w14:val="0"/>
+                  <w14:checkedState w14:val="2612" w14:font="MS Gothic"/>
+                  <w14:uncheckedState w14:val="2610" w14:font="MS Gothic"/>
+                </w14:checkbox>
+              </w:sdtPr>
+              <w:sdtEndPr/>
+              <w:sdtContent>
+                <w:r>
+                  <w:rPr>
+                    <w:rFonts w:ascii="MS Gothic" w:eastAsia="MS Gothic" w:hAnsi="MS Gothic" w:cstheme="minorHAnsi" w:hint="eastAsia"/>
+                    <w:bCs/>
+                    <w:sz w:val="18"/>
+                    <w:szCs w:val="18"/>
+                  </w:rPr>
+                  <w:t>☐</w:t>
+                </w:r>
+              </w:sdtContent>
+            </w:sdt>
+            <w:r>
+              <w:rPr>
+                <w:rFonts w:asciiTheme="minorHAnsi" w:hAnsiTheme="minorHAnsi" w:cstheme="minorHAnsi"/>
+                <w:bCs/>
+                <w:sz w:val="18"/>
+                <w:szCs w:val="18"/>
+              </w:rPr>
+              <w:t xml:space="preserve">   </w:t>
+            </w:r>
+          </w:p>
+        </w:tc>
+        <w:tc>
+          <w:tcPr>
+            <w:tcW w:w="1559" w:type="dxa"/>
+            <w:vAlign w:val="center"/>
+          </w:tcPr>
+          <w:p>
+            <w:pPr>
+              <w:rPr>
+                <w:rFonts w:asciiTheme="minorHAnsi" w:hAnsiTheme="minorHAnsi" w:cstheme="minorHAnsi"/>
+                <w:bCs/>
+                <w:sz w:val="20"/>
+                <w:szCs w:val="20"/>
+              </w:rPr>
+            </w:pPr>
+            <w:sdt>
+              <w:sdtPr>
+                <w:rPr>
+                  <w:rFonts w:asciiTheme="minorHAnsi" w:eastAsia="MS Gothic" w:hAnsiTheme="minorHAnsi" w:cstheme="minorHAnsi"/>
+                  <w:bCs/>
+                  <w:sz w:val="18"/>
+                  <w:szCs w:val="18"/>
+                </w:rPr>
+                <w:id w:val="-1037889580"/>
+                <w14:checkbox>
+                  <w14:checked w14:val="0"/>
+                  <w14:checkedState w14:val="2612" w14:font="MS Gothic"/>
+                  <w14:uncheckedState w14:val="2610" w14:font="MS Gothic"/>
+                </w14:checkbox>
+              </w:sdtPr>
+              <w:sdtEndPr/>
+              <w:sdtContent>
+                <w:r>
+                  <w:rPr>
+                    <w:rFonts w:ascii="MS Gothic" w:eastAsia="MS Gothic" w:hAnsi="MS Gothic" w:cstheme="minorHAnsi" w:hint="eastAsia"/>
+                    <w:bCs/>
+                    <w:sz w:val="18"/>
+                    <w:szCs w:val="18"/>
+                  </w:rPr>
+                  <w:t>☐</w:t>
+                </w:r>
+              </w:sdtContent>
+            </w:sdt>
+          </w:p>
+        </w:tc>
+      </w:tr>
+      <w:tr>
+        <w:trPr>
+          <w:trHeight w:val="565"/>
+        </w:trPr>
+        <w:tc>
+          <w:tcPr>
+            <w:tcW w:w="2378" w:type="dxa"/>
+            <w:vAlign w:val="center"/>
+          </w:tcPr>
+          <w:p>
+            <w:pPr>
+              <w:jc w:val="right"/>
+              <w:rPr>
+                <w:rFonts w:asciiTheme="minorHAnsi" w:hAnsiTheme="minorHAnsi" w:cstheme="minorHAnsi"/>
+                <w:bCs/>
+                <w:sz w:val="20"/>
+                <w:szCs w:val="20"/>
+              </w:rPr>
+            </w:pPr>
+            <w:r>
+              <w:rPr>
+                <w:rFonts w:asciiTheme="minorHAnsi" w:hAnsiTheme="minorHAnsi" w:cstheme="minorHAnsi"/>
+                <w:b/>
+                <w:bCs/>
+                <w:sz w:val="20"/>
+                <w:szCs w:val="20"/>
+              </w:rPr>
+              <w:t>Off.ma S.p.A.</w:t>
+            </w:r>
+          </w:p>
+        </w:tc>
+        <w:tc>
+          <w:tcPr>
+            <w:tcW w:w="1765" w:type="dxa"/>
+            <w:vAlign w:val="center"/>
+          </w:tcPr>
+          <w:p>
+            <w:pPr>
+              <w:rPr>
+                <w:rFonts w:asciiTheme="minorHAnsi" w:hAnsiTheme="minorHAnsi" w:cstheme="minorHAnsi"/>
+                <w:bCs/>
+                <w:sz w:val="20"/>
+                <w:szCs w:val="20"/>
+              </w:rPr>
+            </w:pPr>
+            <w:sdt>
+              <w:sdtPr>
+                <w:rPr>
+                  <w:rFonts w:asciiTheme="minorHAnsi" w:hAnsiTheme="minorHAnsi" w:cstheme="minorHAnsi"/>
+                  <w:bCs/>
+                  <w:sz w:val="18"/>
+                  <w:szCs w:val="18"/>
+                </w:rPr>
+                <w:id w:val="1629122076"/>
+                <w14:checkbox>
+                  <w14:checked w14:val="1"/>
+                  <w14:checkedState w14:val="2612" w14:font="MS Gothic"/>
+                  <w14:uncheckedState w14:val="2610" w14:font="MS Gothic"/>
+                </w14:checkbox>
+              </w:sdtPr>
+              <w:sdtEndPr/>
+              <w:sdtContent>
+                <w:r>
+                  <w:rPr>
+                    <w:rFonts w:ascii="MS Gothic" w:eastAsia="MS Gothic" w:hAnsi="MS Gothic" w:cstheme="minorHAnsi" w:hint="eastAsia"/>
+                    <w:bCs/>
+                    <w:sz w:val="18"/>
+                    <w:szCs w:val="18"/>
+                  </w:rPr>
+                  <w:t>☒</w:t>
+                </w:r>
+              </w:sdtContent>
+            </w:sdt>
+            <w:r>
+              <w:rPr>
+                <w:rFonts w:asciiTheme="minorHAnsi" w:hAnsiTheme="minorHAnsi" w:cstheme="minorHAnsi"/>
+                <w:bCs/>
+                <w:sz w:val="18"/>
+                <w:szCs w:val="18"/>
+              </w:rPr>
+              <w:t xml:space="preserve">   </w:t>
+            </w:r>
+            <w:r>
+              <w:rPr>
+                <w:rFonts w:asciiTheme="minorHAnsi" w:hAnsiTheme="minorHAnsi" w:cstheme="minorHAnsi"/>
+                <w:bCs/>
+                <w:sz w:val="18"/>
+                <w:szCs w:val="18"/>
+              </w:rPr>
+              <w:t>S. Zadro</w:t>
+            </w:r>
+          </w:p>
+        </w:tc>
+        <w:tc>
+          <w:tcPr>
+            <w:tcW w:w="1764" w:type="dxa"/>
+            <w:vAlign w:val="center"/>
+          </w:tcPr>
+          <w:p>
+            <w:pPr>
+              <w:rPr>
+                <w:rFonts w:asciiTheme="minorHAnsi" w:hAnsiTheme="minorHAnsi" w:cstheme="minorHAnsi"/>
+                <w:bCs/>
+                <w:sz w:val="20"/>
+                <w:szCs w:val="20"/>
+              </w:rPr>
+            </w:pPr>
+            <w:sdt>
+              <w:sdtPr>
+                <w:rPr>
+                  <w:rFonts w:asciiTheme="minorHAnsi" w:hAnsiTheme="minorHAnsi" w:cstheme="minorHAnsi"/>
+                  <w:bCs/>
+                  <w:sz w:val="18"/>
+                  <w:szCs w:val="18"/>
+                </w:rPr>
+                <w:id w:val="881442262"/>
+                <w14:checkbox>
+                  <w14:checked w14:val="1"/>
+                  <w14:checkedState w14:val="2612" w14:font="MS Gothic"/>
+                  <w14:uncheckedState w14:val="2610" w14:font="MS Gothic"/>
+                </w14:checkbox>
+              </w:sdtPr>
+              <w:sdtEndPr/>
+              <w:sdtContent>
+                <w:r>
+                  <w:rPr>
+                    <w:rFonts w:ascii="MS Gothic" w:eastAsia="MS Gothic" w:hAnsi="MS Gothic" w:cstheme="minorHAnsi" w:hint="eastAsia"/>
+                    <w:bCs/>
+                    <w:sz w:val="18"/>
+                    <w:szCs w:val="18"/>
+                  </w:rPr>
+                  <w:t>☒</w:t>
+                </w:r>
+              </w:sdtContent>
+            </w:sdt>
+            <w:r>
+              <w:rPr>
+                <w:rFonts w:asciiTheme="minorHAnsi" w:hAnsiTheme="minorHAnsi" w:cstheme="minorHAnsi"/>
+                <w:bCs/>
+                <w:sz w:val="18"/>
+                <w:szCs w:val="18"/>
+              </w:rPr>
+              <w:t xml:space="preserve">   </w:t>
+            </w:r>
+            <w:r>
+              <w:rPr>
+                <w:rFonts w:asciiTheme="minorHAnsi" w:hAnsiTheme="minorHAnsi" w:cstheme="minorHAnsi"/>
+                <w:bCs/>
+                <w:sz w:val="18"/>
+                <w:szCs w:val="18"/>
+              </w:rPr>
+              <w:t>E. Boccalon</w:t>
+            </w:r>
+          </w:p>
+        </w:tc>
+        <w:tc>
+          <w:tcPr>
+            <w:tcW w:w="1765" w:type="dxa"/>
+            <w:vAlign w:val="center"/>
+          </w:tcPr>
+          <w:p>
+            <w:pPr>
+              <w:rPr>
+                <w:rFonts w:asciiTheme="minorHAnsi" w:hAnsiTheme="minorHAnsi" w:cstheme="minorHAnsi"/>
+                <w:bCs/>
+                <w:sz w:val="20"/>
+                <w:szCs w:val="20"/>
+              </w:rPr>
+            </w:pPr>
+            <w:sdt>
+              <w:sdtPr>
+                <w:rPr>
+                  <w:rFonts w:asciiTheme="minorHAnsi" w:hAnsiTheme="minorHAnsi" w:cstheme="minorHAnsi"/>
+                  <w:bCs/>
+                  <w:sz w:val="18"/>
+                  <w:szCs w:val="18"/>
+                </w:rPr>
+                <w:id w:val="-950699189"/>
+                <w14:checkbox>
+                  <w14:checked w14:val="0"/>
+                  <w14:checkedState w14:val="2612" w14:font="MS Gothic"/>
+                  <w14:uncheckedState w14:val="2610" w14:font="MS Gothic"/>
+                </w14:checkbox>
+              </w:sdtPr>
+              <w:sdtEndPr/>
+              <w:sdtContent>
+                <w:r>
+                  <w:rPr>
+                    <w:rFonts w:ascii="MS Gothic" w:eastAsia="MS Gothic" w:hAnsi="MS Gothic" w:cstheme="minorHAnsi" w:hint="eastAsia"/>
+                    <w:bCs/>
+                    <w:sz w:val="18"/>
+                    <w:szCs w:val="18"/>
+                  </w:rPr>
+                  <w:t>☐</w:t>
+                </w:r>
+              </w:sdtContent>
+            </w:sdt>
+            <w:r>
+              <w:rPr>
+                <w:rFonts w:asciiTheme="minorHAnsi" w:hAnsiTheme="minorHAnsi" w:cstheme="minorHAnsi"/>
+                <w:bCs/>
+                <w:sz w:val="18"/>
+                <w:szCs w:val="18"/>
+              </w:rPr>
+              <w:t xml:space="preserve">  </w:t>
+            </w:r>
+          </w:p>
+        </w:tc>
+        <w:tc>
+          <w:tcPr>
+            <w:tcW w:w="1826" w:type="dxa"/>
+            <w:vAlign w:val="center"/>
+          </w:tcPr>
+          <w:p>
+            <w:pPr>
+              <w:rPr>
+                <w:rFonts w:asciiTheme="minorHAnsi" w:hAnsiTheme="minorHAnsi" w:cstheme="minorHAnsi"/>
+                <w:bCs/>
+                <w:sz w:val="20"/>
+                <w:szCs w:val="20"/>
+              </w:rPr>
+            </w:pPr>
+            <w:sdt>
+              <w:sdtPr>
+                <w:rPr>
+                  <w:rFonts w:asciiTheme="minorHAnsi" w:hAnsiTheme="minorHAnsi" w:cstheme="minorHAnsi"/>
+                  <w:bCs/>
+                  <w:sz w:val="18"/>
+                  <w:szCs w:val="18"/>
+                </w:rPr>
+                <w:id w:val="-769309896"/>
+                <w14:checkbox>
+                  <w14:checked w14:val="0"/>
+                  <w14:checkedState w14:val="2612" w14:font="MS Gothic"/>
+                  <w14:uncheckedState w14:val="2610" w14:font="MS Gothic"/>
+                </w14:checkbox>
+              </w:sdtPr>
+              <w:sdtEndPr/>
+              <w:sdtContent>
+                <w:r>
+                  <w:rPr>
+                    <w:rFonts w:ascii="MS Gothic" w:eastAsia="MS Gothic" w:hAnsi="MS Gothic" w:cstheme="minorHAnsi" w:hint="eastAsia"/>
+                    <w:bCs/>
+                    <w:sz w:val="18"/>
+                    <w:szCs w:val="18"/>
+                  </w:rPr>
+                  <w:t>☐</w:t>
+                </w:r>
+              </w:sdtContent>
+            </w:sdt>
+          </w:p>
+        </w:tc>
+        <w:tc>
+          <w:tcPr>
+            <w:tcW w:w="1559" w:type="dxa"/>
+            <w:vAlign w:val="center"/>
+          </w:tcPr>
+          <w:p>
+            <w:pPr>
+              <w:rPr>
+                <w:rFonts w:asciiTheme="minorHAnsi" w:hAnsiTheme="minorHAnsi" w:cstheme="minorHAnsi"/>
+                <w:bCs/>
+                <w:sz w:val="20"/>
+                <w:szCs w:val="20"/>
+              </w:rPr>
+            </w:pPr>
+            <w:sdt>
+              <w:sdtPr>
+                <w:rPr>
+                  <w:rFonts w:asciiTheme="minorHAnsi" w:hAnsiTheme="minorHAnsi" w:cstheme="minorHAnsi"/>
+                  <w:bCs/>
+                  <w:sz w:val="18"/>
+                  <w:szCs w:val="18"/>
+                </w:rPr>
+                <w:id w:val="1533384303"/>
+                <w14:checkbox>
+                  <w14:checked w14:val="0"/>
+                  <w14:checkedState w14:val="2612" w14:font="MS Gothic"/>
+                  <w14:uncheckedState w14:val="2610" w14:font="MS Gothic"/>
+                </w14:checkbox>
+              </w:sdtPr>
+              <w:sdtEndPr/>
+              <w:sdtContent>
+                <w:r>
+                  <w:rPr>
+                    <w:rFonts w:ascii="MS Gothic" w:eastAsia="MS Gothic" w:hAnsi="MS Gothic" w:cstheme="minorHAnsi" w:hint="eastAsia"/>
+                    <w:bCs/>
+                    <w:sz w:val="18"/>
+                    <w:szCs w:val="18"/>
+                  </w:rPr>
+                  <w:t>☐</w:t>
+                </w:r>
+              </w:sdtContent>
+            </w:sdt>
+          </w:p>
+        </w:tc>
+      </w:tr>
+    </w:tbl>
+    <w:p>
+      <w:pPr>
+        <w:rPr>
+          <w:rFonts w:asciiTheme="minorHAnsi" w:hAnsiTheme="minorHAnsi" w:cstheme="minorHAnsi"/>
+          <w:sz w:val="20"/>
+          <w:szCs w:val="20"/>
+        </w:rPr>
+      </w:pPr>
+    </w:p>
+    <w:p>
+      <w:pPr>
+        <w:spacing w:before="0" w:after="300"/>
+      </w:pPr>
+      <w:r>
+        <w:rPr>
+          <w:b/>
+          <w:color w:val="AAAAAA"/>
+          <w:sz w:val="20"/>
+          <w:szCs w:val="20"/>
+        </w:rPr>
+        <w:t xml:space="preserve">CHECKLIST_MARKER</w:t>
+      </w:r>
+    </w:p>
+    <w:p>
+      <w:pPr>
+        <w:rPr>
+          <w:rFonts w:asciiTheme="minorHAnsi" w:hAnsiTheme="minorHAnsi" w:cstheme="minorHAnsi"/>
+          <w:sz w:val="20"/>
+          <w:szCs w:val="20"/>
+        </w:rPr>
+      </w:pPr>
+    </w:p>
+    <w:p>
+      <w:pPr>
+        <w:rPr>
+          <w:rFonts w:asciiTheme="minorHAnsi" w:hAnsiTheme="minorHAnsi" w:cstheme="minorHAnsi"/>
+          <w:sz w:val="20"/>
+          <w:szCs w:val="20"/>
+        </w:rPr>
+      </w:pPr>
+    </w:p>
+    <w:p>
+      <w:pPr>
+        <w:rPr>
+          <w:rFonts w:asciiTheme="minorHAnsi" w:hAnsiTheme="minorHAnsi" w:cstheme="minorHAnsi"/>
+          <w:sz w:val="20"/>
+          <w:szCs w:val="20"/>
+        </w:rPr>
+      </w:pPr>
+    </w:p>
+    <w:p>
+      <w:pPr>
+        <w:rPr>
+          <w:rFonts w:asciiTheme="minorHAnsi" w:hAnsiTheme="minorHAnsi" w:cstheme="minorHAnsi"/>
+          <w:sz w:val="20"/>
+          <w:szCs w:val="20"/>
+        </w:rPr>
+      </w:pPr>
+    </w:p>
+    <w:p>
+      <w:pPr>
+        <w:spacing w:before="0" w:after="300"/>
+      </w:pPr>
+      <w:r>
+        <w:rPr>
+          <w:b/>
+          <w:color w:val="AAAAAA"/>
+          <w:sz w:val="20"/>
+          <w:szCs w:val="20"/>
+        </w:rPr>
+        <w:t xml:space="preserve">RILIEVI_MARKER</w:t>
+      </w:r>
+    </w:p>
+    <w:p>
+      <w:pPr>
+        <w:rPr>
+          <w:rFonts w:asciiTheme="minorHAnsi" w:hAnsiTheme="minorHAnsi" w:cstheme="minorHAnsi"/>
+          <w:sz w:val="20"/>
+          <w:szCs w:val="20"/>
+        </w:rPr>
+      </w:pPr>
+    </w:p>
+    <w:tbl>
+      <w:tblPr>
+        <w:tblpPr w:leftFromText="141" w:rightFromText="141" w:vertAnchor="text" w:tblpX="-714" w:tblpY="1"/>
+        <w:tblOverlap w:val="never"/>
+        <w:tblW w:w="11057" w:type="dxa"/>
+        <w:tblBorders>
+          <w:top w:val="single" w:sz="4" w:space="0" w:color="auto"/>
+          <w:left w:val="single" w:sz="4" w:space="0" w:color="auto"/>
+          <w:bottom w:val="single" w:sz="4" w:space="0" w:color="auto"/>
+          <w:right w:val="single" w:sz="4" w:space="0" w:color="auto"/>
+          <w:insideH w:val="single" w:sz="4" w:space="0" w:color="auto"/>
+          <w:insideV w:val="single" w:sz="4" w:space="0" w:color="auto"/>
+        </w:tblBorders>
+        <w:tblLayout w:type="fixed"/>
+        <w:tblLook w:val="01E0" w:firstRow="1" w:lastRow="1" w:firstColumn="1" w:lastColumn="1" w:noHBand="0" w:noVBand="0"/>
+      </w:tblPr>
+      <w:tblGrid>
+        <w:gridCol w:w="574"/>
+        <w:gridCol w:w="5514"/>
+        <w:gridCol w:w="3547"/>
+        <w:gridCol w:w="1422"/>
+      </w:tblGrid>
+      <w:tr>
+        <w:trPr>
+          <w:trHeight w:val="106"/>
+          <w:tblHeader/>
+        </w:trPr>
+        <w:tc>
+          <w:tcPr>
+            <w:tcW w:w="574" w:type="dxa"/>
+            <w:shd w:val="clear" w:color="auto" w:fill="FFFFFF" w:themeFill="background1"/>
+            <w:vAlign w:val="center"/>
+          </w:tcPr>
+          <w:p>
+            <w:pPr>
+              <w:tabs>
+                <w:tab w:val="left" w:pos="428"/>
+              </w:tabs>
+              <w:jc w:val="center"/>
+              <w:rPr>
+                <w:rFonts w:asciiTheme="minorHAnsi" w:hAnsiTheme="minorHAnsi" w:cstheme="minorHAnsi"/>
+                <w:b/>
+                <w:bCs/>
+                <w:sz w:val="20"/>
+                <w:szCs w:val="20"/>
+              </w:rPr>
+            </w:pPr>
+            <w:r>
+              <w:rPr>
+                <w:rFonts w:asciiTheme="minorHAnsi" w:hAnsiTheme="minorHAnsi" w:cstheme="minorHAnsi"/>
+                <w:b/>
+                <w:bCs/>
+                <w:sz w:val="20"/>
+                <w:szCs w:val="20"/>
+              </w:rPr>
+              <w:t>No.</w:t>
+            </w:r>
+          </w:p>
+        </w:tc>
+        <w:tc>
+          <w:tcPr>
+            <w:tcW w:w="5514" w:type="dxa"/>
+            <w:shd w:val="clear" w:color="auto" w:fill="FFFFFF" w:themeFill="background1"/>
+            <w:vAlign w:val="center"/>
+          </w:tcPr>
+          <w:p>
+            <w:pPr>
+              <w:jc w:val="center"/>
+              <w:rPr>
+                <w:rFonts w:asciiTheme="minorHAnsi" w:hAnsiTheme="minorHAnsi" w:cstheme="minorHAnsi"/>
+                <w:b/>
+                <w:bCs/>
+                <w:sz w:val="20"/>
+                <w:szCs w:val="20"/>
+              </w:rPr>
+            </w:pPr>
+            <w:r>
+              <w:rPr>
+                <w:rFonts w:asciiTheme="minorHAnsi" w:hAnsiTheme="minorHAnsi" w:cstheme="minorHAnsi"/>
+                <w:b/>
+                <w:bCs/>
+                <w:sz w:val="20"/>
+                <w:szCs w:val="20"/>
+              </w:rPr>
+              <w:t>DESCRIPTION</w:t>
+            </w:r>
+          </w:p>
+        </w:tc>
+        <w:tc>
+          <w:tcPr>
+            <w:tcW w:w="3547" w:type="dxa"/>
+            <w:shd w:val="clear" w:color="auto" w:fill="FFFFFF" w:themeFill="background1"/>
+            <w:vAlign w:val="center"/>
+          </w:tcPr>
+          <w:p>
+            <w:pPr>
+              <w:jc w:val="center"/>
+              <w:rPr>
+                <w:rFonts w:asciiTheme="minorHAnsi" w:hAnsiTheme="minorHAnsi" w:cstheme="minorHAnsi"/>
+                <w:b/>
+                <w:bCs/>
+                <w:sz w:val="20"/>
+                <w:szCs w:val="20"/>
+              </w:rPr>
+            </w:pPr>
+            <w:r>
+              <w:rPr>
+                <w:rFonts w:asciiTheme="minorHAnsi" w:hAnsiTheme="minorHAnsi" w:cstheme="minorHAnsi"/>
+                <w:b/>
+                <w:bCs/>
+                <w:sz w:val="20"/>
+                <w:szCs w:val="20"/>
+              </w:rPr>
+              <w:t>ACTION</w:t>
+            </w:r>
+          </w:p>
+        </w:tc>
+        <w:tc>
+          <w:tcPr>
+            <w:tcW w:w="1422" w:type="dxa"/>
+            <w:shd w:val="clear" w:color="auto" w:fill="FFFFFF" w:themeFill="background1"/>
+            <w:vAlign w:val="center"/>
+          </w:tcPr>
+          <w:p>
+            <w:pPr>
+              <w:jc w:val="center"/>
+              <w:rPr>
+                <w:rFonts w:asciiTheme="minorHAnsi" w:hAnsiTheme="minorHAnsi" w:cstheme="minorHAnsi"/>
+                <w:b/>
+                <w:bCs/>
+                <w:sz w:val="20"/>
+                <w:szCs w:val="20"/>
+              </w:rPr>
+            </w:pPr>
+            <w:r>
+              <w:rPr>
+                <w:rFonts w:asciiTheme="minorHAnsi" w:hAnsiTheme="minorHAnsi" w:cstheme="minorHAnsi"/>
+                <w:b/>
+                <w:bCs/>
+                <w:sz w:val="20"/>
+                <w:szCs w:val="20"/>
+              </w:rPr>
+              <w:t>CLOSURE</w:t>
+            </w:r>
+          </w:p>
+          <w:p>
+            <w:pPr>
+              <w:jc w:val="center"/>
+              <w:rPr>
+                <w:rFonts w:asciiTheme="minorHAnsi" w:hAnsiTheme="minorHAnsi" w:cstheme="minorHAnsi"/>
+                <w:b/>
+                <w:bCs/>
+                <w:sz w:val="20"/>
+                <w:szCs w:val="20"/>
+              </w:rPr>
+            </w:pPr>
+            <w:r>
+              <w:rPr>
+                <w:rFonts w:asciiTheme="minorHAnsi" w:hAnsiTheme="minorHAnsi" w:cstheme="minorHAnsi"/>
+                <w:b/>
+                <w:bCs/>
+                <w:sz w:val="20"/>
+                <w:szCs w:val="20"/>
+              </w:rPr>
+              <w:t>DAT</w:t>
+            </w:r>
+            <w:r>
+              <w:rPr>
+                <w:rFonts w:asciiTheme="minorHAnsi" w:hAnsiTheme="minorHAnsi" w:cstheme="minorHAnsi"/>
+                <w:b/>
+                <w:bCs/>
+                <w:sz w:val="20"/>
+                <w:szCs w:val="20"/>
+              </w:rPr>
+              <w:t>E</w:t>
+            </w:r>
+          </w:p>
+        </w:tc>
+      </w:tr>
+      <w:tr>
+        <w:trPr>
+          <w:trHeight w:val="567"/>
+        </w:trPr>
+        <w:tc>
+          <w:tcPr>
+            <w:tcW w:w="574" w:type="dxa"/>
+            <w:tcBorders>
+              <w:bottom w:val="single" w:sz="4" w:space="0" w:color="auto"/>
+            </w:tcBorders>
+            <w:shd w:val="clear" w:color="auto" w:fill="D9D9D9" w:themeFill="background1" w:themeFillShade="D9"/>
+            <w:vAlign w:val="center"/>
+          </w:tcPr>
+          <w:p>
+            <w:pPr>
+              <w:tabs>
+                <w:tab w:val="left" w:pos="428"/>
+              </w:tabs>
+              <w:jc w:val="center"/>
+              <w:rPr>
+                <w:rFonts w:asciiTheme="minorHAnsi" w:hAnsiTheme="minorHAnsi" w:cstheme="minorHAnsi"/>
+                <w:b/>
+                <w:bCs/>
+                <w:sz w:val="20"/>
+                <w:szCs w:val="20"/>
+              </w:rPr>
+            </w:pPr>
+            <w:r>
+              <w:rPr>
+                <w:rFonts w:asciiTheme="minorHAnsi" w:hAnsiTheme="minorHAnsi" w:cstheme="minorHAnsi"/>
+                <w:b/>
+                <w:bCs/>
+                <w:sz w:val="20"/>
+                <w:szCs w:val="20"/>
+              </w:rPr>
+              <w:t>1</w:t>
+            </w:r>
+            <w:r>
+              <w:rPr>
+                <w:rFonts w:asciiTheme="minorHAnsi" w:hAnsiTheme="minorHAnsi" w:cstheme="minorHAnsi"/>
+                <w:b/>
+                <w:bCs/>
+                <w:sz w:val="20"/>
+                <w:szCs w:val="20"/>
+              </w:rPr>
+              <w:t>.0</w:t>
+            </w:r>
+          </w:p>
+        </w:tc>
+        <w:tc>
+          <w:tcPr>
+            <w:tcW w:w="10483" w:type="dxa"/>
+            <w:gridSpan w:val="3"/>
+            <w:tcBorders>
+              <w:bottom w:val="single" w:sz="4" w:space="0" w:color="auto"/>
+            </w:tcBorders>
+            <w:shd w:val="clear" w:color="auto" w:fill="D9D9D9" w:themeFill="background1" w:themeFillShade="D9"/>
+            <w:vAlign w:val="center"/>
+          </w:tcPr>
+          <w:p>
+            <w:pPr>
+              <w:rPr>
+                <w:rFonts w:asciiTheme="minorHAnsi" w:hAnsiTheme="minorHAnsi" w:cstheme="minorHAnsi"/>
+                <w:b/>
+                <w:bCs/>
+                <w:sz w:val="20"/>
+                <w:szCs w:val="20"/>
+              </w:rPr>
+            </w:pPr>
+            <w:r>
+              <w:rPr>
+                <w:rFonts w:asciiTheme="minorHAnsi" w:hAnsiTheme="minorHAnsi" w:cstheme="minorHAnsi"/>
+                <w:b/>
+                <w:bCs/>
+                <w:sz w:val="20"/>
+                <w:szCs w:val="20"/>
+              </w:rPr>
+              <w:t>GENERALE</w:t>
+            </w:r>
+          </w:p>
+        </w:tc>
+      </w:tr>
+      <w:tr>
+        <w:trPr>
+          <w:trHeight w:val="567"/>
+        </w:trPr>
+        <w:tc>
+          <w:tcPr>
+            <w:tcW w:w="574" w:type="dxa"/>
+            <w:shd w:val="clear" w:color="auto" w:fill="FFFFFF" w:themeFill="background1"/>
+            <w:vAlign w:val="center"/>
+          </w:tcPr>
+          <w:p>
+            <w:pPr>
+              <w:tabs>
+                <w:tab w:val="left" w:pos="428"/>
+              </w:tabs>
+              <w:spacing w:before="120" w:after="120"/>
+              <w:jc w:val="center"/>
+              <w:rPr>
+                <w:rFonts w:asciiTheme="minorHAnsi" w:hAnsiTheme="minorHAnsi" w:cstheme="minorHAnsi"/>
+                <w:bCs/>
+                <w:sz w:val="20"/>
+                <w:szCs w:val="20"/>
+              </w:rPr>
+            </w:pPr>
+            <w:r>
+              <w:rPr>
+                <w:rFonts w:asciiTheme="minorHAnsi" w:hAnsiTheme="minorHAnsi" w:cstheme="minorHAnsi"/>
+                <w:bCs/>
+                <w:sz w:val="20"/>
+                <w:szCs w:val="20"/>
+              </w:rPr>
+              <w:t>1.1</w:t>
+            </w:r>
+          </w:p>
+        </w:tc>
+        <w:tc>
+          <w:tcPr>
+            <w:tcW w:w="5514" w:type="dxa"/>
+            <w:shd w:val="clear" w:color="auto" w:fill="FFFFFF" w:themeFill="background1"/>
+          </w:tcPr>
+          <w:p>
+            <w:pPr>
+              <w:tabs>
+                <w:tab w:val="left" w:pos="428"/>
+              </w:tabs>
+              <w:jc w:val="both"/>
+              <w:rPr>
+                <w:rFonts w:asciiTheme="minorHAnsi" w:hAnsiTheme="minorHAnsi" w:cstheme="minorHAnsi"/>
+                <w:bCs/>
+                <w:sz w:val="20"/>
+                <w:szCs w:val="20"/>
+              </w:rPr>
+            </w:pPr>
+            <w:r>
+              <w:rPr>
+                <w:rFonts w:asciiTheme="minorHAnsi" w:hAnsiTheme="minorHAnsi" w:cstheme="minorHAnsi"/>
+                <w:bCs/>
+                <w:sz w:val="20"/>
+                <w:szCs w:val="20"/>
+              </w:rPr>
+              <w:t>Situazione</w:t>
+            </w:r>
+          </w:p>
+          <w:p>
+            <w:pPr>
+              <w:tabs>
+                <w:tab w:val="left" w:pos="428"/>
+              </w:tabs>
+              <w:jc w:val="both"/>
+              <w:rPr>
+                <w:rFonts w:asciiTheme="minorHAnsi" w:hAnsiTheme="minorHAnsi" w:cstheme="minorHAnsi"/>
+                <w:bCs/>
+                <w:sz w:val="20"/>
+                <w:szCs w:val="20"/>
+              </w:rPr>
+            </w:pPr>
+            <w:r>
+              <w:rPr>
+                <w:rFonts w:asciiTheme="minorHAnsi" w:hAnsiTheme="minorHAnsi" w:cstheme="minorHAnsi"/>
+                <w:bCs/>
+                <w:sz w:val="20"/>
+                <w:szCs w:val="20"/>
+              </w:rPr>
+              <w:t>CHECKLIST_MARKER</w:t>
+            </w:r>
+          </w:p>
+          <w:p>
+            <w:pPr>
+              <w:tabs>
+                <w:tab w:val="left" w:pos="428"/>
+              </w:tabs>
+              <w:jc w:val="both"/>
+              <w:rPr>
+                <w:rFonts w:asciiTheme="minorHAnsi" w:hAnsiTheme="minorHAnsi" w:cstheme="minorHAnsi"/>
+                <w:bCs/>
+                <w:sz w:val="20"/>
+                <w:szCs w:val="20"/>
+              </w:rPr>
+            </w:pPr>
+            <w:r>
+              <w:rPr>
+                <w:rFonts w:asciiTheme="minorHAnsi" w:hAnsiTheme="minorHAnsi" w:cstheme="minorHAnsi"/>
+                <w:bCs/>
+                <w:sz w:val="20"/>
+                <w:szCs w:val="20"/>
+              </w:rPr>
+              <w:t>RILIEVI_MARKER</w:t>
+            </w:r>
+          </w:p>
+        </w:tc>
+        <w:tc>
+          <w:tcPr>
+            <w:tcW w:w="3547" w:type="dxa"/>
+            <w:shd w:val="clear" w:color="auto" w:fill="FFFFFF" w:themeFill="background1"/>
+          </w:tcPr>
+          <w:p>
+            <w:pPr>
+              <w:tabs>
+                <w:tab w:val="left" w:pos="428"/>
+              </w:tabs>
+              <w:rPr>
+                <w:rFonts w:asciiTheme="minorHAnsi" w:hAnsiTheme="minorHAnsi" w:cstheme="minorHAnsi"/>
+                <w:bCs/>
+                <w:sz w:val="20"/>
+                <w:szCs w:val="20"/>
+              </w:rPr>
+            </w:pPr>
+          </w:p>
+        </w:tc>
+        <w:tc>
+          <w:tcPr>
+            <w:tcW w:w="1422" w:type="dxa"/>
+            <w:shd w:val="clear" w:color="auto" w:fill="FFFFFF" w:themeFill="background1"/>
+          </w:tcPr>
+          <w:p>
+            <w:pPr>
+              <w:tabs>
+                <w:tab w:val="left" w:pos="428"/>
+              </w:tabs>
+              <w:rPr>
+                <w:rFonts w:asciiTheme="minorHAnsi" w:hAnsiTheme="minorHAnsi" w:cstheme="minorHAnsi"/>
+                <w:bCs/>
+                <w:sz w:val="20"/>
+                <w:szCs w:val="20"/>
+              </w:rPr>
+            </w:pPr>
+          </w:p>
+        </w:tc>
+      </w:tr>
+      <w:tr>
+        <w:trPr>
+          <w:trHeight w:val="567"/>
+        </w:trPr>
+        <w:tc>
+          <w:tcPr>
+            <w:tcW w:w="574" w:type="dxa"/>
+            <w:tcBorders>
+              <w:bottom w:val="single" w:sz="4" w:space="0" w:color="auto"/>
+            </w:tcBorders>
+            <w:shd w:val="clear" w:color="auto" w:fill="D9D9D9" w:themeFill="background1" w:themeFillShade="D9"/>
+            <w:vAlign w:val="center"/>
+          </w:tcPr>
+          <w:p>
+            <w:pPr>
+              <w:tabs>
+                <w:tab w:val="left" w:pos="428"/>
+              </w:tabs>
+              <w:jc w:val="center"/>
+              <w:rPr>
+                <w:rFonts w:asciiTheme="minorHAnsi" w:hAnsiTheme="minorHAnsi" w:cstheme="minorHAnsi"/>
+                <w:b/>
+                <w:bCs/>
+                <w:sz w:val="20"/>
+                <w:szCs w:val="20"/>
+              </w:rPr>
+            </w:pPr>
+            <w:r>
+              <w:rPr>
+                <w:rFonts w:asciiTheme="minorHAnsi" w:hAnsiTheme="minorHAnsi" w:cstheme="minorHAnsi"/>
+                <w:b/>
+                <w:bCs/>
+                <w:sz w:val="20"/>
+                <w:szCs w:val="20"/>
+              </w:rPr>
+              <w:t>2.0</w:t>
+            </w:r>
+          </w:p>
+        </w:tc>
+        <w:tc>
+          <w:tcPr>
+            <w:tcW w:w="10483" w:type="dxa"/>
+            <w:gridSpan w:val="3"/>
+            <w:tcBorders>
+              <w:bottom w:val="single" w:sz="4" w:space="0" w:color="auto"/>
+            </w:tcBorders>
+            <w:shd w:val="clear" w:color="auto" w:fill="D9D9D9" w:themeFill="background1" w:themeFillShade="D9"/>
+            <w:vAlign w:val="center"/>
+          </w:tcPr>
+          <w:p>
+            <w:pPr>
+              <w:jc w:val="both"/>
+              <w:rPr>
+                <w:rFonts w:asciiTheme="minorHAnsi" w:hAnsiTheme="minorHAnsi" w:cstheme="minorHAnsi"/>
+                <w:b/>
+                <w:bCs/>
+                <w:sz w:val="20"/>
+                <w:szCs w:val="20"/>
+              </w:rPr>
+            </w:pPr>
+            <w:r>
+              <w:rPr>
+                <w:rFonts w:asciiTheme="minorHAnsi" w:hAnsiTheme="minorHAnsi" w:cstheme="minorHAnsi"/>
+                <w:b/>
+                <w:bCs/>
+                <w:sz w:val="20"/>
+                <w:szCs w:val="20"/>
+              </w:rPr>
+              <w:t>MONTE E ALLUNGHI TAGLI / GESTIONE PRE-SALDATURA</w:t>
+            </w:r>
+          </w:p>
+        </w:tc>
+      </w:tr>
+      <w:tr>
+        <w:trPr>
+          <w:trHeight w:val="567"/>
+        </w:trPr>
+        <w:tc>
+          <w:tcPr>
+            <w:tcW w:w="574" w:type="dxa"/>
+            <w:shd w:val="clear" w:color="auto" w:fill="FFFFFF" w:themeFill="background1"/>
+            <w:vAlign w:val="center"/>
+          </w:tcPr>
+          <w:p>
+            <w:pPr>
+              <w:tabs>
+                <w:tab w:val="left" w:pos="428"/>
+              </w:tabs>
+              <w:jc w:val="center"/>
+              <w:rPr>
+                <w:rFonts w:asciiTheme="minorHAnsi" w:hAnsiTheme="minorHAnsi" w:cstheme="minorHAnsi"/>
+                <w:bCs/>
+                <w:sz w:val="20"/>
+                <w:szCs w:val="20"/>
+              </w:rPr>
+            </w:pPr>
+            <w:r>
+              <w:rPr>
+                <w:rFonts w:asciiTheme="minorHAnsi" w:hAnsiTheme="minorHAnsi" w:cstheme="minorHAnsi"/>
+                <w:bCs/>
+                <w:sz w:val="20"/>
+                <w:szCs w:val="20"/>
+              </w:rPr>
+              <w:t>2.1</w:t>
+            </w:r>
+          </w:p>
+        </w:tc>
+        <w:tc>
+          <w:tcPr>
+            <w:tcW w:w="5514" w:type="dxa"/>
+            <w:shd w:val="clear" w:color="auto" w:fill="FFFFFF" w:themeFill="background1"/>
+          </w:tcPr>
+          <w:p>
+            <w:pPr>
+              <w:jc w:val="both"/>
+              <w:rPr>
+                <w:rFonts w:asciiTheme="minorHAnsi" w:eastAsiaTheme="minorHAnsi" w:hAnsiTheme="minorHAnsi" w:cstheme="minorHAnsi"/>
+                <w:i/>
+                <w:iCs/>
+                <w:sz w:val="18"/>
+                <w:szCs w:val="18"/>
+                <w:lang w:eastAsia="en-US"/>
+              </w:rPr>
+            </w:pPr>
+            <w:r>
+              <w:rPr>
+                <w:rFonts w:asciiTheme="minorHAnsi" w:eastAsiaTheme="minorHAnsi" w:hAnsiTheme="minorHAnsi" w:cstheme="minorHAnsi"/>
+                <w:b/>
+                <w:bCs/>
+                <w:sz w:val="20"/>
+                <w:szCs w:val="20"/>
+                <w:lang w:eastAsia="en-US"/>
+              </w:rPr>
+              <w:t>Materiale preassemblato</w:t>
+            </w:r>
+          </w:p>
+        </w:tc>
+        <w:tc>
+          <w:tcPr>
+            <w:tcW w:w="3547" w:type="dxa"/>
+            <w:shd w:val="clear" w:color="auto" w:fill="FFFFFF" w:themeFill="background1"/>
+          </w:tcPr>
+          <w:p>
+            <w:pPr>
+              <w:tabs>
+                <w:tab w:val="left" w:pos="428"/>
+              </w:tabs>
+              <w:rPr>
+                <w:rFonts w:asciiTheme="minorHAnsi" w:hAnsiTheme="minorHAnsi" w:cstheme="minorHAnsi"/>
+                <w:bCs/>
+                <w:sz w:val="20"/>
+                <w:szCs w:val="20"/>
+              </w:rPr>
+            </w:pPr>
+          </w:p>
+        </w:tc>
+        <w:tc>
+          <w:tcPr>
+            <w:tcW w:w="1422" w:type="dxa"/>
+            <w:shd w:val="clear" w:color="auto" w:fill="FFFFFF" w:themeFill="background1"/>
+          </w:tcPr>
+          <w:p>
+            <w:pPr>
+              <w:tabs>
+                <w:tab w:val="left" w:pos="428"/>
+              </w:tabs>
+              <w:rPr>
+                <w:rFonts w:asciiTheme="minorHAnsi" w:hAnsiTheme="minorHAnsi" w:cstheme="minorHAnsi"/>
+                <w:bCs/>
+                <w:sz w:val="20"/>
+                <w:szCs w:val="20"/>
+              </w:rPr>
+            </w:pPr>
+          </w:p>
+        </w:tc>
+      </w:tr>
+      <w:tr>
+        <w:trPr>
+          <w:trHeight w:val="567"/>
+        </w:trPr>
+        <w:tc>
+          <w:tcPr>
+            <w:tcW w:w="574" w:type="dxa"/>
+            <w:tcBorders>
+              <w:bottom w:val="single" w:sz="4" w:space="0" w:color="auto"/>
+            </w:tcBorders>
+            <w:shd w:val="clear" w:color="auto" w:fill="D9D9D9" w:themeFill="background1" w:themeFillShade="D9"/>
+            <w:vAlign w:val="center"/>
+          </w:tcPr>
+          <w:p>
+            <w:pPr>
+              <w:tabs>
+                <w:tab w:val="left" w:pos="428"/>
+              </w:tabs>
+              <w:jc w:val="center"/>
+              <w:rPr>
+                <w:rFonts w:asciiTheme="minorHAnsi" w:hAnsiTheme="minorHAnsi" w:cstheme="minorHAnsi"/>
+                <w:b/>
+                <w:bCs/>
+                <w:sz w:val="20"/>
+                <w:szCs w:val="20"/>
+              </w:rPr>
+            </w:pPr>
+            <w:bookmarkStart w:id="0" w:name="_Hlk166185970"/>
+            <w:bookmarkStart w:id="1" w:name="_Hlk89160537"/>
+            <w:r>
+              <w:rPr>
+                <w:rFonts w:asciiTheme="minorHAnsi" w:hAnsiTheme="minorHAnsi" w:cstheme="minorHAnsi"/>
+                <w:b/>
+                <w:bCs/>
+                <w:sz w:val="20"/>
+                <w:szCs w:val="20"/>
+              </w:rPr>
+              <w:t>3</w:t>
+            </w:r>
+            <w:r>
+              <w:rPr>
+                <w:rFonts w:asciiTheme="minorHAnsi" w:hAnsiTheme="minorHAnsi" w:cstheme="minorHAnsi"/>
+                <w:b/>
+                <w:bCs/>
+                <w:sz w:val="20"/>
+                <w:szCs w:val="20"/>
+              </w:rPr>
+              <w:t>.0</w:t>
+            </w:r>
+          </w:p>
+        </w:tc>
+        <w:tc>
+          <w:tcPr>
+            <w:tcW w:w="10483" w:type="dxa"/>
+            <w:gridSpan w:val="3"/>
+            <w:tcBorders>
+              <w:bottom w:val="single" w:sz="4" w:space="0" w:color="auto"/>
+            </w:tcBorders>
+            <w:shd w:val="clear" w:color="auto" w:fill="D9D9D9" w:themeFill="background1" w:themeFillShade="D9"/>
+            <w:vAlign w:val="center"/>
+          </w:tcPr>
+          <w:p>
+            <w:pPr>
+              <w:jc w:val="both"/>
+              <w:rPr>
+                <w:rFonts w:asciiTheme="minorHAnsi" w:hAnsiTheme="minorHAnsi" w:cstheme="minorBidi"/>
+                <w:b/>
+                <w:sz w:val="20"/>
+                <w:szCs w:val="20"/>
+              </w:rPr>
+            </w:pPr>
+            <w:r>
+              <w:rPr>
+                <w:rFonts w:asciiTheme="minorHAnsi" w:hAnsiTheme="minorHAnsi" w:cstheme="minorBidi"/>
+                <w:b/>
+                <w:bCs/>
+                <w:sz w:val="20"/>
+                <w:szCs w:val="20"/>
+              </w:rPr>
+              <w:t>GESTIONE DEL MAGAZZINO E TAGLIO</w:t>
+            </w:r>
+          </w:p>
+        </w:tc>
+      </w:tr>
+      <w:bookmarkEnd w:id="0"/>
+      <w:tr>
+        <w:trPr>
+          <w:trHeight w:val="567"/>
+        </w:trPr>
+        <w:tc>
+          <w:tcPr>
+            <w:tcW w:w="574" w:type="dxa"/>
+            <w:shd w:val="clear" w:color="auto" w:fill="FFFFFF" w:themeFill="background1"/>
+            <w:vAlign w:val="center"/>
+          </w:tcPr>
+          <w:p>
+            <w:pPr>
+              <w:tabs>
+                <w:tab w:val="left" w:pos="428"/>
+              </w:tabs>
+              <w:spacing w:before="120" w:after="120"/>
+              <w:jc w:val="center"/>
+              <w:rPr>
+                <w:rFonts w:asciiTheme="minorHAnsi" w:hAnsiTheme="minorHAnsi" w:cstheme="minorHAnsi"/>
+                <w:sz w:val="20"/>
+                <w:szCs w:val="20"/>
+              </w:rPr>
+            </w:pPr>
+            <w:r>
+              <w:rPr>
+                <w:rFonts w:asciiTheme="minorHAnsi" w:hAnsiTheme="minorHAnsi" w:cstheme="minorHAnsi"/>
+                <w:sz w:val="20"/>
+                <w:szCs w:val="20"/>
+              </w:rPr>
+              <w:t>3.1</w:t>
+            </w:r>
+          </w:p>
+        </w:tc>
+        <w:tc>
+          <w:tcPr>
+            <w:tcW w:w="5514" w:type="dxa"/>
+            <w:shd w:val="clear" w:color="auto" w:fill="FFFFFF" w:themeFill="background1"/>
+          </w:tcPr>
+          <w:p>
+            <w:pPr>
+              <w:tabs>
+                <w:tab w:val="left" w:pos="4527"/>
+              </w:tabs>
+              <w:jc w:val="both"/>
+              <w:rPr>
+                <w:rFonts w:asciiTheme="minorHAnsi" w:hAnsiTheme="minorHAnsi" w:cstheme="minorHAnsi"/>
+                <w:b/>
+                <w:bCs/>
+                <w:sz w:val="20"/>
+                <w:szCs w:val="20"/>
+              </w:rPr>
+            </w:pPr>
+            <w:r>
+              <w:rPr>
+                <w:rFonts w:asciiTheme="minorHAnsi" w:hAnsiTheme="minorHAnsi" w:cstheme="minorHAnsi"/>
+                <w:b/>
+                <w:bCs/>
+                <w:sz w:val="20"/>
+                <w:szCs w:val="20"/>
+              </w:rPr>
+              <w:t xml:space="preserve">Materiale base per </w:t>
+            </w:r>
+            <w:r>
+              <w:rPr>
+                <w:rFonts w:asciiTheme="minorHAnsi" w:hAnsiTheme="minorHAnsi" w:cstheme="minorHAnsi"/>
+                <w:b/>
+                <w:bCs/>
+                <w:sz w:val="20"/>
+                <w:szCs w:val="20"/>
+              </w:rPr>
+              <w:t>ciclo LG, LH, LI, LJ e LK:</w:t>
+            </w:r>
+          </w:p>
+        </w:tc>
+        <w:tc>
+          <w:tcPr>
+            <w:tcW w:w="3547" w:type="dxa"/>
+            <w:shd w:val="clear" w:color="auto" w:fill="FFFFFF" w:themeFill="background1"/>
+          </w:tcPr>
+          <w:p>
+            <w:pPr>
+              <w:tabs>
+                <w:tab w:val="left" w:pos="428"/>
+              </w:tabs>
+              <w:rPr>
+                <w:rFonts w:asciiTheme="minorHAnsi" w:hAnsiTheme="minorHAnsi" w:cstheme="minorHAnsi"/>
+                <w:bCs/>
+                <w:color w:val="FF0000"/>
+                <w:sz w:val="20"/>
+                <w:szCs w:val="20"/>
+              </w:rPr>
+            </w:pPr>
+          </w:p>
+        </w:tc>
+        <w:tc>
+          <w:tcPr>
+            <w:tcW w:w="1422" w:type="dxa"/>
+            <w:shd w:val="clear" w:color="auto" w:fill="FFFFFF" w:themeFill="background1"/>
+          </w:tcPr>
+          <w:p>
+            <w:pPr>
+              <w:rPr>
+                <w:rFonts w:asciiTheme="minorHAnsi" w:hAnsiTheme="minorHAnsi" w:cstheme="minorBidi"/>
+                <w:color w:val="FF0000"/>
+                <w:sz w:val="20"/>
+                <w:szCs w:val="20"/>
+              </w:rPr>
+            </w:pPr>
+          </w:p>
+        </w:tc>
+      </w:tr>
+      <w:tr>
+        <w:trPr>
+          <w:trHeight w:val="624"/>
+        </w:trPr>
+        <w:tc>
+          <w:tcPr>
+            <w:tcW w:w="574" w:type="dxa"/>
+            <w:shd w:val="clear" w:color="auto" w:fill="FFFFFF" w:themeFill="background1"/>
+            <w:vAlign w:val="center"/>
+          </w:tcPr>
+          <w:p>
+            <w:pPr>
+              <w:tabs>
+                <w:tab w:val="left" w:pos="428"/>
+              </w:tabs>
+              <w:spacing w:before="120" w:after="120"/>
+              <w:jc w:val="center"/>
+              <w:rPr>
+                <w:rFonts w:asciiTheme="minorHAnsi" w:hAnsiTheme="minorHAnsi" w:cstheme="minorHAnsi"/>
+                <w:sz w:val="20"/>
+                <w:szCs w:val="20"/>
+              </w:rPr>
+            </w:pPr>
+            <w:r>
+              <w:rPr>
+                <w:rFonts w:asciiTheme="minorHAnsi" w:hAnsiTheme="minorHAnsi" w:cstheme="minorHAnsi"/>
+                <w:sz w:val="20"/>
+                <w:szCs w:val="20"/>
+              </w:rPr>
+              <w:t>3.2</w:t>
+            </w:r>
+          </w:p>
+        </w:tc>
+        <w:tc>
+          <w:tcPr>
+            <w:tcW w:w="5514" w:type="dxa"/>
+            <w:shd w:val="clear" w:color="auto" w:fill="FFFFFF" w:themeFill="background1"/>
+          </w:tcPr>
+          <w:p>
+            <w:pPr>
+              <w:tabs>
+                <w:tab w:val="left" w:pos="4527"/>
+              </w:tabs>
+              <w:jc w:val="both"/>
+              <w:rPr>
+                <w:rFonts w:asciiTheme="minorHAnsi" w:hAnsiTheme="minorHAnsi" w:cstheme="minorHAnsi"/>
+                <w:b/>
+                <w:bCs/>
+                <w:sz w:val="20"/>
+                <w:szCs w:val="20"/>
+              </w:rPr>
+            </w:pPr>
+            <w:r>
+              <w:rPr>
+                <w:rFonts w:asciiTheme="minorHAnsi" w:hAnsiTheme="minorHAnsi" w:cstheme="minorHAnsi"/>
+                <w:b/>
+                <w:bCs/>
+                <w:sz w:val="20"/>
+                <w:szCs w:val="20"/>
+              </w:rPr>
+              <w:t>STEEL PREPARATION</w:t>
+            </w:r>
+          </w:p>
+        </w:tc>
+        <w:tc>
+          <w:tcPr>
+            <w:tcW w:w="3547" w:type="dxa"/>
+            <w:shd w:val="clear" w:color="auto" w:fill="FFFFFF" w:themeFill="background1"/>
+          </w:tcPr>
+          <w:p>
+            <w:pPr>
+              <w:rPr>
+                <w:rFonts w:asciiTheme="minorHAnsi" w:hAnsiTheme="minorHAnsi" w:cstheme="minorHAnsi"/>
+                <w:sz w:val="20"/>
+                <w:szCs w:val="20"/>
+              </w:rPr>
+            </w:pPr>
+          </w:p>
+        </w:tc>
+        <w:tc>
+          <w:tcPr>
+            <w:tcW w:w="1422" w:type="dxa"/>
+            <w:shd w:val="clear" w:color="auto" w:fill="FFFFFF" w:themeFill="background1"/>
+          </w:tcPr>
+          <w:p>
+            <w:pPr>
+              <w:rPr>
+                <w:rFonts w:asciiTheme="minorHAnsi" w:hAnsiTheme="minorHAnsi" w:cstheme="minorBidi"/>
+                <w:sz w:val="20"/>
+                <w:szCs w:val="20"/>
+              </w:rPr>
+            </w:pPr>
+          </w:p>
+        </w:tc>
+      </w:tr>
+      <w:tr>
+        <w:trPr>
+          <w:trHeight w:val="548"/>
+        </w:trPr>
+        <w:tc>
+          <w:tcPr>
+            <w:tcW w:w="574" w:type="dxa"/>
+            <w:tcBorders>
+              <w:bottom w:val="single" w:sz="4" w:space="0" w:color="auto"/>
+            </w:tcBorders>
+            <w:shd w:val="clear" w:color="auto" w:fill="D9D9D9" w:themeFill="background1" w:themeFillShade="D9"/>
+            <w:vAlign w:val="center"/>
+          </w:tcPr>
+          <w:p>
+            <w:pPr>
+              <w:tabs>
+                <w:tab w:val="left" w:pos="428"/>
+              </w:tabs>
+              <w:jc w:val="center"/>
+              <w:rPr>
+                <w:rFonts w:asciiTheme="minorHAnsi" w:hAnsiTheme="minorHAnsi" w:cstheme="minorHAnsi"/>
+                <w:b/>
+                <w:bCs/>
+                <w:sz w:val="20"/>
+                <w:szCs w:val="20"/>
+              </w:rPr>
+            </w:pPr>
+            <w:r>
+              <w:rPr>
+                <w:rFonts w:asciiTheme="minorHAnsi" w:hAnsiTheme="minorHAnsi" w:cstheme="minorHAnsi"/>
+                <w:b/>
+                <w:bCs/>
+                <w:sz w:val="20"/>
+                <w:szCs w:val="20"/>
+              </w:rPr>
+              <w:t>4</w:t>
+            </w:r>
+            <w:r>
+              <w:rPr>
+                <w:rFonts w:asciiTheme="minorHAnsi" w:hAnsiTheme="minorHAnsi" w:cstheme="minorHAnsi"/>
+                <w:b/>
+                <w:bCs/>
+                <w:sz w:val="20"/>
+                <w:szCs w:val="20"/>
+              </w:rPr>
+              <w:t>.0</w:t>
+            </w:r>
+          </w:p>
+        </w:tc>
+        <w:tc>
+          <w:tcPr>
+            <w:tcW w:w="10483" w:type="dxa"/>
+            <w:gridSpan w:val="3"/>
+            <w:tcBorders>
+              <w:bottom w:val="single" w:sz="4" w:space="0" w:color="auto"/>
+            </w:tcBorders>
+            <w:shd w:val="clear" w:color="auto" w:fill="D9D9D9" w:themeFill="background1" w:themeFillShade="D9"/>
+            <w:vAlign w:val="center"/>
+          </w:tcPr>
+          <w:p>
+            <w:pPr>
+              <w:jc w:val="both"/>
+              <w:rPr>
+                <w:rFonts w:asciiTheme="minorHAnsi" w:hAnsiTheme="minorHAnsi" w:cstheme="minorBidi"/>
+                <w:b/>
+                <w:sz w:val="20"/>
+                <w:szCs w:val="20"/>
+              </w:rPr>
+            </w:pPr>
+            <w:r>
+              <w:rPr>
+                <w:rFonts w:asciiTheme="minorHAnsi" w:hAnsiTheme="minorHAnsi" w:cstheme="minorBidi"/>
+                <w:b/>
+                <w:bCs/>
+                <w:sz w:val="20"/>
+                <w:szCs w:val="20"/>
+              </w:rPr>
+              <w:t>ASSEMBLAGGIO, SALDATURA, SABBIATURA E VERNICIATURA</w:t>
+            </w:r>
+          </w:p>
+        </w:tc>
+      </w:tr>
+      <w:tr>
+        <w:trPr>
+          <w:trHeight w:val="567"/>
+        </w:trPr>
+        <w:tc>
+          <w:tcPr>
+            <w:tcW w:w="574" w:type="dxa"/>
+            <w:shd w:val="clear" w:color="auto" w:fill="FFFFFF" w:themeFill="background1"/>
+            <w:vAlign w:val="center"/>
+          </w:tcPr>
+          <w:p>
+            <w:pPr>
+              <w:tabs>
+                <w:tab w:val="left" w:pos="428"/>
+              </w:tabs>
+              <w:spacing w:before="120" w:after="120"/>
+              <w:jc w:val="center"/>
+              <w:rPr>
+                <w:rFonts w:asciiTheme="minorHAnsi" w:hAnsiTheme="minorHAnsi" w:cstheme="minorHAnsi"/>
+                <w:bCs/>
+                <w:sz w:val="20"/>
+                <w:szCs w:val="20"/>
+              </w:rPr>
+            </w:pPr>
+            <w:r>
+              <w:rPr>
+                <w:rFonts w:asciiTheme="minorHAnsi" w:hAnsiTheme="minorHAnsi" w:cstheme="minorHAnsi"/>
+                <w:sz w:val="20"/>
+                <w:szCs w:val="20"/>
+              </w:rPr>
+              <w:t>4</w:t>
+            </w:r>
+            <w:r>
+              <w:rPr>
+                <w:rFonts w:asciiTheme="minorHAnsi" w:hAnsiTheme="minorHAnsi" w:cstheme="minorHAnsi"/>
+                <w:sz w:val="20"/>
+                <w:szCs w:val="20"/>
+              </w:rPr>
+              <w:t>.</w:t>
+            </w:r>
+            <w:r>
+              <w:rPr>
+                <w:rFonts w:asciiTheme="minorHAnsi" w:hAnsiTheme="minorHAnsi" w:cstheme="minorHAnsi"/>
+                <w:sz w:val="20"/>
+                <w:szCs w:val="20"/>
+              </w:rPr>
+              <w:t>1</w:t>
+            </w:r>
+          </w:p>
+        </w:tc>
+        <w:tc>
+          <w:tcPr>
+            <w:tcW w:w="5514" w:type="dxa"/>
+            <w:shd w:val="clear" w:color="auto" w:fill="FFFFFF" w:themeFill="background1"/>
+          </w:tcPr>
+          <w:p>
+            <w:pPr>
+              <w:jc w:val="both"/>
+              <w:rPr>
+                <w:rFonts w:asciiTheme="minorHAnsi" w:hAnsiTheme="minorHAnsi" w:cstheme="minorHAnsi"/>
+                <w:bCs/>
+                <w:noProof/>
+                <w:sz w:val="20"/>
+                <w:szCs w:val="20"/>
+              </w:rPr>
+            </w:pPr>
+            <w:r>
+              <w:rPr>
+                <w:rFonts w:asciiTheme="minorHAnsi" w:hAnsiTheme="minorHAnsi" w:cstheme="minorHAnsi"/>
+                <w:b/>
+                <w:noProof/>
+                <w:sz w:val="20"/>
+                <w:szCs w:val="20"/>
+              </w:rPr>
+              <w:t>ASSEMBLAGGIO E SALDATURA:</w:t>
+            </w:r>
+          </w:p>
+        </w:tc>
+        <w:tc>
+          <w:tcPr>
+            <w:tcW w:w="3547" w:type="dxa"/>
+            <w:shd w:val="clear" w:color="auto" w:fill="FFFFFF" w:themeFill="background1"/>
+          </w:tcPr>
+          <w:p>
+            <w:pPr>
+              <w:rPr>
+                <w:rFonts w:asciiTheme="minorHAnsi" w:hAnsiTheme="minorHAnsi" w:cstheme="minorHAnsi"/>
+                <w:sz w:val="20"/>
+                <w:szCs w:val="20"/>
+              </w:rPr>
+            </w:pPr>
+          </w:p>
+        </w:tc>
+        <w:tc>
+          <w:tcPr>
+            <w:tcW w:w="1422" w:type="dxa"/>
+            <w:shd w:val="clear" w:color="auto" w:fill="FFFFFF" w:themeFill="background1"/>
+          </w:tcPr>
+          <w:p>
+            <w:pPr>
+              <w:rPr>
+                <w:rFonts w:asciiTheme="minorHAnsi" w:hAnsiTheme="minorHAnsi" w:cstheme="minorBidi"/>
+                <w:sz w:val="20"/>
+                <w:szCs w:val="20"/>
+              </w:rPr>
+            </w:pPr>
+          </w:p>
+        </w:tc>
+      </w:tr>
+      <w:tr>
+        <w:trPr>
+          <w:trHeight w:val="60"/>
+        </w:trPr>
+        <w:tc>
+          <w:tcPr>
+            <w:tcW w:w="574" w:type="dxa"/>
+            <w:shd w:val="clear" w:color="auto" w:fill="FFFFFF" w:themeFill="background1"/>
+            <w:vAlign w:val="center"/>
+          </w:tcPr>
+          <w:p>
+            <w:pPr>
+              <w:tabs>
+                <w:tab w:val="left" w:pos="428"/>
+              </w:tabs>
+              <w:spacing w:before="120" w:after="120"/>
+              <w:jc w:val="center"/>
+              <w:rPr>
+                <w:rFonts w:asciiTheme="minorHAnsi" w:hAnsiTheme="minorHAnsi" w:cstheme="minorHAnsi"/>
+                <w:bCs/>
+                <w:sz w:val="20"/>
+                <w:szCs w:val="20"/>
+              </w:rPr>
+            </w:pPr>
+            <w:r>
+              <w:rPr>
+                <w:rFonts w:asciiTheme="minorHAnsi" w:hAnsiTheme="minorHAnsi" w:cstheme="minorHAnsi"/>
+                <w:bCs/>
+                <w:sz w:val="20"/>
+                <w:szCs w:val="20"/>
+              </w:rPr>
+              <w:t>4.2</w:t>
+            </w:r>
+          </w:p>
+        </w:tc>
+        <w:tc>
+          <w:tcPr>
+            <w:tcW w:w="5514" w:type="dxa"/>
+            <w:shd w:val="clear" w:color="auto" w:fill="FFFFFF" w:themeFill="background1"/>
+          </w:tcPr>
+          <w:p>
+            <w:pPr>
+              <w:jc w:val="both"/>
+              <w:rPr>
+                <w:rFonts w:asciiTheme="minorHAnsi" w:hAnsiTheme="minorHAnsi" w:cstheme="minorHAnsi"/>
+                <w:b/>
+                <w:sz w:val="20"/>
+                <w:szCs w:val="20"/>
+              </w:rPr>
+            </w:pPr>
+            <w:r>
+              <w:rPr>
+                <w:rFonts w:asciiTheme="minorHAnsi" w:hAnsiTheme="minorHAnsi" w:cstheme="minorHAnsi"/>
+                <w:b/>
+                <w:sz w:val="20"/>
+                <w:szCs w:val="20"/>
+              </w:rPr>
+              <w:t>SABBIATURA:</w:t>
+            </w:r>
+          </w:p>
+        </w:tc>
+        <w:tc>
+          <w:tcPr>
+            <w:tcW w:w="3547" w:type="dxa"/>
+            <w:shd w:val="clear" w:color="auto" w:fill="FFFFFF" w:themeFill="background1"/>
+          </w:tcPr>
+          <w:p>
+            <w:pPr>
+              <w:rPr>
+                <w:rFonts w:asciiTheme="minorHAnsi" w:hAnsiTheme="minorHAnsi" w:cstheme="minorHAnsi"/>
+                <w:bCs/>
+                <w:sz w:val="20"/>
+                <w:szCs w:val="20"/>
+                <w:lang w:val="en-GB"/>
+              </w:rPr>
+            </w:pPr>
+          </w:p>
+        </w:tc>
+        <w:tc>
+          <w:tcPr>
+            <w:tcW w:w="1422" w:type="dxa"/>
+            <w:shd w:val="clear" w:color="auto" w:fill="FFFFFF" w:themeFill="background1"/>
+          </w:tcPr>
+          <w:p>
+            <w:pPr>
+              <w:tabs>
+                <w:tab w:val="left" w:pos="428"/>
+              </w:tabs>
+              <w:rPr>
+                <w:rFonts w:asciiTheme="minorHAnsi" w:hAnsiTheme="minorHAnsi" w:cstheme="minorHAnsi"/>
+                <w:bCs/>
+                <w:sz w:val="20"/>
+                <w:szCs w:val="20"/>
+                <w:lang w:val="en-GB"/>
+              </w:rPr>
+            </w:pPr>
+          </w:p>
+        </w:tc>
+      </w:tr>
+      <w:tr>
+        <w:trPr>
+          <w:trHeight w:val="567"/>
+        </w:trPr>
+        <w:tc>
+          <w:tcPr>
+            <w:tcW w:w="574" w:type="dxa"/>
+            <w:shd w:val="clear" w:color="auto" w:fill="FFFFFF" w:themeFill="background1"/>
+            <w:vAlign w:val="center"/>
+          </w:tcPr>
+          <w:p>
+            <w:pPr>
+              <w:tabs>
+                <w:tab w:val="left" w:pos="428"/>
+              </w:tabs>
+              <w:spacing w:before="120" w:after="120"/>
+              <w:jc w:val="center"/>
+              <w:rPr>
+                <w:rFonts w:asciiTheme="minorHAnsi" w:hAnsiTheme="minorHAnsi" w:cstheme="minorHAnsi"/>
+                <w:bCs/>
+                <w:sz w:val="20"/>
+                <w:szCs w:val="20"/>
+              </w:rPr>
+            </w:pPr>
+            <w:r>
+              <w:rPr>
+                <w:rFonts w:asciiTheme="minorHAnsi" w:hAnsiTheme="minorHAnsi" w:cstheme="minorHAnsi"/>
+                <w:bCs/>
+                <w:sz w:val="20"/>
+                <w:szCs w:val="20"/>
+              </w:rPr>
+              <w:t>4.3</w:t>
+            </w:r>
+          </w:p>
+        </w:tc>
+        <w:tc>
+          <w:tcPr>
+            <w:tcW w:w="5514" w:type="dxa"/>
+            <w:shd w:val="clear" w:color="auto" w:fill="FFFFFF" w:themeFill="background1"/>
+          </w:tcPr>
+          <w:p>
+            <w:pPr>
+              <w:jc w:val="both"/>
+              <w:rPr>
+                <w:rFonts w:asciiTheme="minorHAnsi" w:hAnsiTheme="minorHAnsi" w:cstheme="minorHAnsi"/>
+                <w:b/>
+                <w:sz w:val="20"/>
+                <w:szCs w:val="20"/>
+              </w:rPr>
+            </w:pPr>
+            <w:r>
+              <w:rPr>
+                <w:rFonts w:asciiTheme="minorHAnsi" w:hAnsiTheme="minorHAnsi" w:cstheme="minorHAnsi"/>
+                <w:b/>
+                <w:sz w:val="20"/>
+                <w:szCs w:val="20"/>
+              </w:rPr>
+              <w:t>VERNICIATURA:</w:t>
+            </w:r>
+          </w:p>
+        </w:tc>
+        <w:tc>
+          <w:tcPr>
+            <w:tcW w:w="3547" w:type="dxa"/>
+            <w:shd w:val="clear" w:color="auto" w:fill="FFFFFF" w:themeFill="background1"/>
+          </w:tcPr>
+          <w:p>
+            <w:pPr>
+              <w:rPr>
+                <w:rFonts w:asciiTheme="minorHAnsi" w:hAnsiTheme="minorHAnsi" w:cstheme="minorHAnsi"/>
+                <w:bCs/>
+                <w:sz w:val="20"/>
+                <w:szCs w:val="20"/>
+              </w:rPr>
+            </w:pPr>
+          </w:p>
+        </w:tc>
+        <w:tc>
+          <w:tcPr>
+            <w:tcW w:w="1422" w:type="dxa"/>
+            <w:shd w:val="clear" w:color="auto" w:fill="FFFFFF" w:themeFill="background1"/>
+          </w:tcPr>
+          <w:p>
+            <w:pPr>
+              <w:tabs>
+                <w:tab w:val="left" w:pos="428"/>
+              </w:tabs>
+              <w:rPr>
+                <w:rFonts w:asciiTheme="minorHAnsi" w:hAnsiTheme="minorHAnsi" w:cstheme="minorHAnsi"/>
+                <w:bCs/>
+                <w:sz w:val="20"/>
+                <w:szCs w:val="20"/>
+              </w:rPr>
+            </w:pPr>
+          </w:p>
+        </w:tc>
+      </w:tr>
+      <w:tr>
+        <w:trPr>
+          <w:trHeight w:val="60"/>
+        </w:trPr>
+        <w:tc>
+          <w:tcPr>
+            <w:tcW w:w="574" w:type="dxa"/>
+            <w:shd w:val="clear" w:color="auto" w:fill="FFFFFF" w:themeFill="background1"/>
+            <w:vAlign w:val="center"/>
+          </w:tcPr>
+          <w:p>
+            <w:pPr>
+              <w:tabs>
+                <w:tab w:val="left" w:pos="428"/>
+              </w:tabs>
+              <w:spacing w:before="120" w:after="120"/>
+              <w:jc w:val="center"/>
+              <w:rPr>
+                <w:rFonts w:asciiTheme="minorHAnsi" w:hAnsiTheme="minorHAnsi" w:cstheme="minorHAnsi"/>
+                <w:bCs/>
+                <w:sz w:val="20"/>
+                <w:szCs w:val="20"/>
+              </w:rPr>
+            </w:pPr>
+            <w:r>
+              <w:rPr>
+                <w:rFonts w:asciiTheme="minorHAnsi" w:hAnsiTheme="minorHAnsi" w:cstheme="minorHAnsi"/>
+                <w:bCs/>
+                <w:sz w:val="20"/>
+                <w:szCs w:val="20"/>
+              </w:rPr>
+              <w:t>4.4</w:t>
+            </w:r>
+          </w:p>
+        </w:tc>
+        <w:tc>
+          <w:tcPr>
+            <w:tcW w:w="5514" w:type="dxa"/>
+            <w:shd w:val="clear" w:color="auto" w:fill="FFFFFF" w:themeFill="background1"/>
+          </w:tcPr>
+          <w:p>
+            <w:pPr>
+              <w:jc w:val="both"/>
+              <w:rPr>
+                <w:rFonts w:asciiTheme="minorHAnsi" w:hAnsiTheme="minorHAnsi" w:cstheme="minorHAnsi"/>
+                <w:b/>
+                <w:sz w:val="20"/>
+                <w:szCs w:val="20"/>
+              </w:rPr>
+            </w:pPr>
+            <w:r>
+              <w:rPr>
+                <w:rFonts w:asciiTheme="minorHAnsi" w:hAnsiTheme="minorHAnsi" w:cstheme="minorHAnsi"/>
+                <w:b/>
+                <w:sz w:val="20"/>
+                <w:szCs w:val="20"/>
+              </w:rPr>
+              <w:t>CONTROLLO DIMENSIONALE:</w:t>
+            </w:r>
+          </w:p>
+        </w:tc>
+        <w:tc>
+          <w:tcPr>
+            <w:tcW w:w="3547" w:type="dxa"/>
+            <w:shd w:val="clear" w:color="auto" w:fill="FFFFFF" w:themeFill="background1"/>
+          </w:tcPr>
+          <w:p>
+            <w:pPr>
+              <w:rPr>
+                <w:rFonts w:asciiTheme="minorHAnsi" w:hAnsiTheme="minorHAnsi" w:cstheme="minorHAnsi"/>
+                <w:sz w:val="20"/>
+                <w:szCs w:val="20"/>
+              </w:rPr>
+            </w:pPr>
+          </w:p>
+        </w:tc>
+        <w:tc>
+          <w:tcPr>
+            <w:tcW w:w="1422" w:type="dxa"/>
+            <w:shd w:val="clear" w:color="auto" w:fill="FFFFFF" w:themeFill="background1"/>
+          </w:tcPr>
+          <w:p>
+            <w:pPr>
+              <w:tabs>
+                <w:tab w:val="left" w:pos="428"/>
+              </w:tabs>
+              <w:rPr>
+                <w:rFonts w:asciiTheme="minorHAnsi" w:hAnsiTheme="minorHAnsi" w:cstheme="minorHAnsi"/>
+                <w:bCs/>
+                <w:sz w:val="20"/>
+                <w:szCs w:val="20"/>
+              </w:rPr>
+            </w:pPr>
+          </w:p>
+        </w:tc>
+      </w:tr>
+      <w:tr>
+        <w:trPr>
+          <w:trHeight w:val="567"/>
+        </w:trPr>
+        <w:tc>
+          <w:tcPr>
+            <w:tcW w:w="574" w:type="dxa"/>
+            <w:shd w:val="clear" w:color="auto" w:fill="FFFFFF" w:themeFill="background1"/>
+            <w:vAlign w:val="center"/>
+          </w:tcPr>
+          <w:p>
+            <w:pPr>
+              <w:tabs>
+                <w:tab w:val="left" w:pos="428"/>
+              </w:tabs>
+              <w:spacing w:before="120" w:after="120"/>
+              <w:jc w:val="center"/>
+              <w:rPr>
+                <w:rFonts w:asciiTheme="minorHAnsi" w:hAnsiTheme="minorHAnsi" w:cstheme="minorHAnsi"/>
+                <w:bCs/>
+                <w:sz w:val="20"/>
+                <w:szCs w:val="20"/>
+              </w:rPr>
+            </w:pPr>
+            <w:r>
+              <w:rPr>
+                <w:rFonts w:asciiTheme="minorHAnsi" w:hAnsiTheme="minorHAnsi" w:cstheme="minorHAnsi"/>
+                <w:bCs/>
+                <w:sz w:val="20"/>
+                <w:szCs w:val="20"/>
+              </w:rPr>
+              <w:t>4.5</w:t>
+            </w:r>
+          </w:p>
+        </w:tc>
+        <w:tc>
+          <w:tcPr>
+            <w:tcW w:w="5514" w:type="dxa"/>
+            <w:shd w:val="clear" w:color="auto" w:fill="FFFFFF" w:themeFill="background1"/>
+          </w:tcPr>
+          <w:p>
+            <w:pPr>
+              <w:pStyle w:val="Default"/>
+              <w:rPr>
+                <w:rFonts w:asciiTheme="minorHAnsi" w:hAnsiTheme="minorHAnsi" w:cstheme="minorHAnsi"/>
+                <w:b/>
+                <w:color w:val="auto"/>
+                <w:sz w:val="20"/>
+                <w:szCs w:val="20"/>
+              </w:rPr>
+            </w:pPr>
+            <w:r>
+              <w:rPr>
+                <w:rFonts w:asciiTheme="minorHAnsi" w:hAnsiTheme="minorHAnsi" w:cstheme="minorHAnsi"/>
+                <w:b/>
+                <w:color w:val="auto"/>
+                <w:sz w:val="20"/>
+                <w:szCs w:val="20"/>
+              </w:rPr>
+              <w:t>MARCATURA:</w:t>
+            </w:r>
+          </w:p>
+        </w:tc>
+        <w:tc>
+          <w:tcPr>
+            <w:tcW w:w="3547" w:type="dxa"/>
+            <w:shd w:val="clear" w:color="auto" w:fill="FFFFFF" w:themeFill="background1"/>
+          </w:tcPr>
+          <w:p>
+            <w:pPr>
+              <w:rPr>
+                <w:rFonts w:asciiTheme="minorHAnsi" w:hAnsiTheme="minorHAnsi" w:cstheme="minorHAnsi"/>
+                <w:sz w:val="20"/>
+                <w:szCs w:val="20"/>
+              </w:rPr>
+            </w:pPr>
+          </w:p>
+        </w:tc>
+        <w:tc>
+          <w:tcPr>
+            <w:tcW w:w="1422" w:type="dxa"/>
+            <w:shd w:val="clear" w:color="auto" w:fill="FFFFFF" w:themeFill="background1"/>
+          </w:tcPr>
+          <w:p>
+            <w:pPr>
+              <w:tabs>
+                <w:tab w:val="left" w:pos="428"/>
+              </w:tabs>
+              <w:rPr>
+                <w:rFonts w:asciiTheme="minorHAnsi" w:hAnsiTheme="minorHAnsi" w:cstheme="minorHAnsi"/>
+                <w:bCs/>
+                <w:sz w:val="20"/>
+                <w:szCs w:val="20"/>
+              </w:rPr>
+            </w:pPr>
+          </w:p>
+        </w:tc>
+      </w:tr>
+      <w:tr>
+        <w:trPr>
+          <w:trHeight w:val="567"/>
+        </w:trPr>
+        <w:tc>
+          <w:tcPr>
+            <w:tcW w:w="574" w:type="dxa"/>
+            <w:shd w:val="clear" w:color="auto" w:fill="FFFFFF" w:themeFill="background1"/>
+            <w:vAlign w:val="center"/>
+          </w:tcPr>
+          <w:p>
+            <w:pPr>
+              <w:tabs>
+                <w:tab w:val="left" w:pos="428"/>
+              </w:tabs>
+              <w:spacing w:before="120" w:after="120"/>
+              <w:jc w:val="center"/>
+              <w:rPr>
+                <w:rFonts w:asciiTheme="minorHAnsi" w:hAnsiTheme="minorHAnsi" w:cstheme="minorHAnsi"/>
+                <w:bCs/>
+                <w:sz w:val="20"/>
+                <w:szCs w:val="20"/>
+              </w:rPr>
+            </w:pPr>
+            <w:r>
+              <w:rPr>
+                <w:rFonts w:asciiTheme="minorHAnsi" w:hAnsiTheme="minorHAnsi" w:cstheme="minorHAnsi"/>
+                <w:bCs/>
+                <w:sz w:val="20"/>
+                <w:szCs w:val="20"/>
+              </w:rPr>
+              <w:t>4.6</w:t>
+            </w:r>
+          </w:p>
+        </w:tc>
+        <w:tc>
+          <w:tcPr>
+            <w:tcW w:w="5514" w:type="dxa"/>
+            <w:shd w:val="clear" w:color="auto" w:fill="FFFFFF" w:themeFill="background1"/>
+          </w:tcPr>
+          <w:p>
+            <w:pPr>
+              <w:rPr>
+                <w:rFonts w:asciiTheme="minorHAnsi" w:hAnsiTheme="minorHAnsi" w:cstheme="minorHAnsi"/>
+                <w:b/>
+                <w:sz w:val="20"/>
+                <w:szCs w:val="20"/>
+              </w:rPr>
+            </w:pPr>
+            <w:r>
+              <w:rPr>
+                <w:rFonts w:asciiTheme="minorHAnsi" w:hAnsiTheme="minorHAnsi" w:cstheme="minorHAnsi"/>
+                <w:b/>
+                <w:sz w:val="20"/>
+                <w:szCs w:val="20"/>
+              </w:rPr>
+              <w:t>MATERIALE D’APPORTO:</w:t>
+            </w:r>
+          </w:p>
+        </w:tc>
+        <w:tc>
+          <w:tcPr>
+            <w:tcW w:w="3547" w:type="dxa"/>
+            <w:shd w:val="clear" w:color="auto" w:fill="FFFFFF" w:themeFill="background1"/>
+          </w:tcPr>
+          <w:p>
+            <w:pPr>
+              <w:rPr>
+                <w:rFonts w:asciiTheme="minorHAnsi" w:hAnsiTheme="minorHAnsi" w:cstheme="minorHAnsi"/>
+                <w:bCs/>
+                <w:sz w:val="20"/>
+                <w:szCs w:val="20"/>
+              </w:rPr>
+            </w:pPr>
+          </w:p>
+        </w:tc>
+        <w:tc>
+          <w:tcPr>
+            <w:tcW w:w="1422" w:type="dxa"/>
+            <w:shd w:val="clear" w:color="auto" w:fill="FFFFFF" w:themeFill="background1"/>
+          </w:tcPr>
+          <w:p>
+            <w:pPr>
+              <w:tabs>
+                <w:tab w:val="left" w:pos="428"/>
+              </w:tabs>
+              <w:rPr>
+                <w:rFonts w:asciiTheme="minorHAnsi" w:hAnsiTheme="minorHAnsi" w:cstheme="minorHAnsi"/>
+                <w:bCs/>
+                <w:sz w:val="20"/>
+                <w:szCs w:val="20"/>
+              </w:rPr>
+            </w:pPr>
+          </w:p>
+        </w:tc>
+      </w:tr>
+      <w:tr>
+        <w:trPr>
+          <w:trHeight w:val="567"/>
+        </w:trPr>
+        <w:tc>
+          <w:tcPr>
+            <w:tcW w:w="574" w:type="dxa"/>
+            <w:tcBorders>
+              <w:bottom w:val="single" w:sz="4" w:space="0" w:color="auto"/>
+            </w:tcBorders>
+            <w:shd w:val="clear" w:color="auto" w:fill="D9D9D9" w:themeFill="background1" w:themeFillShade="D9"/>
+            <w:vAlign w:val="center"/>
+          </w:tcPr>
+          <w:p>
+            <w:pPr>
+              <w:tabs>
+                <w:tab w:val="left" w:pos="428"/>
+              </w:tabs>
+              <w:jc w:val="center"/>
+              <w:rPr>
+                <w:rFonts w:asciiTheme="minorHAnsi" w:hAnsiTheme="minorHAnsi" w:cstheme="minorHAnsi"/>
+                <w:b/>
+                <w:bCs/>
+                <w:sz w:val="20"/>
+                <w:szCs w:val="20"/>
+              </w:rPr>
+            </w:pPr>
+            <w:r>
+              <w:rPr>
+                <w:rFonts w:asciiTheme="minorHAnsi" w:hAnsiTheme="minorHAnsi" w:cstheme="minorHAnsi"/>
+                <w:b/>
+                <w:bCs/>
+                <w:sz w:val="20"/>
+                <w:szCs w:val="20"/>
+              </w:rPr>
+              <w:t>5</w:t>
+            </w:r>
+            <w:r>
+              <w:rPr>
+                <w:rFonts w:asciiTheme="minorHAnsi" w:hAnsiTheme="minorHAnsi" w:cstheme="minorHAnsi"/>
+                <w:b/>
+                <w:bCs/>
+                <w:sz w:val="20"/>
+                <w:szCs w:val="20"/>
+              </w:rPr>
+              <w:t>.0</w:t>
+            </w:r>
+          </w:p>
+        </w:tc>
+        <w:tc>
+          <w:tcPr>
+            <w:tcW w:w="10483" w:type="dxa"/>
+            <w:gridSpan w:val="3"/>
+            <w:tcBorders>
+              <w:bottom w:val="single" w:sz="4" w:space="0" w:color="auto"/>
+            </w:tcBorders>
+            <w:shd w:val="clear" w:color="auto" w:fill="D9D9D9" w:themeFill="background1" w:themeFillShade="D9"/>
+            <w:vAlign w:val="center"/>
+          </w:tcPr>
+          <w:p>
+            <w:pPr>
+              <w:jc w:val="both"/>
+              <w:rPr>
+                <w:rFonts w:asciiTheme="minorHAnsi" w:hAnsiTheme="minorHAnsi" w:cstheme="minorBidi"/>
+                <w:b/>
+                <w:sz w:val="20"/>
+                <w:szCs w:val="20"/>
+              </w:rPr>
+            </w:pPr>
+            <w:r>
+              <w:rPr>
+                <w:rFonts w:asciiTheme="minorHAnsi" w:hAnsiTheme="minorHAnsi" w:cstheme="minorBidi"/>
+                <w:b/>
+                <w:bCs/>
+                <w:sz w:val="20"/>
+                <w:szCs w:val="20"/>
+              </w:rPr>
+              <w:t>STOCCAGGIO ELEMENTI STRUTTURALI PRONTI PER LA SPEDIZIONE</w:t>
+            </w:r>
+          </w:p>
+        </w:tc>
+      </w:tr>
+      <w:tr>
+        <w:trPr>
+          <w:trHeight w:val="567"/>
+        </w:trPr>
+        <w:tc>
+          <w:tcPr>
+            <w:tcW w:w="574" w:type="dxa"/>
+            <w:shd w:val="clear" w:color="auto" w:fill="FFFFFF" w:themeFill="background1"/>
+            <w:vAlign w:val="center"/>
+          </w:tcPr>
+          <w:p>
+            <w:pPr>
+              <w:tabs>
+                <w:tab w:val="left" w:pos="428"/>
+              </w:tabs>
+              <w:spacing w:before="120" w:after="120"/>
+              <w:jc w:val="center"/>
+              <w:rPr>
+                <w:rFonts w:asciiTheme="minorHAnsi" w:hAnsiTheme="minorHAnsi" w:cstheme="minorHAnsi"/>
+                <w:bCs/>
+                <w:sz w:val="20"/>
+                <w:szCs w:val="20"/>
+              </w:rPr>
+            </w:pPr>
+            <w:r>
+              <w:rPr>
+                <w:rFonts w:asciiTheme="minorHAnsi" w:hAnsiTheme="minorHAnsi" w:cstheme="minorHAnsi"/>
+                <w:sz w:val="20"/>
+                <w:szCs w:val="20"/>
+              </w:rPr>
+              <w:t>5</w:t>
+            </w:r>
+            <w:r>
+              <w:rPr>
+                <w:rFonts w:asciiTheme="minorHAnsi" w:hAnsiTheme="minorHAnsi" w:cstheme="minorHAnsi"/>
+                <w:sz w:val="20"/>
+                <w:szCs w:val="20"/>
+              </w:rPr>
+              <w:t>.1</w:t>
+            </w:r>
+          </w:p>
+        </w:tc>
+        <w:tc>
+          <w:tcPr>
+            <w:tcW w:w="5514" w:type="dxa"/>
+            <w:shd w:val="clear" w:color="auto" w:fill="FFFFFF" w:themeFill="background1"/>
+          </w:tcPr>
+          <w:p>
+            <w:pPr>
+              <w:rPr>
+                <w:rFonts w:asciiTheme="minorHAnsi" w:hAnsiTheme="minorHAnsi" w:cstheme="minorHAnsi"/>
+                <w:b/>
+                <w:sz w:val="20"/>
+                <w:szCs w:val="20"/>
+              </w:rPr>
+            </w:pPr>
+          </w:p>
+        </w:tc>
+        <w:tc>
+          <w:tcPr>
+            <w:tcW w:w="3547" w:type="dxa"/>
+            <w:shd w:val="clear" w:color="auto" w:fill="FFFFFF" w:themeFill="background1"/>
+          </w:tcPr>
+          <w:p>
+            <w:pPr>
+              <w:tabs>
+                <w:tab w:val="left" w:pos="428"/>
+              </w:tabs>
+              <w:jc w:val="both"/>
+              <w:rPr>
+                <w:rFonts w:asciiTheme="minorHAnsi" w:hAnsiTheme="minorHAnsi" w:cstheme="minorHAnsi"/>
+                <w:b/>
+                <w:color w:val="FF0000"/>
+                <w:sz w:val="20"/>
+                <w:szCs w:val="20"/>
+              </w:rPr>
+            </w:pPr>
+          </w:p>
+        </w:tc>
+        <w:tc>
+          <w:tcPr>
+            <w:tcW w:w="1422" w:type="dxa"/>
+            <w:shd w:val="clear" w:color="auto" w:fill="FFFFFF" w:themeFill="background1"/>
+          </w:tcPr>
+          <w:p>
+            <w:pPr>
+              <w:tabs>
+                <w:tab w:val="left" w:pos="428"/>
+              </w:tabs>
+              <w:jc w:val="both"/>
+              <w:rPr>
+                <w:rFonts w:asciiTheme="minorHAnsi" w:hAnsiTheme="minorHAnsi" w:cstheme="minorBidi"/>
+                <w:b/>
+                <w:color w:val="FF0000"/>
+                <w:sz w:val="20"/>
+                <w:szCs w:val="20"/>
+              </w:rPr>
+            </w:pPr>
+          </w:p>
+        </w:tc>
+      </w:tr>
+      <w:bookmarkEnd w:id="1"/>
+    </w:tbl>
+    <w:p>
+      <w:pPr>
+        <w:tabs>
+          <w:tab w:val="left" w:pos="7440"/>
+        </w:tabs>
+        <w:rPr>
+          <w:rFonts w:asciiTheme="minorHAnsi" w:hAnsiTheme="minorHAnsi" w:cstheme="minorHAnsi"/>
+          <w:sz w:val="20"/>
+          <w:szCs w:val="20"/>
+        </w:rPr>
+      </w:pPr>
+    </w:p>
+    <w:sectPr>
+      <w:headerReference w:type="even" r:id="rId11"/>
+      <w:headerReference w:type="default" r:id="rId12"/>
+      <w:footerReference w:type="even" r:id="rId13"/>
+      <w:footerReference w:type="default" r:id="rId14"/>
+      <w:headerReference w:type="first" r:id="rId15"/>
+      <w:footerReference w:type="first" r:id="rId16"/>
+      <w:pgSz w:w="11906" w:h="16838" w:code="9"/>
+      <w:pgMar w:top="284" w:right="284" w:bottom="567" w:left="1134" w:header="567" w:footer="113" w:gutter="0"/>
+      <w:cols w:space="708"/>
+      <w:docGrid w:linePitch="360"/>
+    </w:sectPr>
+  </w:body>
+</w:document>
 </file>
 
 <file path=word/endnotes.xml><?xml version="1.0" encoding="utf-8"?>

</xml_diff>

<commit_message>
fix(word): azzera tblInd negativo (tabelle allineate ai margini) + script Verbale
Made-with: Cursor
</commit_message>
<xml_diff>
--- a/app/public/templates/Verbale_di_riunione_QTAFI_VIS001.docx
+++ b/app/public/templates/Verbale_di_riunione_QTAFI_VIS001.docx
@@ -5,7 +5,7 @@
     <w:tbl>
       <w:tblPr>
         <w:tblW w:w="5000" w:type="pct"/>
-        <w:tblInd w:w="-714" w:type="dxa"/>
+        <w:tblInd w:w="0" w:type="dxa"/>
         <w:tblBorders>
           <w:top w:val="single" w:sz="4" w:space="0" w:color="auto"/>
           <w:left w:val="single" w:sz="4" w:space="0" w:color="auto"/>
@@ -1198,7 +1198,7 @@
   <w:tbl>
     <w:tblPr>
       <w:tblW w:w="5000" w:type="pct"/>
-      <w:tblInd w:w="-714" w:type="dxa"/>
+      <w:tblInd w:w="0" w:type="dxa"/>
       <w:tblBorders>
         <w:top w:val="single" w:sz="4" w:space="0" w:color="auto"/>
         <w:left w:val="single" w:sz="4" w:space="0" w:color="auto"/>

</xml_diff>